<commit_message>
working on part c
</commit_message>
<xml_diff>
--- a/205744873_213474349_hw5_report.docx
+++ b/205744873_213474349_hw5_report.docx
@@ -540,6 +540,7 @@
         </w:rPr>
         <w:t xml:space="preserve"> </w:t>
       </w:r>
+      <w:proofErr w:type="spellStart"/>
       <w:r>
         <w:rPr>
           <w:rFonts w:ascii="Times New Roman" w:hAnsi="Times New Roman" w:cs="Times New Roman"/>
@@ -549,6 +550,7 @@
         </w:rPr>
         <w:t>TrainingArgument</w:t>
       </w:r>
+      <w:proofErr w:type="spellEnd"/>
       <w:r>
         <w:rPr>
           <w:rFonts w:ascii="Times New Roman" w:hAnsi="Times New Roman" w:cs="Times New Roman" w:hint="cs"/>
@@ -1073,6 +1075,7 @@
         </w:rPr>
       </w:pPr>
       <w:hyperlink r:id="rId7" w:history="1">
+        <w:proofErr w:type="spellStart"/>
         <w:r>
           <w:rPr>
             <w:rStyle w:val="Hyperlink"/>
@@ -1081,8 +1084,9 @@
             <w:bCs/>
             <w:lang w:bidi="he-IL"/>
           </w:rPr>
-          <w:t>Data</w:t>
+          <w:t>DataScience</w:t>
         </w:r>
+        <w:proofErr w:type="spellEnd"/>
         <w:r>
           <w:rPr>
             <w:rStyle w:val="Hyperlink"/>
@@ -1091,17 +1095,7 @@
             <w:bCs/>
             <w:lang w:bidi="he-IL"/>
           </w:rPr>
-          <w:t>S</w:t>
-        </w:r>
-        <w:r>
-          <w:rPr>
-            <w:rStyle w:val="Hyperlink"/>
-            <w:rFonts w:asciiTheme="majorBidi" w:eastAsiaTheme="minorEastAsia" w:hAnsiTheme="majorBidi" w:cstheme="majorBidi"/>
-            <w:b/>
-            <w:bCs/>
-            <w:lang w:bidi="he-IL"/>
-          </w:rPr>
-          <w:t>cience-Link</w:t>
+          <w:t>-Link</w:t>
         </w:r>
       </w:hyperlink>
     </w:p>
@@ -1533,7 +1527,7 @@
         <w:bidi/>
         <w:ind w:left="1440"/>
         <w:rPr>
-          <w:rFonts w:ascii="Times New Roman" w:eastAsiaTheme="minorEastAsia" w:hAnsi="Times New Roman" w:cs="Times New Roman" w:hint="cs"/>
+          <w:rFonts w:ascii="Times New Roman" w:eastAsiaTheme="minorEastAsia" w:hAnsi="Times New Roman" w:cs="Times New Roman"/>
           <w:sz w:val="32"/>
           <w:szCs w:val="32"/>
           <w:rtl/>
@@ -1618,13 +1612,23 @@
         <w:t xml:space="preserve"> </w:t>
       </w:r>
       <w:hyperlink r:id="rId8" w:history="1">
+        <w:proofErr w:type="spellStart"/>
         <w:r>
           <w:rPr>
             <w:rStyle w:val="Hyperlink"/>
             <w:rFonts w:ascii="Times New Roman" w:eastAsiaTheme="minorEastAsia" w:hAnsi="Times New Roman" w:cs="Times New Roman"/>
             <w:lang w:bidi="he-IL"/>
           </w:rPr>
-          <w:t>DataScience-Link</w:t>
+          <w:t>DataScience</w:t>
+        </w:r>
+        <w:proofErr w:type="spellEnd"/>
+        <w:r>
+          <w:rPr>
+            <w:rStyle w:val="Hyperlink"/>
+            <w:rFonts w:ascii="Times New Roman" w:eastAsiaTheme="minorEastAsia" w:hAnsi="Times New Roman" w:cs="Times New Roman"/>
+            <w:lang w:bidi="he-IL"/>
+          </w:rPr>
+          <w:t>-Link</w:t>
         </w:r>
       </w:hyperlink>
       <w:r>
@@ -1751,55 +1755,7 @@
                     <w:szCs w:val="32"/>
                     <w:lang w:bidi="he-IL"/>
                   </w:rPr>
-                  <m:t>trai</m:t>
-                </m:r>
-                <m:r>
-                  <m:rPr>
-                    <m:sty m:val="bi"/>
-                  </m:rPr>
-                  <w:rPr>
-                    <w:rFonts w:ascii="Cambria Math" w:hAnsi="Cambria Math" w:cs="Times New Roman"/>
-                    <w:sz w:val="32"/>
-                    <w:szCs w:val="32"/>
-                    <w:lang w:bidi="he-IL"/>
-                  </w:rPr>
-                  <m:t>n-</m:t>
-                </m:r>
-                <m:r>
-                  <m:rPr>
-                    <m:sty m:val="bi"/>
-                  </m:rPr>
-                  <w:rPr>
-                    <w:rFonts w:ascii="Cambria Math" w:hAnsi="Cambria Math" w:cs="Times New Roman"/>
-                    <w:sz w:val="32"/>
-                    <w:szCs w:val="32"/>
-                    <w:lang w:bidi="he-IL"/>
-                  </w:rPr>
-                  <m:t>batc</m:t>
-                </m:r>
-                <m:r>
-                  <m:rPr>
-                    <m:sty m:val="bi"/>
-                  </m:rPr>
-                  <w:rPr>
-                    <w:rFonts w:ascii="Cambria Math" w:hAnsi="Cambria Math" w:cs="Times New Roman"/>
-                    <w:sz w:val="32"/>
-                    <w:szCs w:val="32"/>
-                    <w:lang w:bidi="he-IL"/>
-                  </w:rPr>
-                  <m:t>h-</m:t>
-                </m:r>
-                <m:r>
-                  <m:rPr>
-                    <m:sty m:val="bi"/>
-                  </m:rPr>
-                  <w:rPr>
-                    <w:rFonts w:ascii="Cambria Math" w:hAnsi="Cambria Math" w:cs="Times New Roman"/>
-                    <w:sz w:val="32"/>
-                    <w:szCs w:val="32"/>
-                    <w:lang w:bidi="he-IL"/>
-                  </w:rPr>
-                  <m:t>size</m:t>
+                  <m:t>train-batch-size</m:t>
                 </m:r>
               </m:sub>
             </m:sSub>
@@ -1815,19 +1771,7 @@
             <w:szCs w:val="32"/>
             <w:lang w:bidi="he-IL"/>
           </w:rPr>
-          <m:t>=</m:t>
-        </m:r>
-        <m:r>
-          <m:rPr>
-            <m:sty m:val="bi"/>
-          </m:rPr>
-          <w:rPr>
-            <w:rFonts w:ascii="Cambria Math" w:hAnsi="Cambria Math" w:cs="Times New Roman"/>
-            <w:sz w:val="32"/>
-            <w:szCs w:val="32"/>
-            <w:lang w:bidi="he-IL"/>
-          </w:rPr>
-          <m:t>8</m:t>
+          <m:t>=8</m:t>
         </m:r>
       </m:oMath>
       <w:r>
@@ -1873,16 +1817,7 @@
           <w:szCs w:val="32"/>
           <w:lang w:bidi="he-IL"/>
         </w:rPr>
-        <w:t xml:space="preserve"> </w:t>
-      </w:r>
-      <w:r>
-        <w:rPr>
-          <w:rFonts w:ascii="Times New Roman" w:hAnsi="Times New Roman" w:cs="Times New Roman"/>
-          <w:sz w:val="32"/>
-          <w:szCs w:val="32"/>
-          <w:lang w:bidi="he-IL"/>
-        </w:rPr>
-        <w:t xml:space="preserve">Batch </w:t>
+        <w:t xml:space="preserve"> Batch </w:t>
       </w:r>
       <w:r>
         <w:rPr>
@@ -2096,18 +2031,40 @@
         </w:rPr>
         <w:t xml:space="preserve">. </w:t>
       </w:r>
-      <w:hyperlink r:id="rId9" w:history="1">
-        <w:r>
-          <w:rPr>
-            <w:rStyle w:val="Hyperlink"/>
-            <w:rFonts w:ascii="Times New Roman" w:hAnsi="Times New Roman" w:cs="Times New Roman"/>
-            <w:sz w:val="32"/>
-            <w:szCs w:val="32"/>
-            <w:lang w:bidi="he-IL"/>
-          </w:rPr>
-          <w:t>DataScience-Link</w:t>
-        </w:r>
-      </w:hyperlink>
+      <w:r>
+        <w:fldChar w:fldCharType="begin"/>
+      </w:r>
+      <w:r>
+        <w:instrText>HYPERLINK "https://datascience.stackexchange.com/questions/64583/what-are-the-good-parameter-ranges-for-bert-hyperparameters-while-finetuning-it%23:~:text=,data%20for%20all%20GLUE%20tasks%20"</w:instrText>
+      </w:r>
+      <w:r>
+        <w:fldChar w:fldCharType="separate"/>
+      </w:r>
+      <w:proofErr w:type="spellStart"/>
+      <w:r>
+        <w:rPr>
+          <w:rStyle w:val="Hyperlink"/>
+          <w:rFonts w:ascii="Times New Roman" w:hAnsi="Times New Roman" w:cs="Times New Roman"/>
+          <w:sz w:val="32"/>
+          <w:szCs w:val="32"/>
+          <w:lang w:bidi="he-IL"/>
+        </w:rPr>
+        <w:t>DataScience</w:t>
+      </w:r>
+      <w:proofErr w:type="spellEnd"/>
+      <w:r>
+        <w:rPr>
+          <w:rStyle w:val="Hyperlink"/>
+          <w:rFonts w:ascii="Times New Roman" w:hAnsi="Times New Roman" w:cs="Times New Roman"/>
+          <w:sz w:val="32"/>
+          <w:szCs w:val="32"/>
+          <w:lang w:bidi="he-IL"/>
+        </w:rPr>
+        <w:t>-Link</w:t>
+      </w:r>
+      <w:r>
+        <w:fldChar w:fldCharType="end"/>
+      </w:r>
       <w:r>
         <w:rPr>
           <w:rFonts w:ascii="Times New Roman" w:hAnsi="Times New Roman" w:cs="Times New Roman"/>
@@ -2445,7 +2402,8 @@
         </w:rPr>
         <w:t xml:space="preserve"> </w:t>
       </w:r>
-      <w:hyperlink r:id="rId10" w:history="1">
+      <w:hyperlink r:id="rId9" w:history="1">
+        <w:proofErr w:type="spellStart"/>
         <w:r>
           <w:rPr>
             <w:rStyle w:val="Hyperlink"/>
@@ -2456,6 +2414,7 @@
           </w:rPr>
           <w:t>huggingface</w:t>
         </w:r>
+        <w:proofErr w:type="spellEnd"/>
       </w:hyperlink>
     </w:p>
     <w:p>
@@ -2530,31 +2489,7 @@
                 <w:szCs w:val="32"/>
                 <w:lang w:bidi="he-IL"/>
               </w:rPr>
-              <m:t>best_model</m:t>
-            </m:r>
-            <m:r>
-              <m:rPr>
-                <m:sty m:val="bi"/>
-              </m:rPr>
-              <w:rPr>
-                <w:rFonts w:ascii="Cambria Math" w:eastAsiaTheme="minorEastAsia" w:hAnsi="Cambria Math" w:cs="Times New Roman"/>
-                <w:sz w:val="32"/>
-                <w:szCs w:val="32"/>
-                <w:lang w:bidi="he-IL"/>
-              </w:rPr>
-              <m:t>_at_end</m:t>
-            </m:r>
-            <m:r>
-              <m:rPr>
-                <m:sty m:val="bi"/>
-              </m:rPr>
-              <w:rPr>
-                <w:rFonts w:ascii="Cambria Math" w:eastAsiaTheme="minorEastAsia" w:hAnsi="Cambria Math" w:cs="Times New Roman"/>
-                <w:sz w:val="32"/>
-                <w:szCs w:val="32"/>
-                <w:lang w:bidi="he-IL"/>
-              </w:rPr>
-              <m:t xml:space="preserve"> </m:t>
+              <m:t xml:space="preserve">best_model_at_end </m:t>
             </m:r>
           </m:sub>
         </m:sSub>
@@ -2599,22 +2534,7 @@
             <w:szCs w:val="32"/>
             <w:lang w:bidi="he-IL"/>
           </w:rPr>
-          <m:t>T</m:t>
-        </m:r>
-        <m:r>
-          <m:rPr>
-            <m:nor/>
-          </m:rPr>
-          <w:rPr>
-            <w:rFonts w:ascii="Cambria Math" w:eastAsiaTheme="minorEastAsia" w:hAnsi="Cambria Math" w:cs="Times New Roman"/>
-            <w:b/>
-            <w:bCs/>
-            <w:iCs/>
-            <w:sz w:val="32"/>
-            <w:szCs w:val="32"/>
-            <w:lang w:bidi="he-IL"/>
-          </w:rPr>
-          <m:t>rue</m:t>
+          <m:t>True</m:t>
         </m:r>
         <m:r>
           <m:rPr>
@@ -2645,37 +2565,7 @@
             <w:szCs w:val="32"/>
             <w:lang w:bidi="he-IL"/>
           </w:rPr>
-          <m:t xml:space="preserve"> </m:t>
-        </m:r>
-        <m:r>
-          <m:rPr>
-            <m:nor/>
-          </m:rPr>
-          <w:rPr>
-            <w:rFonts w:ascii="Cambria Math" w:eastAsiaTheme="minorEastAsia" w:hAnsi="Cambria Math" w:cs="Times New Roman"/>
-            <w:b/>
-            <w:bCs/>
-            <w:iCs/>
-            <w:sz w:val="32"/>
-            <w:szCs w:val="32"/>
-            <w:lang w:bidi="he-IL"/>
-          </w:rPr>
-          <m:t xml:space="preserve"> </m:t>
-        </m:r>
-        <m:r>
-          <m:rPr>
-            <m:nor/>
-          </m:rPr>
-          <w:rPr>
-            <w:rFonts w:ascii="Cambria Math" w:eastAsiaTheme="minorEastAsia" w:hAnsi="Cambria Math" w:cs="Times New Roman"/>
-            <w:b/>
-            <w:bCs/>
-            <w:iCs/>
-            <w:sz w:val="32"/>
-            <w:szCs w:val="32"/>
-            <w:lang w:bidi="he-IL"/>
-          </w:rPr>
-          <m:t xml:space="preserve"> </m:t>
+          <m:t xml:space="preserve">   </m:t>
         </m:r>
         <m:r>
           <m:rPr>
@@ -2703,22 +2593,7 @@
             <w:szCs w:val="32"/>
             <w:lang w:bidi="he-IL"/>
           </w:rPr>
-          <m:t xml:space="preserve"> </m:t>
-        </m:r>
-        <m:r>
-          <m:rPr>
-            <m:nor/>
-          </m:rPr>
-          <w:rPr>
-            <w:rFonts w:ascii="Cambria Math" w:eastAsiaTheme="minorEastAsia" w:hAnsi="Cambria Math" w:cs="Times New Roman"/>
-            <w:b/>
-            <w:bCs/>
-            <w:iCs/>
-            <w:sz w:val="32"/>
-            <w:szCs w:val="32"/>
-            <w:lang w:bidi="he-IL"/>
-          </w:rPr>
-          <m:t xml:space="preserve">  </m:t>
+          <m:t xml:space="preserve">   </m:t>
         </m:r>
         <m:r>
           <m:rPr>
@@ -2817,52 +2692,7 @@
             <w:szCs w:val="32"/>
             <w:lang w:bidi="he-IL"/>
           </w:rPr>
-          <m:t>e</m:t>
-        </m:r>
-        <m:r>
-          <m:rPr>
-            <m:nor/>
-          </m:rPr>
-          <w:rPr>
-            <w:rFonts w:ascii="Cambria Math" w:eastAsiaTheme="minorEastAsia" w:hAnsi="Cambria Math" w:cs="Times New Roman"/>
-            <w:b/>
-            <w:bCs/>
-            <w:iCs/>
-            <w:sz w:val="32"/>
-            <w:szCs w:val="32"/>
-            <w:lang w:bidi="he-IL"/>
-          </w:rPr>
-          <m:t>poc</m:t>
-        </m:r>
-        <m:r>
-          <m:rPr>
-            <m:nor/>
-          </m:rPr>
-          <w:rPr>
-            <w:rFonts w:ascii="Cambria Math" w:eastAsiaTheme="minorEastAsia" w:hAnsi="Cambria Math" w:cs="Times New Roman"/>
-            <w:b/>
-            <w:bCs/>
-            <w:iCs/>
-            <w:sz w:val="32"/>
-            <w:szCs w:val="32"/>
-            <w:lang w:bidi="he-IL"/>
-          </w:rPr>
-          <m:t>h</m:t>
-        </m:r>
-        <m:r>
-          <m:rPr>
-            <m:nor/>
-          </m:rPr>
-          <w:rPr>
-            <w:rFonts w:ascii="Cambria Math" w:eastAsiaTheme="minorEastAsia" w:hAnsi="Cambria Math" w:cs="Times New Roman"/>
-            <w:b/>
-            <w:bCs/>
-            <w:iCs/>
-            <w:sz w:val="32"/>
-            <w:szCs w:val="32"/>
-            <w:lang w:bidi="he-IL"/>
-          </w:rPr>
-          <m:t>"</m:t>
+          <m:t>epoch"</m:t>
         </m:r>
       </m:oMath>
       <w:r>
@@ -2994,37 +2824,7 @@
             <w:szCs w:val="32"/>
             <w:lang w:bidi="he-IL"/>
           </w:rPr>
-          <m:t>e</m:t>
-        </m:r>
-        <m:r>
-          <m:rPr>
-            <m:nor/>
-          </m:rPr>
-          <w:rPr>
-            <w:rFonts w:ascii="Cambria Math" w:eastAsiaTheme="minorEastAsia" w:hAnsi="Cambria Math" w:cs="Times New Roman"/>
-            <w:b/>
-            <w:bCs/>
-            <w:iCs/>
-            <w:sz w:val="32"/>
-            <w:szCs w:val="32"/>
-            <w:lang w:bidi="he-IL"/>
-          </w:rPr>
-          <m:t>poc</m:t>
-        </m:r>
-        <m:r>
-          <m:rPr>
-            <m:nor/>
-          </m:rPr>
-          <w:rPr>
-            <w:rFonts w:ascii="Cambria Math" w:eastAsiaTheme="minorEastAsia" w:hAnsi="Cambria Math" w:cs="Times New Roman"/>
-            <w:b/>
-            <w:bCs/>
-            <w:iCs/>
-            <w:sz w:val="32"/>
-            <w:szCs w:val="32"/>
-            <w:lang w:bidi="he-IL"/>
-          </w:rPr>
-          <m:t>h</m:t>
+          <m:t>epoch</m:t>
         </m:r>
       </m:oMath>
       <w:r>
@@ -3132,19 +2932,7 @@
                 <w:szCs w:val="32"/>
                 <w:lang w:bidi="he-IL"/>
               </w:rPr>
-              <m:t>best_model_at_end</m:t>
-            </m:r>
-            <m:r>
-              <m:rPr>
-                <m:sty m:val="bi"/>
-              </m:rPr>
-              <w:rPr>
-                <w:rFonts w:ascii="Cambria Math" w:eastAsiaTheme="minorEastAsia" w:hAnsi="Cambria Math" w:cs="Times New Roman"/>
-                <w:sz w:val="32"/>
-                <w:szCs w:val="32"/>
-                <w:lang w:bidi="he-IL"/>
-              </w:rPr>
-              <m:t xml:space="preserve"> </m:t>
+              <m:t xml:space="preserve">best_model_at_end </m:t>
             </m:r>
           </m:sub>
         </m:sSub>
@@ -3723,7 +3511,7 @@
                     <pic:cNvPicPr/>
                   </pic:nvPicPr>
                   <pic:blipFill>
-                    <a:blip r:embed="rId11">
+                    <a:blip r:embed="rId10">
                       <a:extLst>
                         <a:ext uri="{28A0092B-C50C-407E-A947-70E740481C1C}">
                           <a14:useLocalDpi xmlns:a14="http://schemas.microsoft.com/office/drawing/2010/main" val="0"/>
@@ -3795,7 +3583,7 @@
                     <pic:cNvPicPr/>
                   </pic:nvPicPr>
                   <pic:blipFill>
-                    <a:blip r:embed="rId12">
+                    <a:blip r:embed="rId11">
                       <a:extLst>
                         <a:ext uri="{28A0092B-C50C-407E-A947-70E740481C1C}">
                           <a14:useLocalDpi xmlns:a14="http://schemas.microsoft.com/office/drawing/2010/main" val="0"/>
@@ -4030,7 +3818,7 @@
                     <pic:cNvPicPr/>
                   </pic:nvPicPr>
                   <pic:blipFill>
-                    <a:blip r:embed="rId13">
+                    <a:blip r:embed="rId12">
                       <a:extLst>
                         <a:ext uri="{28A0092B-C50C-407E-A947-70E740481C1C}">
                           <a14:useLocalDpi xmlns:a14="http://schemas.microsoft.com/office/drawing/2010/main" val="0"/>
@@ -4119,6 +3907,14 @@
           <w:rFonts w:asciiTheme="majorBidi" w:eastAsiaTheme="minorEastAsia" w:hAnsiTheme="majorBidi" w:cstheme="majorBidi"/>
           <w:sz w:val="32"/>
           <w:szCs w:val="32"/>
+        </w:rPr>
+        <w:t xml:space="preserve"> </w:t>
+      </w:r>
+      <w:r>
+        <w:rPr>
+          <w:rFonts w:asciiTheme="majorBidi" w:eastAsiaTheme="minorEastAsia" w:hAnsiTheme="majorBidi" w:cstheme="majorBidi"/>
+          <w:sz w:val="32"/>
+          <w:szCs w:val="32"/>
           <w:lang w:bidi="he-IL"/>
         </w:rPr>
         <w:t xml:space="preserve">Accuracy = 0.89 </w:t>
@@ -4324,62 +4120,149 @@
         <w:bidi/>
         <w:ind w:left="2160"/>
         <w:rPr>
+          <w:rFonts w:asciiTheme="majorBidi" w:eastAsiaTheme="minorEastAsia" w:hAnsiTheme="majorBidi" w:cstheme="majorBidi"/>
+          <w:sz w:val="32"/>
+          <w:szCs w:val="32"/>
+          <w:rtl/>
+          <w:lang w:bidi="he-IL"/>
+        </w:rPr>
+      </w:pPr>
+      <w:r>
+        <w:rPr>
+          <w:rFonts w:asciiTheme="majorBidi" w:eastAsiaTheme="minorEastAsia" w:hAnsiTheme="majorBidi" w:cstheme="majorBidi"/>
+          <w:b/>
+          <w:bCs/>
+          <w:sz w:val="32"/>
+          <w:szCs w:val="32"/>
+          <w:rtl/>
+          <w:lang w:bidi="he-IL"/>
+        </w:rPr>
+        <w:t>התוצאה תאמה את הציפיות</w:t>
+      </w:r>
+      <w:r>
+        <w:rPr>
+          <w:rFonts w:asciiTheme="majorBidi" w:eastAsiaTheme="minorEastAsia" w:hAnsiTheme="majorBidi" w:cstheme="majorBidi"/>
+          <w:b/>
+          <w:bCs/>
+          <w:sz w:val="32"/>
+          <w:szCs w:val="32"/>
+          <w:lang w:bidi="he-IL"/>
+        </w:rPr>
+        <w:t xml:space="preserve">: </w:t>
+      </w:r>
+      <w:r>
+        <w:rPr>
+          <w:rFonts w:asciiTheme="majorBidi" w:eastAsiaTheme="minorEastAsia" w:hAnsiTheme="majorBidi" w:cstheme="majorBidi"/>
+          <w:b/>
+          <w:bCs/>
+          <w:sz w:val="32"/>
+          <w:szCs w:val="32"/>
+          <w:rtl/>
+          <w:lang w:bidi="he-IL"/>
+        </w:rPr>
+        <w:br/>
+      </w:r>
+      <w:r>
+        <w:rPr>
+          <w:rFonts w:asciiTheme="majorBidi" w:eastAsiaTheme="minorEastAsia" w:hAnsiTheme="majorBidi" w:cstheme="majorBidi"/>
+          <w:b/>
+          <w:bCs/>
+          <w:sz w:val="32"/>
+          <w:szCs w:val="32"/>
+          <w:lang w:bidi="he-IL"/>
+        </w:rPr>
+        <w:t>fine-tuning</w:t>
+      </w:r>
+      <w:r>
+        <w:rPr>
+          <w:rFonts w:asciiTheme="majorBidi" w:eastAsiaTheme="minorEastAsia" w:hAnsiTheme="majorBidi" w:cstheme="majorBidi"/>
+          <w:sz w:val="32"/>
+          <w:szCs w:val="32"/>
+          <w:rtl/>
+          <w:lang w:bidi="he-IL"/>
+        </w:rPr>
+        <w:t xml:space="preserve"> </w:t>
+      </w:r>
+      <w:r>
+        <w:rPr>
+          <w:rFonts w:asciiTheme="majorBidi" w:eastAsiaTheme="minorEastAsia" w:hAnsiTheme="majorBidi" w:cstheme="majorBidi"/>
+          <w:sz w:val="32"/>
+          <w:szCs w:val="32"/>
+          <w:rtl/>
+          <w:lang w:bidi="he-IL"/>
+        </w:rPr>
+        <w:t>של מודל</w:t>
+      </w:r>
+      <w:r>
+        <w:rPr>
+          <w:rFonts w:asciiTheme="majorBidi" w:eastAsiaTheme="minorEastAsia" w:hAnsiTheme="majorBidi" w:cstheme="majorBidi"/>
+          <w:sz w:val="32"/>
+          <w:szCs w:val="32"/>
+          <w:lang w:bidi="he-IL"/>
+        </w:rPr>
+        <w:t xml:space="preserve"> BERT </w:t>
+      </w:r>
+      <w:r>
+        <w:rPr>
+          <w:rFonts w:asciiTheme="majorBidi" w:eastAsiaTheme="minorEastAsia" w:hAnsiTheme="majorBidi" w:cstheme="majorBidi"/>
+          <w:sz w:val="32"/>
+          <w:szCs w:val="32"/>
+          <w:rtl/>
+          <w:lang w:bidi="he-IL"/>
+        </w:rPr>
+        <w:t>על</w:t>
+      </w:r>
+      <w:r>
+        <w:rPr>
+          <w:rFonts w:asciiTheme="majorBidi" w:eastAsiaTheme="minorEastAsia" w:hAnsiTheme="majorBidi" w:cstheme="majorBidi"/>
+          <w:sz w:val="32"/>
+          <w:szCs w:val="32"/>
+          <w:lang w:bidi="he-IL"/>
+        </w:rPr>
+        <w:t xml:space="preserve"> subset </w:t>
+      </w:r>
+      <w:r>
+        <w:rPr>
+          <w:rFonts w:asciiTheme="majorBidi" w:eastAsiaTheme="minorEastAsia" w:hAnsiTheme="majorBidi" w:cstheme="majorBidi"/>
+          <w:sz w:val="32"/>
+          <w:szCs w:val="32"/>
+          <w:rtl/>
+          <w:lang w:bidi="he-IL"/>
+        </w:rPr>
+        <w:t>קטן בדרך כלל מביא לדיוק בין 80% ל-90%, כך שהתוצאה של</w:t>
+      </w:r>
+      <w:r>
+        <w:rPr>
           <w:rFonts w:asciiTheme="majorBidi" w:eastAsiaTheme="minorEastAsia" w:hAnsiTheme="majorBidi" w:cstheme="majorBidi" w:hint="cs"/>
           <w:sz w:val="32"/>
           <w:szCs w:val="32"/>
           <w:rtl/>
           <w:lang w:bidi="he-IL"/>
         </w:rPr>
-      </w:pPr>
+        <w:t>י</w:t>
+      </w:r>
       <w:r>
         <w:rPr>
           <w:rFonts w:asciiTheme="majorBidi" w:eastAsiaTheme="minorEastAsia" w:hAnsiTheme="majorBidi" w:cstheme="majorBidi"/>
-          <w:b/>
-          <w:bCs/>
-          <w:sz w:val="32"/>
-          <w:szCs w:val="32"/>
-          <w:rtl/>
-          <w:lang w:bidi="he-IL"/>
-        </w:rPr>
-        <w:t>התוצאה תאמה את הציפיות</w:t>
+          <w:sz w:val="32"/>
+          <w:szCs w:val="32"/>
+          <w:rtl/>
+          <w:lang w:bidi="he-IL"/>
+        </w:rPr>
+        <w:t xml:space="preserve"> נעה בקצה העליון של הטווח הצפוי</w:t>
       </w:r>
       <w:r>
         <w:rPr>
           <w:rFonts w:asciiTheme="majorBidi" w:eastAsiaTheme="minorEastAsia" w:hAnsiTheme="majorBidi" w:cstheme="majorBidi"/>
-          <w:b/>
-          <w:bCs/>
-          <w:sz w:val="32"/>
-          <w:szCs w:val="32"/>
-          <w:lang w:bidi="he-IL"/>
-        </w:rPr>
-        <w:t xml:space="preserve">: </w:t>
-      </w:r>
-      <w:r>
-        <w:rPr>
-          <w:rFonts w:asciiTheme="majorBidi" w:eastAsiaTheme="minorEastAsia" w:hAnsiTheme="majorBidi" w:cstheme="majorBidi"/>
-          <w:b/>
-          <w:bCs/>
-          <w:sz w:val="32"/>
-          <w:szCs w:val="32"/>
-          <w:rtl/>
-          <w:lang w:bidi="he-IL"/>
-        </w:rPr>
-        <w:br/>
-      </w:r>
-      <w:r>
-        <w:rPr>
-          <w:rFonts w:asciiTheme="majorBidi" w:eastAsiaTheme="minorEastAsia" w:hAnsiTheme="majorBidi" w:cstheme="majorBidi"/>
-          <w:b/>
-          <w:bCs/>
-          <w:sz w:val="32"/>
-          <w:szCs w:val="32"/>
-          <w:lang w:bidi="he-IL"/>
-        </w:rPr>
-        <w:t>fine-tuning</w:t>
-      </w:r>
-      <w:r>
-        <w:rPr>
-          <w:rFonts w:asciiTheme="majorBidi" w:eastAsiaTheme="minorEastAsia" w:hAnsiTheme="majorBidi" w:cstheme="majorBidi"/>
+          <w:sz w:val="32"/>
+          <w:szCs w:val="32"/>
+          <w:lang w:bidi="he-IL"/>
+        </w:rPr>
+        <w:t>.</w:t>
+      </w:r>
+      <w:r>
+        <w:rPr>
+          <w:rFonts w:asciiTheme="majorBidi" w:eastAsiaTheme="minorEastAsia" w:hAnsiTheme="majorBidi" w:cstheme="majorBidi" w:hint="cs"/>
           <w:sz w:val="32"/>
           <w:szCs w:val="32"/>
           <w:rtl/>
@@ -4387,94 +4270,8 @@
         </w:rPr>
         <w:t xml:space="preserve"> </w:t>
       </w:r>
-      <w:r>
-        <w:rPr>
-          <w:rFonts w:asciiTheme="majorBidi" w:eastAsiaTheme="minorEastAsia" w:hAnsiTheme="majorBidi" w:cstheme="majorBidi"/>
-          <w:sz w:val="32"/>
-          <w:szCs w:val="32"/>
-          <w:rtl/>
-          <w:lang w:bidi="he-IL"/>
-        </w:rPr>
-        <w:t>של מודל</w:t>
-      </w:r>
-      <w:r>
-        <w:rPr>
-          <w:rFonts w:asciiTheme="majorBidi" w:eastAsiaTheme="minorEastAsia" w:hAnsiTheme="majorBidi" w:cstheme="majorBidi"/>
-          <w:sz w:val="32"/>
-          <w:szCs w:val="32"/>
-          <w:lang w:bidi="he-IL"/>
-        </w:rPr>
-        <w:t xml:space="preserve"> BERT </w:t>
-      </w:r>
-      <w:r>
-        <w:rPr>
-          <w:rFonts w:asciiTheme="majorBidi" w:eastAsiaTheme="minorEastAsia" w:hAnsiTheme="majorBidi" w:cstheme="majorBidi"/>
-          <w:sz w:val="32"/>
-          <w:szCs w:val="32"/>
-          <w:rtl/>
-          <w:lang w:bidi="he-IL"/>
-        </w:rPr>
-        <w:t>על</w:t>
-      </w:r>
-      <w:r>
-        <w:rPr>
-          <w:rFonts w:asciiTheme="majorBidi" w:eastAsiaTheme="minorEastAsia" w:hAnsiTheme="majorBidi" w:cstheme="majorBidi"/>
-          <w:sz w:val="32"/>
-          <w:szCs w:val="32"/>
-          <w:lang w:bidi="he-IL"/>
-        </w:rPr>
-        <w:t xml:space="preserve"> subset </w:t>
-      </w:r>
-      <w:r>
-        <w:rPr>
-          <w:rFonts w:asciiTheme="majorBidi" w:eastAsiaTheme="minorEastAsia" w:hAnsiTheme="majorBidi" w:cstheme="majorBidi"/>
-          <w:sz w:val="32"/>
-          <w:szCs w:val="32"/>
-          <w:rtl/>
-          <w:lang w:bidi="he-IL"/>
-        </w:rPr>
-        <w:t>קטן בדרך כלל מביא לדיוק בין 80% ל-90%, כך שהתוצאה של</w:t>
-      </w:r>
-      <w:r>
-        <w:rPr>
-          <w:rFonts w:asciiTheme="majorBidi" w:eastAsiaTheme="minorEastAsia" w:hAnsiTheme="majorBidi" w:cstheme="majorBidi" w:hint="cs"/>
-          <w:sz w:val="32"/>
-          <w:szCs w:val="32"/>
-          <w:rtl/>
-          <w:lang w:bidi="he-IL"/>
-        </w:rPr>
-        <w:t>י</w:t>
-      </w:r>
-      <w:r>
-        <w:rPr>
-          <w:rFonts w:asciiTheme="majorBidi" w:eastAsiaTheme="minorEastAsia" w:hAnsiTheme="majorBidi" w:cstheme="majorBidi"/>
-          <w:sz w:val="32"/>
-          <w:szCs w:val="32"/>
-          <w:rtl/>
-          <w:lang w:bidi="he-IL"/>
-        </w:rPr>
-        <w:t xml:space="preserve"> נעה בקצה העליון של הטווח הצפוי</w:t>
-      </w:r>
-      <w:r>
-        <w:rPr>
-          <w:rFonts w:asciiTheme="majorBidi" w:eastAsiaTheme="minorEastAsia" w:hAnsiTheme="majorBidi" w:cstheme="majorBidi"/>
-          <w:sz w:val="32"/>
-          <w:szCs w:val="32"/>
-          <w:lang w:bidi="he-IL"/>
-        </w:rPr>
-        <w:t>.</w:t>
-      </w:r>
-      <w:r>
-        <w:rPr>
-          <w:rFonts w:asciiTheme="majorBidi" w:eastAsiaTheme="minorEastAsia" w:hAnsiTheme="majorBidi" w:cstheme="majorBidi" w:hint="cs"/>
-          <w:sz w:val="32"/>
-          <w:szCs w:val="32"/>
-          <w:rtl/>
-          <w:lang w:bidi="he-IL"/>
-        </w:rPr>
-        <w:t xml:space="preserve"> </w:t>
-      </w:r>
-      <w:hyperlink r:id="rId14" w:anchor=":~:text=The%20model%20achieved%20the%20following,results%20on%20the%20test%20set" w:history="1">
+      <w:hyperlink r:id="rId13" w:anchor=":~:text=The%20model%20achieved%20the%20following,results%20on%20the%20test%20set" w:history="1">
+        <w:proofErr w:type="spellStart"/>
         <w:r>
           <w:rPr>
             <w:rStyle w:val="Hyperlink"/>
@@ -4483,8 +4280,9 @@
             <w:szCs w:val="32"/>
             <w:lang w:bidi="he-IL"/>
           </w:rPr>
-          <w:t>HuggingF</w:t>
+          <w:t>HuggingFace</w:t>
         </w:r>
+        <w:proofErr w:type="spellEnd"/>
         <w:r>
           <w:rPr>
             <w:rStyle w:val="Hyperlink"/>
@@ -4493,17 +4291,7 @@
             <w:szCs w:val="32"/>
             <w:lang w:bidi="he-IL"/>
           </w:rPr>
-          <w:t>a</w:t>
-        </w:r>
-        <w:r>
-          <w:rPr>
-            <w:rStyle w:val="Hyperlink"/>
-            <w:rFonts w:ascii="Times New Roman" w:eastAsiaTheme="minorEastAsia" w:hAnsi="Times New Roman" w:cs="Times New Roman"/>
-            <w:sz w:val="32"/>
-            <w:szCs w:val="32"/>
-            <w:lang w:bidi="he-IL"/>
-          </w:rPr>
-          <w:t>ce-Link</w:t>
+          <w:t>-Link</w:t>
         </w:r>
       </w:hyperlink>
     </w:p>
@@ -4563,7 +4351,7 @@
                     <pic:cNvPicPr/>
                   </pic:nvPicPr>
                   <pic:blipFill>
-                    <a:blip r:embed="rId15">
+                    <a:blip r:embed="rId14">
                       <a:extLst>
                         <a:ext uri="{28A0092B-C50C-407E-A947-70E740481C1C}">
                           <a14:useLocalDpi xmlns:a14="http://schemas.microsoft.com/office/drawing/2010/main" val="0"/>
@@ -5142,28 +4930,34 @@
         </w:rPr>
         <w:t xml:space="preserve">: </w:t>
       </w:r>
-      <w:hyperlink r:id="rId16" w:history="1">
-        <w:r>
-          <w:rPr>
-            <w:rStyle w:val="Hyperlink"/>
-            <w:rFonts w:ascii="Times New Roman" w:eastAsiaTheme="minorEastAsia" w:hAnsi="Times New Roman" w:cs="Times New Roman"/>
-            <w:lang w:bidi="he-IL"/>
-          </w:rPr>
-          <w:t>arxiv</w:t>
-        </w:r>
-      </w:hyperlink>
+      <w:r>
+        <w:fldChar w:fldCharType="begin"/>
+      </w:r>
+      <w:r>
+        <w:instrText>HYPERLINK "https://arxiv.org/abs/1810.04805"</w:instrText>
+      </w:r>
+      <w:r>
+        <w:fldChar w:fldCharType="separate"/>
+      </w:r>
+      <w:proofErr w:type="spellStart"/>
+      <w:r>
+        <w:rPr>
+          <w:rStyle w:val="Hyperlink"/>
+          <w:rFonts w:ascii="Times New Roman" w:eastAsiaTheme="minorEastAsia" w:hAnsi="Times New Roman" w:cs="Times New Roman"/>
+          <w:lang w:bidi="he-IL"/>
+        </w:rPr>
+        <w:t>arxiv</w:t>
+      </w:r>
+      <w:proofErr w:type="spellEnd"/>
+      <w:r>
+        <w:fldChar w:fldCharType="end"/>
+      </w:r>
       <w:r>
         <w:rPr>
           <w:rFonts w:ascii="Times New Roman" w:eastAsiaTheme="minorEastAsia" w:hAnsi="Times New Roman" w:cs="Times New Roman"/>
           <w:lang w:bidi="he-IL"/>
         </w:rPr>
         <w:br/>
-      </w:r>
-      <w:r>
-        <w:rPr>
-          <w:rFonts w:ascii="Times New Roman" w:eastAsiaTheme="minorEastAsia" w:hAnsi="Times New Roman" w:cs="Times New Roman"/>
-          <w:lang w:bidi="he-IL"/>
-        </w:rPr>
         <w:t>Devlin, J., Chang, M.-W., Lee, K., &amp; Toutanova, K.</w:t>
       </w:r>
       <w:r>
@@ -5266,14 +5060,7 @@
           <w:rFonts w:asciiTheme="majorBidi" w:eastAsiaTheme="minorEastAsia" w:hAnsiTheme="majorBidi" w:cstheme="majorBidi"/>
           <w:lang w:bidi="he-IL"/>
         </w:rPr>
-        <w:t xml:space="preserve"> </w:t>
-      </w:r>
-      <w:r>
-        <w:rPr>
-          <w:rFonts w:asciiTheme="majorBidi" w:eastAsiaTheme="minorEastAsia" w:hAnsiTheme="majorBidi" w:cstheme="majorBidi"/>
-          <w:lang w:bidi="he-IL"/>
-        </w:rPr>
-        <w:t xml:space="preserve">BERT </w:t>
+        <w:t xml:space="preserve"> BERT </w:t>
       </w:r>
       <w:r>
         <w:rPr>
@@ -5405,7 +5192,8 @@
         </w:rPr>
         <w:br/>
       </w:r>
-      <w:hyperlink r:id="rId17" w:history="1">
+      <w:hyperlink r:id="rId15" w:history="1">
+        <w:proofErr w:type="spellStart"/>
         <w:r>
           <w:rPr>
             <w:rStyle w:val="Hyperlink"/>
@@ -5414,6 +5202,7 @@
           </w:rPr>
           <w:t>arxiv</w:t>
         </w:r>
+        <w:proofErr w:type="spellEnd"/>
       </w:hyperlink>
       <w:r>
         <w:rPr>
@@ -5423,12 +5212,21 @@
         </w:rPr>
         <w:br/>
       </w:r>
+      <w:proofErr w:type="spellStart"/>
       <w:r>
         <w:rPr>
           <w:rFonts w:asciiTheme="majorBidi" w:eastAsiaTheme="minorEastAsia" w:hAnsiTheme="majorBidi" w:cstheme="majorBidi"/>
           <w:lang w:bidi="he-IL"/>
         </w:rPr>
-        <w:t>Gururangan, S. et al.</w:t>
+        <w:t>Gururangan</w:t>
+      </w:r>
+      <w:proofErr w:type="spellEnd"/>
+      <w:r>
+        <w:rPr>
+          <w:rFonts w:asciiTheme="majorBidi" w:eastAsiaTheme="minorEastAsia" w:hAnsiTheme="majorBidi" w:cstheme="majorBidi"/>
+          <w:lang w:bidi="he-IL"/>
+        </w:rPr>
+        <w:t>, S. et al.</w:t>
       </w:r>
       <w:r>
         <w:rPr>
@@ -5642,7 +5440,7 @@
                     <pic:cNvPicPr/>
                   </pic:nvPicPr>
                   <pic:blipFill>
-                    <a:blip r:embed="rId18">
+                    <a:blip r:embed="rId16">
                       <a:extLst>
                         <a:ext uri="{28A0092B-C50C-407E-A947-70E740481C1C}">
                           <a14:useLocalDpi xmlns:a14="http://schemas.microsoft.com/office/drawing/2010/main" val="0"/>
@@ -6239,7 +6037,7 @@
         <w:bidi/>
         <w:ind w:left="2160"/>
         <w:rPr>
-          <w:rFonts w:ascii="Times New Roman" w:eastAsiaTheme="minorEastAsia" w:hAnsi="Times New Roman" w:cs="Times New Roman" w:hint="cs"/>
+          <w:rFonts w:ascii="Times New Roman" w:eastAsiaTheme="minorEastAsia" w:hAnsi="Times New Roman" w:cs="Times New Roman"/>
           <w:b/>
           <w:bCs/>
           <w:sz w:val="32"/>
@@ -6361,7 +6159,23 @@
           <w:rFonts w:asciiTheme="majorBidi" w:eastAsiaTheme="minorEastAsia" w:hAnsiTheme="majorBidi" w:cstheme="majorBidi"/>
           <w:lang w:bidi="he-IL"/>
         </w:rPr>
-        <w:t>Blitzer, J., Dredze, M., &amp; Pereira, F.</w:t>
+        <w:t xml:space="preserve">Blitzer, J., </w:t>
+      </w:r>
+      <w:proofErr w:type="spellStart"/>
+      <w:r>
+        <w:rPr>
+          <w:rFonts w:asciiTheme="majorBidi" w:eastAsiaTheme="minorEastAsia" w:hAnsiTheme="majorBidi" w:cstheme="majorBidi"/>
+          <w:lang w:bidi="he-IL"/>
+        </w:rPr>
+        <w:t>Dredze</w:t>
+      </w:r>
+      <w:proofErr w:type="spellEnd"/>
+      <w:r>
+        <w:rPr>
+          <w:rFonts w:asciiTheme="majorBidi" w:eastAsiaTheme="minorEastAsia" w:hAnsiTheme="majorBidi" w:cstheme="majorBidi"/>
+          <w:lang w:bidi="he-IL"/>
+        </w:rPr>
+        <w:t>, M., &amp; Pereira, F.</w:t>
       </w:r>
       <w:r>
         <w:rPr>
@@ -6398,7 +6212,7 @@
           <w:lang w:bidi="he-IL"/>
         </w:rPr>
       </w:pPr>
-      <w:hyperlink r:id="rId19" w:tgtFrame="_new" w:history="1">
+      <w:hyperlink r:id="rId17" w:tgtFrame="_new" w:history="1">
         <w:r>
           <w:rPr>
             <w:rStyle w:val="Hyperlink"/>
@@ -6551,7 +6365,7 @@
           <w:lang w:bidi="he-IL"/>
         </w:rPr>
       </w:pPr>
-      <w:hyperlink r:id="rId20" w:history="1">
+      <w:hyperlink r:id="rId18" w:history="1">
         <w:r>
           <w:rPr>
             <w:rStyle w:val="Hyperlink"/>
@@ -6596,6 +6410,7 @@
           <w:lang w:bidi="he-IL"/>
         </w:rPr>
       </w:pPr>
+      <w:proofErr w:type="spellStart"/>
       <w:r>
         <w:rPr>
           <w:rFonts w:asciiTheme="majorBidi" w:eastAsiaTheme="minorEastAsia" w:hAnsiTheme="majorBidi" w:cstheme="majorBidi"/>
@@ -6603,17 +6418,17 @@
           <w:bCs/>
           <w:lang w:bidi="he-IL"/>
         </w:rPr>
-        <w:t xml:space="preserve">omain-Aware BERT </w:t>
-      </w:r>
+        <w:t>omain</w:t>
+      </w:r>
+      <w:proofErr w:type="spellEnd"/>
       <w:r>
         <w:rPr>
           <w:rFonts w:asciiTheme="majorBidi" w:eastAsiaTheme="minorEastAsia" w:hAnsiTheme="majorBidi" w:cstheme="majorBidi"/>
           <w:b/>
           <w:bCs/>
-          <w:rtl/>
-          <w:lang w:bidi="he-IL"/>
-        </w:rPr>
-        <w:t xml:space="preserve"> </w:t>
+          <w:lang w:bidi="he-IL"/>
+        </w:rPr>
+        <w:t xml:space="preserve">-Aware BERT </w:t>
       </w:r>
       <w:r>
         <w:rPr>
@@ -6623,7 +6438,7 @@
           <w:rtl/>
           <w:lang w:bidi="he-IL"/>
         </w:rPr>
-        <w:t>ל</w:t>
+        <w:t xml:space="preserve"> ל</w:t>
       </w:r>
       <w:r>
         <w:rPr>
@@ -6725,7 +6540,7 @@
           <w:lang w:bidi="he-IL"/>
         </w:rPr>
       </w:pPr>
-      <w:hyperlink r:id="rId21" w:tgtFrame="_new" w:history="1">
+      <w:hyperlink r:id="rId19" w:tgtFrame="_new" w:history="1">
         <w:r>
           <w:rPr>
             <w:rStyle w:val="Hyperlink"/>
@@ -6767,14 +6582,6 @@
           <w:lang w:bidi="he-IL"/>
         </w:rPr>
         <w:br/>
-      </w:r>
-      <w:r>
-        <w:rPr>
-          <w:rFonts w:asciiTheme="majorBidi" w:eastAsiaTheme="minorEastAsia" w:hAnsiTheme="majorBidi" w:cstheme="majorBidi"/>
-          <w:b/>
-          <w:bCs/>
-          <w:lang w:bidi="he-IL"/>
-        </w:rPr>
         <w:t>Continued / Domain-Adaptive Pretraining</w:t>
       </w:r>
     </w:p>
@@ -6788,12 +6595,21 @@
           <w:lang w:bidi="he-IL"/>
         </w:rPr>
       </w:pPr>
+      <w:proofErr w:type="spellStart"/>
       <w:r>
         <w:rPr>
           <w:rFonts w:asciiTheme="majorBidi" w:eastAsiaTheme="minorEastAsia" w:hAnsiTheme="majorBidi" w:cstheme="majorBidi"/>
           <w:lang w:bidi="he-IL"/>
         </w:rPr>
-        <w:t>Gururangan et al., 2020</w:t>
+        <w:t>Gururangan</w:t>
+      </w:r>
+      <w:proofErr w:type="spellEnd"/>
+      <w:r>
+        <w:rPr>
+          <w:rFonts w:asciiTheme="majorBidi" w:eastAsiaTheme="minorEastAsia" w:hAnsiTheme="majorBidi" w:cstheme="majorBidi"/>
+          <w:lang w:bidi="he-IL"/>
+        </w:rPr>
+        <w:t xml:space="preserve"> et al., 2020</w:t>
       </w:r>
     </w:p>
     <w:p>
@@ -6806,12 +6622,21 @@
           <w:lang w:bidi="he-IL"/>
         </w:rPr>
       </w:pPr>
+      <w:proofErr w:type="spellStart"/>
       <w:r>
         <w:rPr>
           <w:rFonts w:asciiTheme="majorBidi" w:eastAsiaTheme="minorEastAsia" w:hAnsiTheme="majorBidi" w:cstheme="majorBidi"/>
           <w:lang w:bidi="he-IL"/>
         </w:rPr>
-        <w:t>Gururangan, S., et al.</w:t>
+        <w:t>Gururangan</w:t>
+      </w:r>
+      <w:proofErr w:type="spellEnd"/>
+      <w:r>
+        <w:rPr>
+          <w:rFonts w:asciiTheme="majorBidi" w:eastAsiaTheme="minorEastAsia" w:hAnsiTheme="majorBidi" w:cstheme="majorBidi"/>
+          <w:lang w:bidi="he-IL"/>
+        </w:rPr>
+        <w:t>, S., et al.</w:t>
       </w:r>
       <w:r>
         <w:rPr>
@@ -6850,7 +6675,7 @@
           <w:lang w:bidi="he-IL"/>
         </w:rPr>
       </w:pPr>
-      <w:hyperlink r:id="rId22" w:history="1">
+      <w:hyperlink r:id="rId20" w:history="1">
         <w:r>
           <w:rPr>
             <w:rStyle w:val="Hyperlink"/>
@@ -6920,7 +6745,7 @@
                     <pic:cNvPicPr/>
                   </pic:nvPicPr>
                   <pic:blipFill>
-                    <a:blip r:embed="rId23">
+                    <a:blip r:embed="rId21">
                       <a:extLst>
                         <a:ext uri="{28A0092B-C50C-407E-A947-70E740481C1C}">
                           <a14:useLocalDpi xmlns:a14="http://schemas.microsoft.com/office/drawing/2010/main" val="0"/>
@@ -8430,16 +8255,7 @@
           <w:szCs w:val="32"/>
           <w:lang w:bidi="he-IL"/>
         </w:rPr>
-        <w:t xml:space="preserve"> </w:t>
-      </w:r>
-      <w:r>
-        <w:rPr>
-          <w:rFonts w:ascii="Times New Roman" w:eastAsiaTheme="minorEastAsia" w:hAnsi="Times New Roman" w:cs="Times New Roman"/>
-          <w:sz w:val="32"/>
-          <w:szCs w:val="32"/>
-          <w:lang w:bidi="he-IL"/>
-        </w:rPr>
-        <w:t xml:space="preserve"> </w:t>
+        <w:t xml:space="preserve">  </w:t>
       </w:r>
       <w:r>
         <w:rPr>
@@ -8639,14 +8455,25 @@
           <w:lang w:bidi="he-IL"/>
         </w:rPr>
       </w:pPr>
-      <w:r>
-        <w:rPr>
-          <w:rFonts w:ascii="Times New Roman" w:eastAsiaTheme="minorEastAsia" w:hAnsi="Times New Roman" w:cs="Times New Roman"/>
-          <w:b/>
-          <w:bCs/>
-          <w:lang w:bidi="he-IL"/>
-        </w:rPr>
-        <w:t>Gururangan, S., et al. (2020).</w:t>
+      <w:proofErr w:type="spellStart"/>
+      <w:r>
+        <w:rPr>
+          <w:rFonts w:ascii="Times New Roman" w:eastAsiaTheme="minorEastAsia" w:hAnsi="Times New Roman" w:cs="Times New Roman"/>
+          <w:b/>
+          <w:bCs/>
+          <w:lang w:bidi="he-IL"/>
+        </w:rPr>
+        <w:t>Gururangan</w:t>
+      </w:r>
+      <w:proofErr w:type="spellEnd"/>
+      <w:r>
+        <w:rPr>
+          <w:rFonts w:ascii="Times New Roman" w:eastAsiaTheme="minorEastAsia" w:hAnsi="Times New Roman" w:cs="Times New Roman"/>
+          <w:b/>
+          <w:bCs/>
+          <w:lang w:bidi="he-IL"/>
+        </w:rPr>
+        <w:t>, S., et al. (2020).</w:t>
       </w:r>
       <w:r>
         <w:rPr>
@@ -8678,13 +8505,6 @@
           <w:lang w:bidi="he-IL"/>
         </w:rPr>
         <w:br/>
-      </w:r>
-      <w:r>
-        <w:rPr>
-          <w:rFonts w:ascii="Times New Roman" w:eastAsiaTheme="minorEastAsia" w:hAnsi="Times New Roman" w:cs="Times New Roman"/>
-          <w:rtl/>
-          <w:lang w:bidi="he-IL"/>
-        </w:rPr>
         <w:t>תומך בפתרו</w:t>
       </w:r>
       <w:r>
@@ -8735,7 +8555,7 @@
         </w:numPr>
         <w:spacing w:before="100" w:beforeAutospacing="1" w:after="100" w:afterAutospacing="1" w:line="240" w:lineRule="auto"/>
         <w:rPr>
-          <w:rFonts w:eastAsia="Times New Roman" w:hint="cs"/>
+          <w:rFonts w:eastAsia="Times New Roman"/>
           <w:kern w:val="0"/>
           <w14:ligatures w14:val="none"/>
         </w:rPr>
@@ -8992,6 +8812,3237 @@
           <w:lang w:bidi="he-IL"/>
         </w:rPr>
       </w:pPr>
+    </w:p>
+    <w:p>
+      <w:pPr>
+        <w:bidi/>
+        <w:rPr>
+          <w:rFonts w:ascii="Times New Roman" w:eastAsiaTheme="minorEastAsia" w:hAnsi="Times New Roman" w:cs="Times New Roman"/>
+          <w:sz w:val="32"/>
+          <w:szCs w:val="32"/>
+          <w:lang w:bidi="he-IL"/>
+        </w:rPr>
+      </w:pPr>
+    </w:p>
+    <w:p>
+      <w:pPr>
+        <w:bidi/>
+        <w:rPr>
+          <w:rFonts w:ascii="Times New Roman" w:eastAsiaTheme="minorEastAsia" w:hAnsi="Times New Roman" w:cs="Times New Roman"/>
+          <w:b/>
+          <w:bCs/>
+          <w:i/>
+          <w:iCs/>
+          <w:sz w:val="32"/>
+          <w:szCs w:val="32"/>
+          <w:u w:val="single"/>
+          <w:rtl/>
+          <w:lang w:bidi="he-IL"/>
+        </w:rPr>
+      </w:pPr>
+      <w:r>
+        <w:rPr>
+          <w:rFonts w:ascii="Times New Roman" w:eastAsiaTheme="minorEastAsia" w:hAnsi="Times New Roman" w:cs="Times New Roman" w:hint="cs"/>
+          <w:b/>
+          <w:bCs/>
+          <w:i/>
+          <w:iCs/>
+          <w:sz w:val="32"/>
+          <w:szCs w:val="32"/>
+          <w:u w:val="single"/>
+          <w:rtl/>
+          <w:lang w:bidi="he-IL"/>
+        </w:rPr>
+        <w:lastRenderedPageBreak/>
+        <w:t>חלק ג:</w:t>
+      </w:r>
+    </w:p>
+    <w:p>
+      <w:pPr>
+        <w:bidi/>
+        <w:rPr>
+          <w:rFonts w:ascii="Times New Roman" w:eastAsiaTheme="minorEastAsia" w:hAnsi="Times New Roman" w:cs="Times New Roman"/>
+          <w:sz w:val="32"/>
+          <w:szCs w:val="32"/>
+          <w:rtl/>
+          <w:lang w:bidi="he-IL"/>
+        </w:rPr>
+      </w:pPr>
+    </w:p>
+    <w:p>
+      <w:pPr>
+        <w:bidi/>
+        <w:rPr>
+          <w:rFonts w:ascii="Times New Roman" w:eastAsiaTheme="minorEastAsia" w:hAnsi="Times New Roman" w:cs="Times New Roman"/>
+          <w:sz w:val="32"/>
+          <w:szCs w:val="32"/>
+          <w:rtl/>
+          <w:lang w:bidi="he-IL"/>
+        </w:rPr>
+      </w:pPr>
+      <w:r>
+        <w:rPr>
+          <w:rFonts w:ascii="Times New Roman" w:eastAsiaTheme="minorEastAsia" w:hAnsi="Times New Roman" w:cs="Times New Roman"/>
+          <w:sz w:val="32"/>
+          <w:szCs w:val="32"/>
+          <w:rtl/>
+          <w:lang w:bidi="he-IL"/>
+        </w:rPr>
+        <w:drawing>
+          <wp:inline distT="0" distB="0" distL="0" distR="0" wp14:anchorId="0F3C2371" wp14:editId="334AD935">
+            <wp:extent cx="4976291" cy="259102"/>
+            <wp:effectExtent l="133350" t="76200" r="72390" b="140970"/>
+            <wp:docPr id="1353309565" name="Picture 1"/>
+            <wp:cNvGraphicFramePr>
+              <a:graphicFrameLocks xmlns:a="http://schemas.openxmlformats.org/drawingml/2006/main" noChangeAspect="1"/>
+            </wp:cNvGraphicFramePr>
+            <a:graphic xmlns:a="http://schemas.openxmlformats.org/drawingml/2006/main">
+              <a:graphicData uri="http://schemas.openxmlformats.org/drawingml/2006/picture">
+                <pic:pic xmlns:pic="http://schemas.openxmlformats.org/drawingml/2006/picture">
+                  <pic:nvPicPr>
+                    <pic:cNvPr id="1353309565" name=""/>
+                    <pic:cNvPicPr/>
+                  </pic:nvPicPr>
+                  <pic:blipFill>
+                    <a:blip r:embed="rId22"/>
+                    <a:stretch>
+                      <a:fillRect/>
+                    </a:stretch>
+                  </pic:blipFill>
+                  <pic:spPr>
+                    <a:xfrm>
+                      <a:off x="0" y="0"/>
+                      <a:ext cx="4976291" cy="259102"/>
+                    </a:xfrm>
+                    <a:prstGeom prst="roundRect">
+                      <a:avLst>
+                        <a:gd name="adj" fmla="val 16667"/>
+                      </a:avLst>
+                    </a:prstGeom>
+                    <a:ln>
+                      <a:noFill/>
+                    </a:ln>
+                    <a:effectLst>
+                      <a:outerShdw blurRad="76200" dist="38100" dir="7800000" algn="tl" rotWithShape="0">
+                        <a:srgbClr val="000000">
+                          <a:alpha val="40000"/>
+                        </a:srgbClr>
+                      </a:outerShdw>
+                    </a:effectLst>
+                    <a:scene3d>
+                      <a:camera prst="orthographicFront"/>
+                      <a:lightRig rig="contrasting" dir="t">
+                        <a:rot lat="0" lon="0" rev="4200000"/>
+                      </a:lightRig>
+                    </a:scene3d>
+                    <a:sp3d prstMaterial="plastic">
+                      <a:bevelT w="381000" h="114300" prst="relaxedInset"/>
+                      <a:contourClr>
+                        <a:srgbClr val="969696"/>
+                      </a:contourClr>
+                    </a:sp3d>
+                  </pic:spPr>
+                </pic:pic>
+              </a:graphicData>
+            </a:graphic>
+          </wp:inline>
+        </w:drawing>
+      </w:r>
+    </w:p>
+    <w:p>
+      <w:pPr>
+        <w:bidi/>
+        <w:rPr>
+          <w:rFonts w:ascii="Times New Roman" w:eastAsiaTheme="minorEastAsia" w:hAnsi="Times New Roman" w:cs="Times New Roman"/>
+          <w:sz w:val="32"/>
+          <w:szCs w:val="32"/>
+          <w:rtl/>
+          <w:lang w:bidi="he-IL"/>
+        </w:rPr>
+      </w:pPr>
+      <w:r>
+        <w:rPr>
+          <w:rFonts w:ascii="Times New Roman" w:eastAsiaTheme="minorEastAsia" w:hAnsi="Times New Roman" w:cs="Times New Roman" w:hint="cs"/>
+          <w:sz w:val="32"/>
+          <w:szCs w:val="32"/>
+          <w:rtl/>
+          <w:lang w:bidi="he-IL"/>
+        </w:rPr>
+        <w:t>הפרמטרים שנבחרו:</w:t>
+      </w:r>
+    </w:p>
+    <w:p>
+      <w:pPr>
+        <w:bidi/>
+        <w:rPr>
+          <w:rFonts w:ascii="Times New Roman" w:eastAsiaTheme="minorEastAsia" w:hAnsi="Times New Roman" w:cs="Times New Roman"/>
+          <w:sz w:val="32"/>
+          <w:szCs w:val="32"/>
+          <w:rtl/>
+          <w:lang w:bidi="he-IL"/>
+        </w:rPr>
+      </w:pPr>
+      <w:r>
+        <w:rPr>
+          <w:rFonts w:ascii="Times New Roman" w:eastAsiaTheme="minorEastAsia" w:hAnsi="Times New Roman" w:cs="Times New Roman"/>
+          <w:sz w:val="32"/>
+          <w:szCs w:val="32"/>
+          <w:rtl/>
+          <w:lang w:bidi="he-IL"/>
+        </w:rPr>
+        <w:drawing>
+          <wp:anchor distT="0" distB="0" distL="114300" distR="114300" simplePos="0" relativeHeight="251665408" behindDoc="1" locked="0" layoutInCell="1" allowOverlap="1" wp14:anchorId="60EC14A7" wp14:editId="3E3A67C2">
+            <wp:simplePos x="0" y="0"/>
+            <wp:positionH relativeFrom="column">
+              <wp:posOffset>2133600</wp:posOffset>
+            </wp:positionH>
+            <wp:positionV relativeFrom="paragraph">
+              <wp:posOffset>66675</wp:posOffset>
+            </wp:positionV>
+            <wp:extent cx="3832225" cy="2457450"/>
+            <wp:effectExtent l="0" t="0" r="0" b="0"/>
+            <wp:wrapTight wrapText="bothSides">
+              <wp:wrapPolygon edited="0">
+                <wp:start x="0" y="0"/>
+                <wp:lineTo x="0" y="21433"/>
+                <wp:lineTo x="21475" y="21433"/>
+                <wp:lineTo x="21475" y="0"/>
+                <wp:lineTo x="0" y="0"/>
+              </wp:wrapPolygon>
+            </wp:wrapTight>
+            <wp:docPr id="155180675" name="Picture 1"/>
+            <wp:cNvGraphicFramePr>
+              <a:graphicFrameLocks xmlns:a="http://schemas.openxmlformats.org/drawingml/2006/main" noChangeAspect="1"/>
+            </wp:cNvGraphicFramePr>
+            <a:graphic xmlns:a="http://schemas.openxmlformats.org/drawingml/2006/main">
+              <a:graphicData uri="http://schemas.openxmlformats.org/drawingml/2006/picture">
+                <pic:pic xmlns:pic="http://schemas.openxmlformats.org/drawingml/2006/picture">
+                  <pic:nvPicPr>
+                    <pic:cNvPr id="155180675" name=""/>
+                    <pic:cNvPicPr/>
+                  </pic:nvPicPr>
+                  <pic:blipFill>
+                    <a:blip r:embed="rId23">
+                      <a:extLst>
+                        <a:ext uri="{28A0092B-C50C-407E-A947-70E740481C1C}">
+                          <a14:useLocalDpi xmlns:a14="http://schemas.microsoft.com/office/drawing/2010/main" val="0"/>
+                        </a:ext>
+                      </a:extLst>
+                    </a:blip>
+                    <a:stretch>
+                      <a:fillRect/>
+                    </a:stretch>
+                  </pic:blipFill>
+                  <pic:spPr>
+                    <a:xfrm>
+                      <a:off x="0" y="0"/>
+                      <a:ext cx="3832225" cy="2457450"/>
+                    </a:xfrm>
+                    <a:prstGeom prst="rect">
+                      <a:avLst/>
+                    </a:prstGeom>
+                  </pic:spPr>
+                </pic:pic>
+              </a:graphicData>
+            </a:graphic>
+            <wp14:sizeRelH relativeFrom="margin">
+              <wp14:pctWidth>0</wp14:pctWidth>
+            </wp14:sizeRelH>
+            <wp14:sizeRelV relativeFrom="margin">
+              <wp14:pctHeight>0</wp14:pctHeight>
+            </wp14:sizeRelV>
+          </wp:anchor>
+        </w:drawing>
+      </w:r>
+    </w:p>
+    <w:p>
+      <w:pPr>
+        <w:bidi/>
+        <w:rPr>
+          <w:rFonts w:ascii="Times New Roman" w:eastAsiaTheme="minorEastAsia" w:hAnsi="Times New Roman" w:cs="Times New Roman"/>
+          <w:sz w:val="32"/>
+          <w:szCs w:val="32"/>
+          <w:rtl/>
+          <w:lang w:bidi="he-IL"/>
+        </w:rPr>
+      </w:pPr>
+    </w:p>
+    <w:p>
+      <w:pPr>
+        <w:bidi/>
+        <w:rPr>
+          <w:rFonts w:ascii="Times New Roman" w:eastAsiaTheme="minorEastAsia" w:hAnsi="Times New Roman" w:cs="Times New Roman"/>
+          <w:sz w:val="32"/>
+          <w:szCs w:val="32"/>
+          <w:rtl/>
+          <w:lang w:bidi="he-IL"/>
+        </w:rPr>
+      </w:pPr>
+    </w:p>
+    <w:p>
+      <w:pPr>
+        <w:bidi/>
+        <w:rPr>
+          <w:rFonts w:ascii="Times New Roman" w:eastAsiaTheme="minorEastAsia" w:hAnsi="Times New Roman" w:cs="Times New Roman"/>
+          <w:sz w:val="32"/>
+          <w:szCs w:val="32"/>
+          <w:rtl/>
+          <w:lang w:bidi="he-IL"/>
+        </w:rPr>
+      </w:pPr>
+    </w:p>
+    <w:p>
+      <w:pPr>
+        <w:bidi/>
+        <w:rPr>
+          <w:rFonts w:ascii="Times New Roman" w:eastAsiaTheme="minorEastAsia" w:hAnsi="Times New Roman" w:cs="Times New Roman"/>
+          <w:sz w:val="32"/>
+          <w:szCs w:val="32"/>
+          <w:rtl/>
+          <w:lang w:bidi="he-IL"/>
+        </w:rPr>
+      </w:pPr>
+    </w:p>
+    <w:p>
+      <w:pPr>
+        <w:bidi/>
+        <w:rPr>
+          <w:rFonts w:ascii="Times New Roman" w:eastAsiaTheme="minorEastAsia" w:hAnsi="Times New Roman" w:cs="Times New Roman"/>
+          <w:sz w:val="32"/>
+          <w:szCs w:val="32"/>
+          <w:rtl/>
+          <w:lang w:bidi="he-IL"/>
+        </w:rPr>
+      </w:pPr>
+    </w:p>
+    <w:p>
+      <w:pPr>
+        <w:bidi/>
+        <w:rPr>
+          <w:rFonts w:ascii="Times New Roman" w:eastAsiaTheme="minorEastAsia" w:hAnsi="Times New Roman" w:cs="Times New Roman"/>
+          <w:sz w:val="32"/>
+          <w:szCs w:val="32"/>
+          <w:rtl/>
+          <w:lang w:bidi="he-IL"/>
+        </w:rPr>
+      </w:pPr>
+    </w:p>
+    <w:p>
+      <w:pPr>
+        <w:bidi/>
+        <w:rPr>
+          <w:rFonts w:ascii="Times New Roman" w:eastAsiaTheme="minorEastAsia" w:hAnsi="Times New Roman" w:cs="Times New Roman"/>
+          <w:sz w:val="32"/>
+          <w:szCs w:val="32"/>
+          <w:rtl/>
+          <w:lang w:bidi="he-IL"/>
+        </w:rPr>
+      </w:pPr>
+      <w:r>
+        <w:rPr>
+          <w:rFonts w:ascii="Times New Roman" w:eastAsiaTheme="minorEastAsia" w:hAnsi="Times New Roman" w:cs="Times New Roman" w:hint="cs"/>
+          <w:sz w:val="32"/>
+          <w:szCs w:val="32"/>
+          <w:rtl/>
+          <w:lang w:bidi="he-IL"/>
+        </w:rPr>
+        <w:t>תשובה:</w:t>
+      </w:r>
+      <w:r>
+        <w:rPr>
+          <w:rFonts w:ascii="Times New Roman" w:eastAsiaTheme="minorEastAsia" w:hAnsi="Times New Roman" w:cs="Times New Roman"/>
+          <w:sz w:val="32"/>
+          <w:szCs w:val="32"/>
+          <w:rtl/>
+          <w:lang w:bidi="he-IL"/>
+        </w:rPr>
+        <w:br/>
+      </w:r>
+    </w:p>
+    <w:p>
+      <w:pPr>
+        <w:bidi/>
+        <w:rPr>
+          <w:rFonts w:ascii="Times New Roman" w:eastAsiaTheme="minorEastAsia" w:hAnsi="Times New Roman" w:cs="Times New Roman"/>
+          <w:b/>
+          <w:bCs/>
+          <w:sz w:val="32"/>
+          <w:szCs w:val="32"/>
+          <w:rtl/>
+          <w:lang w:bidi="he-IL"/>
+        </w:rPr>
+      </w:pPr>
+      <w:r>
+        <w:rPr>
+          <w:rFonts w:ascii="Times New Roman" w:eastAsiaTheme="minorEastAsia" w:hAnsi="Times New Roman" w:cs="Times New Roman"/>
+          <w:b/>
+          <w:bCs/>
+          <w:sz w:val="32"/>
+          <w:szCs w:val="32"/>
+          <w:rtl/>
+          <w:lang w:bidi="he-IL"/>
+        </w:rPr>
+        <w:t>להלן פירוט הערכים שנבחרו וההסבר המחקרי לכל אחד מהם</w:t>
+      </w:r>
+      <w:r>
+        <w:rPr>
+          <w:rFonts w:ascii="Times New Roman" w:eastAsiaTheme="minorEastAsia" w:hAnsi="Times New Roman" w:cs="Times New Roman"/>
+          <w:b/>
+          <w:bCs/>
+          <w:sz w:val="32"/>
+          <w:szCs w:val="32"/>
+          <w:lang w:bidi="he-IL"/>
+        </w:rPr>
+        <w:t>:</w:t>
+      </w:r>
+    </w:p>
+    <w:p>
+      <w:pPr>
+        <w:pStyle w:val="ListParagraph"/>
+        <w:numPr>
+          <w:ilvl w:val="0"/>
+          <w:numId w:val="40"/>
+        </w:numPr>
+        <w:bidi/>
+        <w:rPr>
+          <w:rFonts w:ascii="Times New Roman" w:eastAsiaTheme="minorEastAsia" w:hAnsi="Times New Roman" w:cs="Times New Roman"/>
+          <w:b/>
+          <w:bCs/>
+          <w:sz w:val="32"/>
+          <w:szCs w:val="32"/>
+          <w:lang w:bidi="he-IL"/>
+        </w:rPr>
+      </w:pPr>
+      <w:proofErr w:type="spellStart"/>
+      <w:r>
+        <w:rPr>
+          <w:rFonts w:ascii="Times New Roman" w:eastAsiaTheme="minorEastAsia" w:hAnsi="Times New Roman" w:cs="Times New Roman"/>
+          <w:b/>
+          <w:bCs/>
+          <w:sz w:val="32"/>
+          <w:szCs w:val="32"/>
+          <w:lang w:bidi="he-IL"/>
+        </w:rPr>
+        <w:t>num_train_epochs</w:t>
+      </w:r>
+      <w:proofErr w:type="spellEnd"/>
+      <w:r>
+        <w:rPr>
+          <w:rFonts w:ascii="Times New Roman" w:eastAsiaTheme="minorEastAsia" w:hAnsi="Times New Roman" w:cs="Times New Roman"/>
+          <w:b/>
+          <w:bCs/>
+          <w:sz w:val="32"/>
+          <w:szCs w:val="32"/>
+          <w:lang w:bidi="he-IL"/>
+        </w:rPr>
+        <w:t xml:space="preserve"> = 3</w:t>
+      </w:r>
+      <w:r>
+        <w:rPr>
+          <w:rFonts w:ascii="Times New Roman" w:eastAsiaTheme="minorEastAsia" w:hAnsi="Times New Roman" w:cs="Times New Roman" w:hint="cs"/>
+          <w:b/>
+          <w:bCs/>
+          <w:sz w:val="32"/>
+          <w:szCs w:val="32"/>
+          <w:rtl/>
+          <w:lang w:bidi="he-IL"/>
+        </w:rPr>
+        <w:t>:</w:t>
+      </w:r>
+    </w:p>
+    <w:p>
+      <w:pPr>
+        <w:pStyle w:val="ListParagraph"/>
+        <w:bidi/>
+        <w:rPr>
+          <w:rFonts w:ascii="Times New Roman" w:eastAsiaTheme="minorEastAsia" w:hAnsi="Times New Roman" w:cs="Times New Roman"/>
+          <w:sz w:val="32"/>
+          <w:szCs w:val="32"/>
+          <w:rtl/>
+          <w:lang w:bidi="he-IL"/>
+        </w:rPr>
+      </w:pPr>
+      <w:r>
+        <w:rPr>
+          <w:rFonts w:ascii="Times New Roman" w:eastAsiaTheme="minorEastAsia" w:hAnsi="Times New Roman" w:cs="Times New Roman"/>
+          <w:sz w:val="32"/>
+          <w:szCs w:val="32"/>
+          <w:rtl/>
+          <w:lang w:bidi="he-IL"/>
+        </w:rPr>
+        <w:t xml:space="preserve">בחרנו במספר נמוך של איטרציות מכיוון שבסט נתונים </w:t>
+      </w:r>
+      <w:r>
+        <w:rPr>
+          <w:rFonts w:ascii="Times New Roman" w:eastAsiaTheme="minorEastAsia" w:hAnsi="Times New Roman" w:cs="Times New Roman" w:hint="cs"/>
+          <w:sz w:val="32"/>
+          <w:szCs w:val="32"/>
+          <w:rtl/>
+          <w:lang w:bidi="he-IL"/>
+        </w:rPr>
+        <w:t>קטן יחסית</w:t>
+      </w:r>
+      <w:r>
+        <w:rPr>
+          <w:rFonts w:ascii="Times New Roman" w:eastAsiaTheme="minorEastAsia" w:hAnsi="Times New Roman" w:cs="Times New Roman"/>
+          <w:sz w:val="32"/>
+          <w:szCs w:val="32"/>
+          <w:rtl/>
+          <w:lang w:bidi="he-IL"/>
+        </w:rPr>
+        <w:t xml:space="preserve"> (100 דוגמאות), חשיפה חוזרת ונשנית לאותן דוגמאות מובילה </w:t>
+      </w:r>
+      <w:r>
+        <w:rPr>
+          <w:rFonts w:ascii="Times New Roman" w:eastAsiaTheme="minorEastAsia" w:hAnsi="Times New Roman" w:cs="Times New Roman"/>
+          <w:sz w:val="32"/>
+          <w:szCs w:val="32"/>
+          <w:lang w:bidi="he-IL"/>
+        </w:rPr>
+        <w:t>Memorization</w:t>
+      </w:r>
+      <w:r>
+        <w:rPr>
+          <w:rFonts w:ascii="Times New Roman" w:eastAsiaTheme="minorEastAsia" w:hAnsi="Times New Roman" w:cs="Times New Roman" w:hint="cs"/>
+          <w:sz w:val="32"/>
+          <w:szCs w:val="32"/>
+          <w:rtl/>
+          <w:lang w:bidi="he-IL"/>
+        </w:rPr>
+        <w:t xml:space="preserve"> </w:t>
+      </w:r>
+      <w:r>
+        <w:rPr>
+          <w:rFonts w:ascii="Times New Roman" w:eastAsiaTheme="minorEastAsia" w:hAnsi="Times New Roman" w:cs="Times New Roman"/>
+          <w:sz w:val="32"/>
+          <w:szCs w:val="32"/>
+          <w:rtl/>
+          <w:lang w:bidi="he-IL"/>
+        </w:rPr>
+        <w:t>ולפליטת קטעים מתוך סט האימון במקום למידת הכללה</w:t>
+      </w:r>
+      <w:r>
+        <w:rPr>
+          <w:rFonts w:ascii="Times New Roman" w:eastAsiaTheme="minorEastAsia" w:hAnsi="Times New Roman" w:cs="Times New Roman" w:hint="cs"/>
+          <w:sz w:val="32"/>
+          <w:szCs w:val="32"/>
+          <w:rtl/>
+          <w:lang w:bidi="he-IL"/>
+        </w:rPr>
+        <w:t>.</w:t>
+      </w:r>
+    </w:p>
+    <w:p>
+      <w:pPr>
+        <w:pStyle w:val="ListParagraph"/>
+        <w:bidi/>
+        <w:rPr>
+          <w:rFonts w:ascii="Times New Roman" w:eastAsiaTheme="minorEastAsia" w:hAnsi="Times New Roman" w:cs="Times New Roman"/>
+          <w:sz w:val="32"/>
+          <w:szCs w:val="32"/>
+          <w:lang w:bidi="he-IL"/>
+        </w:rPr>
+      </w:pPr>
+      <w:r>
+        <w:rPr>
+          <w:rFonts w:ascii="Times New Roman" w:eastAsiaTheme="minorEastAsia" w:hAnsi="Times New Roman" w:cs="Times New Roman" w:hint="cs"/>
+          <w:sz w:val="32"/>
+          <w:szCs w:val="32"/>
+          <w:rtl/>
+          <w:lang w:bidi="he-IL"/>
+        </w:rPr>
+        <w:t>לפי הספרות ראינו שההמלצה היא</w:t>
+      </w:r>
+      <w:r>
+        <w:rPr>
+          <w:rFonts w:ascii="Times New Roman" w:eastAsiaTheme="minorEastAsia" w:hAnsi="Times New Roman" w:cs="Times New Roman"/>
+          <w:sz w:val="32"/>
+          <w:szCs w:val="32"/>
+          <w:rtl/>
+          <w:lang w:bidi="he-IL"/>
+        </w:rPr>
+        <w:t xml:space="preserve"> על טווח של 2-4 </w:t>
+      </w:r>
+      <w:r>
+        <w:rPr>
+          <w:rFonts w:ascii="Times New Roman" w:eastAsiaTheme="minorEastAsia" w:hAnsi="Times New Roman" w:cs="Times New Roman"/>
+          <w:sz w:val="32"/>
+          <w:szCs w:val="32"/>
+          <w:lang w:bidi="he-IL"/>
+        </w:rPr>
+        <w:t>Epochs</w:t>
+      </w:r>
+      <w:r>
+        <w:rPr>
+          <w:rFonts w:ascii="Times New Roman" w:eastAsiaTheme="minorEastAsia" w:hAnsi="Times New Roman" w:cs="Times New Roman"/>
+          <w:sz w:val="32"/>
+          <w:szCs w:val="32"/>
+          <w:rtl/>
+          <w:lang w:bidi="he-IL"/>
+        </w:rPr>
+        <w:t xml:space="preserve"> ב</w:t>
+      </w:r>
+    </w:p>
+    <w:p>
+      <w:pPr>
+        <w:pStyle w:val="ListParagraph"/>
+        <w:bidi/>
+        <w:rPr>
+          <w:rFonts w:ascii="Times New Roman" w:eastAsiaTheme="minorEastAsia" w:hAnsi="Times New Roman" w:cs="Times New Roman"/>
+          <w:sz w:val="32"/>
+          <w:szCs w:val="32"/>
+          <w:lang w:bidi="he-IL"/>
+        </w:rPr>
+      </w:pPr>
+      <w:r>
+        <w:rPr>
+          <w:rFonts w:ascii="Times New Roman" w:eastAsiaTheme="minorEastAsia" w:hAnsi="Times New Roman" w:cs="Times New Roman" w:hint="cs"/>
+          <w:sz w:val="32"/>
+          <w:szCs w:val="32"/>
+          <w:rtl/>
+          <w:lang w:bidi="he-IL"/>
+        </w:rPr>
+        <w:t xml:space="preserve"> </w:t>
+      </w:r>
+      <w:r>
+        <w:rPr>
+          <w:rFonts w:ascii="Times New Roman" w:eastAsiaTheme="minorEastAsia" w:hAnsi="Times New Roman" w:cs="Times New Roman"/>
+          <w:sz w:val="32"/>
+          <w:szCs w:val="32"/>
+          <w:lang w:bidi="he-IL"/>
+        </w:rPr>
+        <w:t xml:space="preserve"> </w:t>
+      </w:r>
+      <w:r>
+        <w:rPr>
+          <w:rFonts w:ascii="Times New Roman" w:eastAsiaTheme="minorEastAsia" w:hAnsi="Times New Roman" w:cs="Times New Roman"/>
+          <w:sz w:val="32"/>
+          <w:szCs w:val="32"/>
+          <w:lang w:bidi="he-IL"/>
+        </w:rPr>
+        <w:t>Fine-tuning</w:t>
+      </w:r>
+      <w:r>
+        <w:rPr>
+          <w:rFonts w:ascii="Times New Roman" w:eastAsiaTheme="minorEastAsia" w:hAnsi="Times New Roman" w:cs="Times New Roman"/>
+          <w:sz w:val="32"/>
+          <w:szCs w:val="32"/>
+          <w:rtl/>
+          <w:lang w:bidi="he-IL"/>
+        </w:rPr>
+        <w:t>כדי לאפשר לאופטימייזר להתייצב מבלי לגרום לקריסה בביצועים על דאטה חדש</w:t>
+      </w:r>
+      <w:r>
+        <w:rPr>
+          <w:rFonts w:ascii="Times New Roman" w:eastAsiaTheme="minorEastAsia" w:hAnsi="Times New Roman" w:cs="Times New Roman"/>
+          <w:sz w:val="32"/>
+          <w:szCs w:val="32"/>
+          <w:lang w:bidi="he-IL"/>
+        </w:rPr>
+        <w:t>.</w:t>
+      </w:r>
+    </w:p>
+    <w:p>
+      <w:pPr>
+        <w:pStyle w:val="ListParagraph"/>
+        <w:numPr>
+          <w:ilvl w:val="0"/>
+          <w:numId w:val="40"/>
+        </w:numPr>
+        <w:bidi/>
+        <w:rPr>
+          <w:rFonts w:ascii="Times New Roman" w:eastAsiaTheme="minorEastAsia" w:hAnsi="Times New Roman" w:cs="Times New Roman"/>
+          <w:sz w:val="32"/>
+          <w:szCs w:val="32"/>
+          <w:lang w:bidi="he-IL"/>
+        </w:rPr>
+      </w:pPr>
+      <w:proofErr w:type="spellStart"/>
+      <w:r>
+        <w:rPr>
+          <w:rFonts w:ascii="Times New Roman" w:eastAsiaTheme="minorEastAsia" w:hAnsi="Times New Roman" w:cs="Times New Roman"/>
+          <w:b/>
+          <w:bCs/>
+          <w:sz w:val="32"/>
+          <w:szCs w:val="32"/>
+          <w:lang w:bidi="he-IL"/>
+        </w:rPr>
+        <w:t>p</w:t>
+      </w:r>
+      <w:r>
+        <w:rPr>
+          <w:rFonts w:ascii="Times New Roman" w:eastAsiaTheme="minorEastAsia" w:hAnsi="Times New Roman" w:cs="Times New Roman"/>
+          <w:b/>
+          <w:bCs/>
+          <w:sz w:val="32"/>
+          <w:szCs w:val="32"/>
+          <w:lang w:bidi="he-IL"/>
+        </w:rPr>
+        <w:t>er_device_train_batch_size</w:t>
+      </w:r>
+      <w:proofErr w:type="spellEnd"/>
+      <w:r>
+        <w:rPr>
+          <w:rFonts w:ascii="Times New Roman" w:eastAsiaTheme="minorEastAsia" w:hAnsi="Times New Roman" w:cs="Times New Roman"/>
+          <w:b/>
+          <w:bCs/>
+          <w:sz w:val="32"/>
+          <w:szCs w:val="32"/>
+          <w:lang w:bidi="he-IL"/>
+        </w:rPr>
+        <w:t xml:space="preserve"> = 4</w:t>
+      </w:r>
+      <w:r>
+        <w:rPr>
+          <w:rFonts w:ascii="Times New Roman" w:eastAsiaTheme="minorEastAsia" w:hAnsi="Times New Roman" w:cs="Times New Roman" w:hint="cs"/>
+          <w:b/>
+          <w:bCs/>
+          <w:sz w:val="32"/>
+          <w:szCs w:val="32"/>
+          <w:rtl/>
+          <w:lang w:bidi="he-IL"/>
+        </w:rPr>
+        <w:t>:</w:t>
+      </w:r>
+      <w:r>
+        <w:rPr>
+          <w:rFonts w:ascii="Times New Roman" w:eastAsiaTheme="minorEastAsia" w:hAnsi="Times New Roman" w:cs="Times New Roman"/>
+          <w:b/>
+          <w:bCs/>
+          <w:sz w:val="32"/>
+          <w:szCs w:val="32"/>
+          <w:rtl/>
+          <w:lang w:bidi="he-IL"/>
+        </w:rPr>
+        <w:br/>
+      </w:r>
+      <w:r>
+        <w:rPr>
+          <w:rFonts w:ascii="Times New Roman" w:eastAsiaTheme="minorEastAsia" w:hAnsi="Times New Roman" w:cs="Times New Roman"/>
+          <w:sz w:val="32"/>
+          <w:szCs w:val="32"/>
+          <w:rtl/>
+          <w:lang w:bidi="he-IL"/>
+        </w:rPr>
+        <w:t>הבחירה ב</w:t>
+      </w:r>
+      <w:r>
+        <w:rPr>
+          <w:rFonts w:ascii="Times New Roman" w:eastAsiaTheme="minorEastAsia" w:hAnsi="Times New Roman" w:cs="Times New Roman"/>
+          <w:sz w:val="32"/>
+          <w:szCs w:val="32"/>
+          <w:lang w:bidi="he-IL"/>
+        </w:rPr>
+        <w:t xml:space="preserve">-Batch Size </w:t>
+      </w:r>
+      <w:r>
+        <w:rPr>
+          <w:rFonts w:ascii="Times New Roman" w:eastAsiaTheme="minorEastAsia" w:hAnsi="Times New Roman" w:cs="Times New Roman"/>
+          <w:sz w:val="32"/>
+          <w:szCs w:val="32"/>
+          <w:rtl/>
+          <w:lang w:bidi="he-IL"/>
+        </w:rPr>
+        <w:t>קטן אינה נובעת רק ממגבלות זיכרון, אלא משמשת ככלי רגולריזציה</w:t>
+      </w:r>
+      <w:r>
+        <w:rPr>
+          <w:rFonts w:ascii="Times New Roman" w:eastAsiaTheme="minorEastAsia" w:hAnsi="Times New Roman" w:cs="Times New Roman"/>
+          <w:sz w:val="32"/>
+          <w:szCs w:val="32"/>
+          <w:lang w:bidi="he-IL"/>
+        </w:rPr>
+        <w:t>.</w:t>
+      </w:r>
+      <w:r>
+        <w:rPr>
+          <w:rFonts w:ascii="Times New Roman" w:eastAsiaTheme="minorEastAsia" w:hAnsi="Times New Roman" w:cs="Times New Roman" w:hint="cs"/>
+          <w:sz w:val="32"/>
+          <w:szCs w:val="32"/>
+          <w:rtl/>
+          <w:lang w:bidi="he-IL"/>
+        </w:rPr>
+        <w:t xml:space="preserve"> </w:t>
+      </w:r>
+      <w:r>
+        <w:rPr>
+          <w:rFonts w:ascii="Times New Roman" w:eastAsiaTheme="minorEastAsia" w:hAnsi="Times New Roman" w:cs="Times New Roman"/>
+          <w:sz w:val="32"/>
+          <w:szCs w:val="32"/>
+          <w:lang w:bidi="he-IL"/>
+        </w:rPr>
+        <w:t>Batch</w:t>
+      </w:r>
+      <w:r>
+        <w:rPr>
+          <w:rFonts w:ascii="Times New Roman" w:eastAsiaTheme="minorEastAsia" w:hAnsi="Times New Roman" w:cs="Times New Roman"/>
+          <w:sz w:val="32"/>
+          <w:szCs w:val="32"/>
+          <w:rtl/>
+          <w:lang w:bidi="he-IL"/>
+        </w:rPr>
+        <w:t xml:space="preserve"> קט</w:t>
+      </w:r>
+      <w:r>
+        <w:rPr>
+          <w:rFonts w:ascii="Times New Roman" w:eastAsiaTheme="minorEastAsia" w:hAnsi="Times New Roman" w:cs="Times New Roman" w:hint="cs"/>
+          <w:sz w:val="32"/>
+          <w:szCs w:val="32"/>
+          <w:rtl/>
+          <w:lang w:bidi="he-IL"/>
+        </w:rPr>
+        <w:t>ן</w:t>
+      </w:r>
+      <w:r>
+        <w:rPr>
+          <w:rFonts w:ascii="Times New Roman" w:eastAsiaTheme="minorEastAsia" w:hAnsi="Times New Roman" w:cs="Times New Roman"/>
+          <w:sz w:val="32"/>
+          <w:szCs w:val="32"/>
+          <w:rtl/>
+          <w:lang w:bidi="he-IL"/>
+        </w:rPr>
+        <w:t xml:space="preserve"> </w:t>
+      </w:r>
+      <w:r>
+        <w:rPr>
+          <w:rFonts w:ascii="Times New Roman" w:eastAsiaTheme="minorEastAsia" w:hAnsi="Times New Roman" w:cs="Times New Roman" w:hint="cs"/>
+          <w:sz w:val="32"/>
+          <w:szCs w:val="32"/>
+          <w:rtl/>
+          <w:lang w:bidi="he-IL"/>
+        </w:rPr>
+        <w:t xml:space="preserve">מייצר </w:t>
+      </w:r>
+      <w:r>
+        <w:rPr>
+          <w:rFonts w:ascii="Times New Roman" w:eastAsiaTheme="minorEastAsia" w:hAnsi="Times New Roman" w:cs="Times New Roman"/>
+          <w:sz w:val="32"/>
+          <w:szCs w:val="32"/>
+          <w:lang w:bidi="he-IL"/>
+        </w:rPr>
+        <w:t xml:space="preserve"> Noisy</w:t>
+      </w:r>
+      <w:r>
+        <w:rPr>
+          <w:rFonts w:ascii="Times New Roman" w:eastAsiaTheme="minorEastAsia" w:hAnsi="Times New Roman" w:cs="Times New Roman"/>
+          <w:sz w:val="32"/>
+          <w:szCs w:val="32"/>
+          <w:lang w:bidi="he-IL"/>
+        </w:rPr>
+        <w:t xml:space="preserve"> Gradient </w:t>
+      </w:r>
+      <w:r>
+        <w:rPr>
+          <w:rFonts w:ascii="Times New Roman" w:eastAsiaTheme="minorEastAsia" w:hAnsi="Times New Roman" w:cs="Times New Roman"/>
+          <w:sz w:val="32"/>
+          <w:szCs w:val="32"/>
+          <w:rtl/>
+          <w:lang w:bidi="he-IL"/>
+        </w:rPr>
+        <w:t>אשר מונע מהמודל להתכנ</w:t>
+      </w:r>
+      <w:r>
+        <w:rPr>
+          <w:rFonts w:ascii="Times New Roman" w:eastAsiaTheme="minorEastAsia" w:hAnsi="Times New Roman" w:cs="Times New Roman" w:hint="cs"/>
+          <w:sz w:val="32"/>
+          <w:szCs w:val="32"/>
+          <w:rtl/>
+          <w:lang w:bidi="he-IL"/>
+        </w:rPr>
+        <w:t xml:space="preserve">ס </w:t>
+      </w:r>
+      <w:r>
+        <w:rPr>
+          <w:rFonts w:ascii="Times New Roman" w:eastAsiaTheme="minorEastAsia" w:hAnsi="Times New Roman" w:cs="Times New Roman" w:hint="cs"/>
+          <w:sz w:val="32"/>
+          <w:szCs w:val="32"/>
+          <w:rtl/>
+          <w:lang w:bidi="he-IL"/>
+        </w:rPr>
+        <w:lastRenderedPageBreak/>
+        <w:t>ל</w:t>
+      </w:r>
+      <w:r>
+        <w:rPr>
+          <w:rFonts w:ascii="Times New Roman" w:eastAsiaTheme="minorEastAsia" w:hAnsi="Times New Roman" w:cs="Times New Roman"/>
+          <w:sz w:val="32"/>
+          <w:szCs w:val="32"/>
+          <w:lang w:bidi="he-IL"/>
+        </w:rPr>
+        <w:t xml:space="preserve"> </w:t>
+      </w:r>
+      <w:r>
+        <w:rPr>
+          <w:rFonts w:ascii="Times New Roman" w:eastAsiaTheme="minorEastAsia" w:hAnsi="Times New Roman" w:cs="Times New Roman"/>
+          <w:sz w:val="32"/>
+          <w:szCs w:val="32"/>
+          <w:lang w:bidi="he-IL"/>
+        </w:rPr>
+        <w:t>Sharp Minimum</w:t>
+      </w:r>
+      <w:r>
+        <w:rPr>
+          <w:rFonts w:ascii="Times New Roman" w:eastAsiaTheme="minorEastAsia" w:hAnsi="Times New Roman" w:cs="Times New Roman"/>
+          <w:sz w:val="32"/>
+          <w:szCs w:val="32"/>
+          <w:lang w:bidi="he-IL"/>
+        </w:rPr>
+        <w:t xml:space="preserve"> </w:t>
+      </w:r>
+      <w:r>
+        <w:rPr>
+          <w:rFonts w:ascii="Times New Roman" w:eastAsiaTheme="minorEastAsia" w:hAnsi="Times New Roman" w:cs="Times New Roman"/>
+          <w:sz w:val="32"/>
+          <w:szCs w:val="32"/>
+          <w:lang w:bidi="he-IL"/>
+        </w:rPr>
+        <w:t xml:space="preserve"> </w:t>
+      </w:r>
+      <w:r>
+        <w:rPr>
+          <w:rFonts w:ascii="Times New Roman" w:eastAsiaTheme="minorEastAsia" w:hAnsi="Times New Roman" w:cs="Times New Roman"/>
+          <w:sz w:val="32"/>
+          <w:szCs w:val="32"/>
+          <w:rtl/>
+          <w:lang w:bidi="he-IL"/>
+        </w:rPr>
+        <w:t>שבו</w:t>
+      </w:r>
+      <w:r>
+        <w:rPr>
+          <w:rFonts w:ascii="Times New Roman" w:eastAsiaTheme="minorEastAsia" w:hAnsi="Times New Roman" w:cs="Times New Roman"/>
+          <w:sz w:val="32"/>
+          <w:szCs w:val="32"/>
+          <w:rtl/>
+          <w:lang w:bidi="he-IL"/>
+        </w:rPr>
+        <w:t xml:space="preserve"> ההכללה </w:t>
+      </w:r>
+      <w:r>
+        <w:rPr>
+          <w:rFonts w:ascii="Times New Roman" w:eastAsiaTheme="minorEastAsia" w:hAnsi="Times New Roman" w:cs="Times New Roman" w:hint="cs"/>
+          <w:sz w:val="32"/>
+          <w:szCs w:val="32"/>
+          <w:rtl/>
+          <w:lang w:bidi="he-IL"/>
+        </w:rPr>
+        <w:t xml:space="preserve">היא </w:t>
+      </w:r>
+      <w:r>
+        <w:rPr>
+          <w:rFonts w:ascii="Times New Roman" w:eastAsiaTheme="minorEastAsia" w:hAnsi="Times New Roman" w:cs="Times New Roman"/>
+          <w:sz w:val="32"/>
+          <w:szCs w:val="32"/>
+          <w:rtl/>
+          <w:lang w:bidi="he-IL"/>
+        </w:rPr>
+        <w:t>גרועה</w:t>
+      </w:r>
+      <w:r>
+        <w:rPr>
+          <w:rFonts w:ascii="Times New Roman" w:eastAsiaTheme="minorEastAsia" w:hAnsi="Times New Roman" w:cs="Times New Roman"/>
+          <w:sz w:val="32"/>
+          <w:szCs w:val="32"/>
+          <w:lang w:bidi="he-IL"/>
+        </w:rPr>
+        <w:t xml:space="preserve">. </w:t>
+      </w:r>
+      <w:r>
+        <w:rPr>
+          <w:rFonts w:ascii="Times New Roman" w:eastAsiaTheme="minorEastAsia" w:hAnsi="Times New Roman" w:cs="Times New Roman"/>
+          <w:sz w:val="32"/>
+          <w:szCs w:val="32"/>
+          <w:rtl/>
+          <w:lang w:bidi="he-IL"/>
+        </w:rPr>
+        <w:t>הרעש דוחף את המודל למינימום "שטוח" ורובסטי יותר</w:t>
+      </w:r>
+      <w:r>
+        <w:rPr>
+          <w:rFonts w:ascii="Times New Roman" w:eastAsiaTheme="minorEastAsia" w:hAnsi="Times New Roman" w:cs="Times New Roman"/>
+          <w:sz w:val="32"/>
+          <w:szCs w:val="32"/>
+          <w:lang w:bidi="he-IL"/>
+        </w:rPr>
+        <w:t xml:space="preserve">. </w:t>
+      </w:r>
+      <w:r>
+        <w:rPr>
+          <w:rFonts w:ascii="Times New Roman" w:eastAsiaTheme="minorEastAsia" w:hAnsi="Times New Roman" w:cs="Times New Roman"/>
+          <w:sz w:val="32"/>
+          <w:szCs w:val="32"/>
+          <w:rtl/>
+          <w:lang w:bidi="he-IL"/>
+        </w:rPr>
+        <w:t xml:space="preserve">בנוסף, גודל זה מאפשר מספר סביר של צעדי עדכוןבתוך כל </w:t>
+      </w:r>
+      <w:r>
+        <w:rPr>
+          <w:rFonts w:ascii="Times New Roman" w:eastAsiaTheme="minorEastAsia" w:hAnsi="Times New Roman" w:cs="Times New Roman"/>
+          <w:sz w:val="32"/>
+          <w:szCs w:val="32"/>
+          <w:lang w:bidi="he-IL"/>
+        </w:rPr>
+        <w:t>Epoch</w:t>
+      </w:r>
+      <w:r>
+        <w:rPr>
+          <w:rFonts w:ascii="Times New Roman" w:eastAsiaTheme="minorEastAsia" w:hAnsi="Times New Roman" w:cs="Times New Roman"/>
+          <w:sz w:val="32"/>
+          <w:szCs w:val="32"/>
+          <w:rtl/>
+          <w:lang w:bidi="he-IL"/>
+        </w:rPr>
+        <w:t>, בניגוד ל</w:t>
+      </w:r>
+      <w:r>
+        <w:rPr>
+          <w:rFonts w:ascii="Times New Roman" w:eastAsiaTheme="minorEastAsia" w:hAnsi="Times New Roman" w:cs="Times New Roman"/>
+          <w:sz w:val="32"/>
+          <w:szCs w:val="32"/>
+          <w:lang w:bidi="he-IL"/>
+        </w:rPr>
+        <w:t xml:space="preserve"> </w:t>
+      </w:r>
+      <w:r>
+        <w:rPr>
+          <w:rFonts w:ascii="Times New Roman" w:eastAsiaTheme="minorEastAsia" w:hAnsi="Times New Roman" w:cs="Times New Roman"/>
+          <w:sz w:val="32"/>
+          <w:szCs w:val="32"/>
+          <w:lang w:bidi="he-IL"/>
+        </w:rPr>
+        <w:t xml:space="preserve">Batch </w:t>
+      </w:r>
+      <w:r>
+        <w:rPr>
+          <w:rFonts w:ascii="Times New Roman" w:eastAsiaTheme="minorEastAsia" w:hAnsi="Times New Roman" w:cs="Times New Roman"/>
+          <w:sz w:val="32"/>
+          <w:szCs w:val="32"/>
+          <w:rtl/>
+          <w:lang w:bidi="he-IL"/>
+        </w:rPr>
+        <w:t>גדול שהיה מצמצם את האימון למספר צעדים בודדים</w:t>
+      </w:r>
+      <w:r>
+        <w:rPr>
+          <w:rFonts w:ascii="Times New Roman" w:eastAsiaTheme="minorEastAsia" w:hAnsi="Times New Roman" w:cs="Times New Roman"/>
+          <w:sz w:val="32"/>
+          <w:szCs w:val="32"/>
+          <w:lang w:bidi="he-IL"/>
+        </w:rPr>
+        <w:t>.</w:t>
+      </w:r>
+    </w:p>
+    <w:p>
+      <w:pPr>
+        <w:pStyle w:val="ListParagraph"/>
+        <w:numPr>
+          <w:ilvl w:val="0"/>
+          <w:numId w:val="40"/>
+        </w:numPr>
+        <w:bidi/>
+        <w:rPr>
+          <w:rFonts w:ascii="Times New Roman" w:eastAsiaTheme="minorEastAsia" w:hAnsi="Times New Roman" w:cs="Times New Roman"/>
+          <w:b/>
+          <w:bCs/>
+          <w:sz w:val="32"/>
+          <w:szCs w:val="32"/>
+          <w:lang w:bidi="he-IL"/>
+        </w:rPr>
+      </w:pPr>
+    </w:p>
+    <w:p>
+      <w:pPr>
+        <w:tabs>
+          <w:tab w:val="left" w:pos="1236"/>
+        </w:tabs>
+        <w:bidi/>
+        <w:rPr>
+          <w:rFonts w:ascii="Times New Roman" w:eastAsiaTheme="minorEastAsia" w:hAnsi="Times New Roman" w:cs="Times New Roman"/>
+          <w:b/>
+          <w:bCs/>
+          <w:sz w:val="32"/>
+          <w:szCs w:val="32"/>
+          <w:rtl/>
+          <w:lang w:bidi="he-IL"/>
+        </w:rPr>
+      </w:pPr>
+      <w:r>
+        <w:rPr>
+          <w:rFonts w:ascii="Times New Roman" w:eastAsiaTheme="minorEastAsia" w:hAnsi="Times New Roman" w:cs="Times New Roman" w:hint="cs"/>
+          <w:sz w:val="32"/>
+          <w:szCs w:val="32"/>
+          <w:rtl/>
+          <w:lang w:bidi="he-IL"/>
+        </w:rPr>
+        <w:t xml:space="preserve">      </w:t>
+      </w:r>
+    </w:p>
+    <w:p>
+      <w:pPr>
+        <w:bidi/>
+        <w:rPr>
+          <w:rFonts w:ascii="Times New Roman" w:eastAsiaTheme="minorEastAsia" w:hAnsi="Times New Roman" w:cs="Times New Roman"/>
+          <w:sz w:val="32"/>
+          <w:szCs w:val="32"/>
+          <w:rtl/>
+          <w:lang w:bidi="he-IL"/>
+        </w:rPr>
+      </w:pPr>
+      <w:r>
+        <w:rPr>
+          <w:rFonts w:ascii="Times New Roman" w:eastAsiaTheme="minorEastAsia" w:hAnsi="Times New Roman" w:cs="Times New Roman"/>
+          <w:sz w:val="32"/>
+          <w:szCs w:val="32"/>
+          <w:rtl/>
+          <w:lang w:bidi="he-IL"/>
+        </w:rPr>
+        <w:drawing>
+          <wp:inline distT="0" distB="0" distL="0" distR="0" wp14:anchorId="772EE83C" wp14:editId="40F7C906">
+            <wp:extent cx="3345470" cy="228620"/>
+            <wp:effectExtent l="133350" t="76200" r="64770" b="133350"/>
+            <wp:docPr id="2058320933" name="Picture 1"/>
+            <wp:cNvGraphicFramePr>
+              <a:graphicFrameLocks xmlns:a="http://schemas.openxmlformats.org/drawingml/2006/main" noChangeAspect="1"/>
+            </wp:cNvGraphicFramePr>
+            <a:graphic xmlns:a="http://schemas.openxmlformats.org/drawingml/2006/main">
+              <a:graphicData uri="http://schemas.openxmlformats.org/drawingml/2006/picture">
+                <pic:pic xmlns:pic="http://schemas.openxmlformats.org/drawingml/2006/picture">
+                  <pic:nvPicPr>
+                    <pic:cNvPr id="2058320933" name=""/>
+                    <pic:cNvPicPr/>
+                  </pic:nvPicPr>
+                  <pic:blipFill>
+                    <a:blip r:embed="rId24"/>
+                    <a:stretch>
+                      <a:fillRect/>
+                    </a:stretch>
+                  </pic:blipFill>
+                  <pic:spPr>
+                    <a:xfrm>
+                      <a:off x="0" y="0"/>
+                      <a:ext cx="3345470" cy="228620"/>
+                    </a:xfrm>
+                    <a:prstGeom prst="roundRect">
+                      <a:avLst>
+                        <a:gd name="adj" fmla="val 16667"/>
+                      </a:avLst>
+                    </a:prstGeom>
+                    <a:ln>
+                      <a:noFill/>
+                    </a:ln>
+                    <a:effectLst>
+                      <a:outerShdw blurRad="76200" dist="38100" dir="7800000" algn="tl" rotWithShape="0">
+                        <a:srgbClr val="000000">
+                          <a:alpha val="40000"/>
+                        </a:srgbClr>
+                      </a:outerShdw>
+                    </a:effectLst>
+                    <a:scene3d>
+                      <a:camera prst="orthographicFront"/>
+                      <a:lightRig rig="contrasting" dir="t">
+                        <a:rot lat="0" lon="0" rev="4200000"/>
+                      </a:lightRig>
+                    </a:scene3d>
+                    <a:sp3d prstMaterial="plastic">
+                      <a:bevelT w="381000" h="114300" prst="relaxedInset"/>
+                      <a:contourClr>
+                        <a:srgbClr val="969696"/>
+                      </a:contourClr>
+                    </a:sp3d>
+                  </pic:spPr>
+                </pic:pic>
+              </a:graphicData>
+            </a:graphic>
+          </wp:inline>
+        </w:drawing>
+      </w:r>
+      <w:r>
+        <w:rPr>
+          <w:rFonts w:ascii="Times New Roman" w:eastAsiaTheme="minorEastAsia" w:hAnsi="Times New Roman" w:cs="Times New Roman"/>
+          <w:sz w:val="32"/>
+          <w:szCs w:val="32"/>
+          <w:rtl/>
+          <w:lang w:bidi="he-IL"/>
+        </w:rPr>
+        <w:br/>
+      </w:r>
+      <w:r>
+        <w:rPr>
+          <w:rFonts w:ascii="Times New Roman" w:eastAsiaTheme="minorEastAsia" w:hAnsi="Times New Roman" w:cs="Times New Roman" w:hint="cs"/>
+          <w:sz w:val="32"/>
+          <w:szCs w:val="32"/>
+          <w:rtl/>
+          <w:lang w:bidi="he-IL"/>
+        </w:rPr>
+        <w:t>הפרמטרים שנבחרו:</w:t>
+      </w:r>
+    </w:p>
+    <w:p>
+      <w:pPr>
+        <w:bidi/>
+        <w:rPr>
+          <w:rFonts w:ascii="Times New Roman" w:eastAsiaTheme="minorEastAsia" w:hAnsi="Times New Roman" w:cs="Times New Roman"/>
+          <w:sz w:val="32"/>
+          <w:szCs w:val="32"/>
+          <w:rtl/>
+          <w:lang w:bidi="he-IL"/>
+        </w:rPr>
+      </w:pPr>
+      <w:r>
+        <w:rPr>
+          <w:rFonts w:ascii="Times New Roman" w:eastAsiaTheme="minorEastAsia" w:hAnsi="Times New Roman" w:cs="Times New Roman"/>
+          <w:sz w:val="32"/>
+          <w:szCs w:val="32"/>
+          <w:rtl/>
+          <w:lang w:bidi="he-IL"/>
+        </w:rPr>
+        <w:drawing>
+          <wp:anchor distT="0" distB="0" distL="114300" distR="114300" simplePos="0" relativeHeight="251666432" behindDoc="1" locked="0" layoutInCell="1" allowOverlap="1" wp14:anchorId="110CFE08" wp14:editId="23221A8D">
+            <wp:simplePos x="0" y="0"/>
+            <wp:positionH relativeFrom="margin">
+              <wp:posOffset>2270760</wp:posOffset>
+            </wp:positionH>
+            <wp:positionV relativeFrom="paragraph">
+              <wp:posOffset>1270</wp:posOffset>
+            </wp:positionV>
+            <wp:extent cx="2941320" cy="1771015"/>
+            <wp:effectExtent l="0" t="0" r="0" b="635"/>
+            <wp:wrapTight wrapText="bothSides">
+              <wp:wrapPolygon edited="0">
+                <wp:start x="0" y="0"/>
+                <wp:lineTo x="0" y="21375"/>
+                <wp:lineTo x="21404" y="21375"/>
+                <wp:lineTo x="21404" y="0"/>
+                <wp:lineTo x="0" y="0"/>
+              </wp:wrapPolygon>
+            </wp:wrapTight>
+            <wp:docPr id="1414756067" name="Picture 1"/>
+            <wp:cNvGraphicFramePr>
+              <a:graphicFrameLocks xmlns:a="http://schemas.openxmlformats.org/drawingml/2006/main" noChangeAspect="1"/>
+            </wp:cNvGraphicFramePr>
+            <a:graphic xmlns:a="http://schemas.openxmlformats.org/drawingml/2006/main">
+              <a:graphicData uri="http://schemas.openxmlformats.org/drawingml/2006/picture">
+                <pic:pic xmlns:pic="http://schemas.openxmlformats.org/drawingml/2006/picture">
+                  <pic:nvPicPr>
+                    <pic:cNvPr id="1414756067" name=""/>
+                    <pic:cNvPicPr/>
+                  </pic:nvPicPr>
+                  <pic:blipFill>
+                    <a:blip r:embed="rId25">
+                      <a:extLst>
+                        <a:ext uri="{28A0092B-C50C-407E-A947-70E740481C1C}">
+                          <a14:useLocalDpi xmlns:a14="http://schemas.microsoft.com/office/drawing/2010/main" val="0"/>
+                        </a:ext>
+                      </a:extLst>
+                    </a:blip>
+                    <a:stretch>
+                      <a:fillRect/>
+                    </a:stretch>
+                  </pic:blipFill>
+                  <pic:spPr>
+                    <a:xfrm>
+                      <a:off x="0" y="0"/>
+                      <a:ext cx="2941320" cy="1771015"/>
+                    </a:xfrm>
+                    <a:prstGeom prst="rect">
+                      <a:avLst/>
+                    </a:prstGeom>
+                  </pic:spPr>
+                </pic:pic>
+              </a:graphicData>
+            </a:graphic>
+            <wp14:sizeRelH relativeFrom="margin">
+              <wp14:pctWidth>0</wp14:pctWidth>
+            </wp14:sizeRelH>
+            <wp14:sizeRelV relativeFrom="margin">
+              <wp14:pctHeight>0</wp14:pctHeight>
+            </wp14:sizeRelV>
+          </wp:anchor>
+        </w:drawing>
+      </w:r>
+    </w:p>
+    <w:p>
+      <w:pPr>
+        <w:bidi/>
+        <w:rPr>
+          <w:rFonts w:ascii="Times New Roman" w:eastAsiaTheme="minorEastAsia" w:hAnsi="Times New Roman" w:cs="Times New Roman"/>
+          <w:sz w:val="32"/>
+          <w:szCs w:val="32"/>
+          <w:rtl/>
+          <w:lang w:bidi="he-IL"/>
+        </w:rPr>
+      </w:pPr>
+    </w:p>
+    <w:p>
+      <w:pPr>
+        <w:bidi/>
+        <w:rPr>
+          <w:rFonts w:ascii="Times New Roman" w:eastAsiaTheme="minorEastAsia" w:hAnsi="Times New Roman" w:cs="Times New Roman"/>
+          <w:sz w:val="32"/>
+          <w:szCs w:val="32"/>
+          <w:rtl/>
+          <w:lang w:bidi="he-IL"/>
+        </w:rPr>
+      </w:pPr>
+    </w:p>
+    <w:p>
+      <w:pPr>
+        <w:bidi/>
+        <w:rPr>
+          <w:rFonts w:ascii="Times New Roman" w:eastAsiaTheme="minorEastAsia" w:hAnsi="Times New Roman" w:cs="Times New Roman"/>
+          <w:sz w:val="32"/>
+          <w:szCs w:val="32"/>
+          <w:rtl/>
+          <w:lang w:bidi="he-IL"/>
+        </w:rPr>
+      </w:pPr>
+      <w:r>
+        <w:rPr>
+          <w:rFonts w:ascii="Times New Roman" w:eastAsiaTheme="minorEastAsia" w:hAnsi="Times New Roman" w:cs="Times New Roman"/>
+          <w:sz w:val="32"/>
+          <w:szCs w:val="32"/>
+          <w:rtl/>
+          <w:lang w:bidi="he-IL"/>
+        </w:rPr>
+        <w:br/>
+      </w:r>
+      <w:r>
+        <w:rPr>
+          <w:rFonts w:ascii="Times New Roman" w:eastAsiaTheme="minorEastAsia" w:hAnsi="Times New Roman" w:cs="Times New Roman"/>
+          <w:sz w:val="32"/>
+          <w:szCs w:val="32"/>
+          <w:rtl/>
+          <w:lang w:bidi="he-IL"/>
+        </w:rPr>
+        <w:br/>
+      </w:r>
+      <w:r>
+        <w:rPr>
+          <w:rFonts w:ascii="Times New Roman" w:eastAsiaTheme="minorEastAsia" w:hAnsi="Times New Roman" w:cs="Times New Roman"/>
+          <w:sz w:val="32"/>
+          <w:szCs w:val="32"/>
+          <w:rtl/>
+          <w:lang w:bidi="he-IL"/>
+        </w:rPr>
+        <w:br/>
+      </w:r>
+      <w:r>
+        <w:rPr>
+          <w:rFonts w:ascii="Times New Roman" w:eastAsiaTheme="minorEastAsia" w:hAnsi="Times New Roman" w:cs="Times New Roman"/>
+          <w:sz w:val="32"/>
+          <w:szCs w:val="32"/>
+          <w:rtl/>
+          <w:lang w:bidi="he-IL"/>
+        </w:rPr>
+        <w:br/>
+      </w:r>
+    </w:p>
+    <w:p>
+      <w:pPr>
+        <w:bidi/>
+        <w:rPr>
+          <w:rFonts w:ascii="Times New Roman" w:eastAsiaTheme="minorEastAsia" w:hAnsi="Times New Roman" w:cs="Times New Roman"/>
+          <w:sz w:val="32"/>
+          <w:szCs w:val="32"/>
+          <w:rtl/>
+          <w:lang w:bidi="he-IL"/>
+        </w:rPr>
+      </w:pPr>
+      <w:r>
+        <w:rPr>
+          <w:rFonts w:ascii="Times New Roman" w:eastAsiaTheme="minorEastAsia" w:hAnsi="Times New Roman" w:cs="Times New Roman" w:hint="cs"/>
+          <w:sz w:val="32"/>
+          <w:szCs w:val="32"/>
+          <w:rtl/>
+          <w:lang w:bidi="he-IL"/>
+        </w:rPr>
+        <w:t>תשובה:</w:t>
+      </w:r>
+      <w:r>
+        <w:rPr>
+          <w:rFonts w:ascii="Times New Roman" w:eastAsiaTheme="minorEastAsia" w:hAnsi="Times New Roman" w:cs="Times New Roman"/>
+          <w:sz w:val="32"/>
+          <w:szCs w:val="32"/>
+          <w:rtl/>
+          <w:lang w:bidi="he-IL"/>
+        </w:rPr>
+        <w:br/>
+      </w:r>
+    </w:p>
+    <w:p>
+      <w:pPr>
+        <w:bidi/>
+        <w:rPr>
+          <w:rFonts w:ascii="Times New Roman" w:eastAsiaTheme="minorEastAsia" w:hAnsi="Times New Roman" w:cs="Times New Roman"/>
+          <w:sz w:val="32"/>
+          <w:szCs w:val="32"/>
+          <w:rtl/>
+          <w:lang w:bidi="he-IL"/>
+        </w:rPr>
+      </w:pPr>
+    </w:p>
+    <w:p>
+      <w:pPr>
+        <w:bidi/>
+        <w:rPr>
+          <w:rFonts w:ascii="Times New Roman" w:eastAsiaTheme="minorEastAsia" w:hAnsi="Times New Roman" w:cs="Times New Roman"/>
+          <w:sz w:val="32"/>
+          <w:szCs w:val="32"/>
+          <w:rtl/>
+          <w:lang w:bidi="he-IL"/>
+        </w:rPr>
+      </w:pPr>
+      <w:r>
+        <w:rPr>
+          <w:rFonts w:ascii="Times New Roman" w:eastAsiaTheme="minorEastAsia" w:hAnsi="Times New Roman" w:cs="Times New Roman"/>
+          <w:sz w:val="32"/>
+          <w:szCs w:val="32"/>
+          <w:rtl/>
+          <w:lang w:bidi="he-IL"/>
+        </w:rPr>
+        <w:drawing>
+          <wp:anchor distT="0" distB="0" distL="114300" distR="114300" simplePos="0" relativeHeight="251667456" behindDoc="1" locked="0" layoutInCell="1" allowOverlap="1" wp14:anchorId="000D66F0" wp14:editId="392755CF">
+            <wp:simplePos x="0" y="0"/>
+            <wp:positionH relativeFrom="column">
+              <wp:posOffset>2647950</wp:posOffset>
+            </wp:positionH>
+            <wp:positionV relativeFrom="paragraph">
+              <wp:posOffset>74295</wp:posOffset>
+            </wp:positionV>
+            <wp:extent cx="3269263" cy="198137"/>
+            <wp:effectExtent l="133350" t="76200" r="26670" b="125730"/>
+            <wp:wrapTight wrapText="bothSides">
+              <wp:wrapPolygon edited="0">
+                <wp:start x="-378" y="-8308"/>
+                <wp:lineTo x="-881" y="-4154"/>
+                <wp:lineTo x="-881" y="20769"/>
+                <wp:lineTo x="-503" y="33231"/>
+                <wp:lineTo x="21650" y="33231"/>
+                <wp:lineTo x="21650" y="29077"/>
+                <wp:lineTo x="21524" y="-2077"/>
+                <wp:lineTo x="21524" y="-8308"/>
+                <wp:lineTo x="-378" y="-8308"/>
+              </wp:wrapPolygon>
+            </wp:wrapTight>
+            <wp:docPr id="965321347" name="Picture 1"/>
+            <wp:cNvGraphicFramePr>
+              <a:graphicFrameLocks xmlns:a="http://schemas.openxmlformats.org/drawingml/2006/main" noChangeAspect="1"/>
+            </wp:cNvGraphicFramePr>
+            <a:graphic xmlns:a="http://schemas.openxmlformats.org/drawingml/2006/main">
+              <a:graphicData uri="http://schemas.openxmlformats.org/drawingml/2006/picture">
+                <pic:pic xmlns:pic="http://schemas.openxmlformats.org/drawingml/2006/picture">
+                  <pic:nvPicPr>
+                    <pic:cNvPr id="965321347" name=""/>
+                    <pic:cNvPicPr/>
+                  </pic:nvPicPr>
+                  <pic:blipFill>
+                    <a:blip r:embed="rId26">
+                      <a:extLst>
+                        <a:ext uri="{28A0092B-C50C-407E-A947-70E740481C1C}">
+                          <a14:useLocalDpi xmlns:a14="http://schemas.microsoft.com/office/drawing/2010/main" val="0"/>
+                        </a:ext>
+                      </a:extLst>
+                    </a:blip>
+                    <a:stretch>
+                      <a:fillRect/>
+                    </a:stretch>
+                  </pic:blipFill>
+                  <pic:spPr>
+                    <a:xfrm>
+                      <a:off x="0" y="0"/>
+                      <a:ext cx="3269263" cy="198137"/>
+                    </a:xfrm>
+                    <a:prstGeom prst="roundRect">
+                      <a:avLst>
+                        <a:gd name="adj" fmla="val 16667"/>
+                      </a:avLst>
+                    </a:prstGeom>
+                    <a:ln>
+                      <a:noFill/>
+                    </a:ln>
+                    <a:effectLst>
+                      <a:outerShdw blurRad="76200" dist="38100" dir="7800000" algn="tl" rotWithShape="0">
+                        <a:srgbClr val="000000">
+                          <a:alpha val="40000"/>
+                        </a:srgbClr>
+                      </a:outerShdw>
+                    </a:effectLst>
+                    <a:scene3d>
+                      <a:camera prst="orthographicFront"/>
+                      <a:lightRig rig="contrasting" dir="t">
+                        <a:rot lat="0" lon="0" rev="4200000"/>
+                      </a:lightRig>
+                    </a:scene3d>
+                    <a:sp3d prstMaterial="plastic">
+                      <a:bevelT w="381000" h="114300" prst="relaxedInset"/>
+                      <a:contourClr>
+                        <a:srgbClr val="969696"/>
+                      </a:contourClr>
+                    </a:sp3d>
+                  </pic:spPr>
+                </pic:pic>
+              </a:graphicData>
+            </a:graphic>
+          </wp:anchor>
+        </w:drawing>
+      </w:r>
+    </w:p>
+    <w:p>
+      <w:pPr>
+        <w:bidi/>
+        <w:rPr>
+          <w:rFonts w:ascii="Times New Roman" w:eastAsiaTheme="minorEastAsia" w:hAnsi="Times New Roman" w:cs="Times New Roman"/>
+          <w:sz w:val="32"/>
+          <w:szCs w:val="32"/>
+          <w:rtl/>
+          <w:lang w:bidi="he-IL"/>
+        </w:rPr>
+      </w:pPr>
+      <w:r>
+        <w:rPr>
+          <w:rFonts w:ascii="Times New Roman" w:eastAsiaTheme="minorEastAsia" w:hAnsi="Times New Roman" w:cs="Times New Roman"/>
+          <w:sz w:val="32"/>
+          <w:szCs w:val="32"/>
+          <w:rtl/>
+          <w:lang w:bidi="he-IL"/>
+        </w:rPr>
+        <w:drawing>
+          <wp:anchor distT="0" distB="0" distL="114300" distR="114300" simplePos="0" relativeHeight="251668480" behindDoc="1" locked="0" layoutInCell="1" allowOverlap="1" wp14:anchorId="0E8EEB7F" wp14:editId="0C4045B4">
+            <wp:simplePos x="0" y="0"/>
+            <wp:positionH relativeFrom="column">
+              <wp:posOffset>1581150</wp:posOffset>
+            </wp:positionH>
+            <wp:positionV relativeFrom="paragraph">
+              <wp:posOffset>422275</wp:posOffset>
+            </wp:positionV>
+            <wp:extent cx="4343776" cy="167655"/>
+            <wp:effectExtent l="133350" t="57150" r="19050" b="137160"/>
+            <wp:wrapTight wrapText="bothSides">
+              <wp:wrapPolygon edited="0">
+                <wp:start x="-379" y="-7364"/>
+                <wp:lineTo x="-663" y="-2455"/>
+                <wp:lineTo x="-663" y="22091"/>
+                <wp:lineTo x="-379" y="36818"/>
+                <wp:lineTo x="21600" y="36818"/>
+                <wp:lineTo x="21600" y="-7364"/>
+                <wp:lineTo x="-379" y="-7364"/>
+              </wp:wrapPolygon>
+            </wp:wrapTight>
+            <wp:docPr id="720214968" name="Picture 1"/>
+            <wp:cNvGraphicFramePr>
+              <a:graphicFrameLocks xmlns:a="http://schemas.openxmlformats.org/drawingml/2006/main" noChangeAspect="1"/>
+            </wp:cNvGraphicFramePr>
+            <a:graphic xmlns:a="http://schemas.openxmlformats.org/drawingml/2006/main">
+              <a:graphicData uri="http://schemas.openxmlformats.org/drawingml/2006/picture">
+                <pic:pic xmlns:pic="http://schemas.openxmlformats.org/drawingml/2006/picture">
+                  <pic:nvPicPr>
+                    <pic:cNvPr id="720214968" name=""/>
+                    <pic:cNvPicPr/>
+                  </pic:nvPicPr>
+                  <pic:blipFill>
+                    <a:blip r:embed="rId27">
+                      <a:extLst>
+                        <a:ext uri="{28A0092B-C50C-407E-A947-70E740481C1C}">
+                          <a14:useLocalDpi xmlns:a14="http://schemas.microsoft.com/office/drawing/2010/main" val="0"/>
+                        </a:ext>
+                      </a:extLst>
+                    </a:blip>
+                    <a:stretch>
+                      <a:fillRect/>
+                    </a:stretch>
+                  </pic:blipFill>
+                  <pic:spPr>
+                    <a:xfrm>
+                      <a:off x="0" y="0"/>
+                      <a:ext cx="4343776" cy="167655"/>
+                    </a:xfrm>
+                    <a:prstGeom prst="roundRect">
+                      <a:avLst>
+                        <a:gd name="adj" fmla="val 16667"/>
+                      </a:avLst>
+                    </a:prstGeom>
+                    <a:ln>
+                      <a:noFill/>
+                    </a:ln>
+                    <a:effectLst>
+                      <a:outerShdw blurRad="76200" dist="38100" dir="7800000" algn="tl" rotWithShape="0">
+                        <a:srgbClr val="000000">
+                          <a:alpha val="40000"/>
+                        </a:srgbClr>
+                      </a:outerShdw>
+                    </a:effectLst>
+                    <a:scene3d>
+                      <a:camera prst="orthographicFront"/>
+                      <a:lightRig rig="contrasting" dir="t">
+                        <a:rot lat="0" lon="0" rev="4200000"/>
+                      </a:lightRig>
+                    </a:scene3d>
+                    <a:sp3d prstMaterial="plastic">
+                      <a:bevelT w="381000" h="114300" prst="relaxedInset"/>
+                      <a:contourClr>
+                        <a:srgbClr val="969696"/>
+                      </a:contourClr>
+                    </a:sp3d>
+                  </pic:spPr>
+                </pic:pic>
+              </a:graphicData>
+            </a:graphic>
+          </wp:anchor>
+        </w:drawing>
+      </w:r>
+    </w:p>
+    <w:p>
+      <w:pPr>
+        <w:bidi/>
+        <w:rPr>
+          <w:rFonts w:ascii="Times New Roman" w:eastAsiaTheme="minorEastAsia" w:hAnsi="Times New Roman" w:cs="Times New Roman"/>
+          <w:sz w:val="32"/>
+          <w:szCs w:val="32"/>
+          <w:rtl/>
+          <w:lang w:bidi="he-IL"/>
+        </w:rPr>
+      </w:pPr>
+    </w:p>
+    <w:p>
+      <w:pPr>
+        <w:bidi/>
+        <w:rPr>
+          <w:rFonts w:ascii="Times New Roman" w:eastAsiaTheme="minorEastAsia" w:hAnsi="Times New Roman" w:cs="Times New Roman"/>
+          <w:sz w:val="32"/>
+          <w:szCs w:val="32"/>
+          <w:rtl/>
+          <w:lang w:bidi="he-IL"/>
+        </w:rPr>
+      </w:pPr>
+      <w:r>
+        <w:rPr>
+          <w:rFonts w:ascii="Times New Roman" w:eastAsiaTheme="minorEastAsia" w:hAnsi="Times New Roman" w:cs="Times New Roman"/>
+          <w:sz w:val="32"/>
+          <w:szCs w:val="32"/>
+          <w:rtl/>
+          <w:lang w:bidi="he-IL"/>
+        </w:rPr>
+        <w:drawing>
+          <wp:anchor distT="0" distB="0" distL="114300" distR="114300" simplePos="0" relativeHeight="251671552" behindDoc="1" locked="0" layoutInCell="1" allowOverlap="1" wp14:anchorId="2709E673" wp14:editId="4AA1A118">
+            <wp:simplePos x="0" y="0"/>
+            <wp:positionH relativeFrom="margin">
+              <wp:posOffset>541020</wp:posOffset>
+            </wp:positionH>
+            <wp:positionV relativeFrom="paragraph">
+              <wp:posOffset>1853565</wp:posOffset>
+            </wp:positionV>
+            <wp:extent cx="5448772" cy="419136"/>
+            <wp:effectExtent l="133350" t="76200" r="76200" b="133350"/>
+            <wp:wrapTight wrapText="bothSides">
+              <wp:wrapPolygon edited="0">
+                <wp:start x="-76" y="-3927"/>
+                <wp:lineTo x="-529" y="-1964"/>
+                <wp:lineTo x="-529" y="21600"/>
+                <wp:lineTo x="-151" y="27491"/>
+                <wp:lineTo x="21449" y="27491"/>
+                <wp:lineTo x="21827" y="14727"/>
+                <wp:lineTo x="21827" y="13745"/>
+                <wp:lineTo x="21373" y="-982"/>
+                <wp:lineTo x="21373" y="-3927"/>
+                <wp:lineTo x="-76" y="-3927"/>
+              </wp:wrapPolygon>
+            </wp:wrapTight>
+            <wp:docPr id="832774247" name="Picture 1"/>
+            <wp:cNvGraphicFramePr>
+              <a:graphicFrameLocks xmlns:a="http://schemas.openxmlformats.org/drawingml/2006/main" noChangeAspect="1"/>
+            </wp:cNvGraphicFramePr>
+            <a:graphic xmlns:a="http://schemas.openxmlformats.org/drawingml/2006/main">
+              <a:graphicData uri="http://schemas.openxmlformats.org/drawingml/2006/picture">
+                <pic:pic xmlns:pic="http://schemas.openxmlformats.org/drawingml/2006/picture">
+                  <pic:nvPicPr>
+                    <pic:cNvPr id="832774247" name=""/>
+                    <pic:cNvPicPr/>
+                  </pic:nvPicPr>
+                  <pic:blipFill>
+                    <a:blip r:embed="rId28">
+                      <a:extLst>
+                        <a:ext uri="{28A0092B-C50C-407E-A947-70E740481C1C}">
+                          <a14:useLocalDpi xmlns:a14="http://schemas.microsoft.com/office/drawing/2010/main" val="0"/>
+                        </a:ext>
+                      </a:extLst>
+                    </a:blip>
+                    <a:stretch>
+                      <a:fillRect/>
+                    </a:stretch>
+                  </pic:blipFill>
+                  <pic:spPr>
+                    <a:xfrm>
+                      <a:off x="0" y="0"/>
+                      <a:ext cx="5448772" cy="419136"/>
+                    </a:xfrm>
+                    <a:prstGeom prst="roundRect">
+                      <a:avLst>
+                        <a:gd name="adj" fmla="val 16667"/>
+                      </a:avLst>
+                    </a:prstGeom>
+                    <a:ln>
+                      <a:noFill/>
+                    </a:ln>
+                    <a:effectLst>
+                      <a:outerShdw blurRad="76200" dist="38100" dir="7800000" algn="tl" rotWithShape="0">
+                        <a:srgbClr val="000000">
+                          <a:alpha val="40000"/>
+                        </a:srgbClr>
+                      </a:outerShdw>
+                    </a:effectLst>
+                    <a:scene3d>
+                      <a:camera prst="orthographicFront"/>
+                      <a:lightRig rig="contrasting" dir="t">
+                        <a:rot lat="0" lon="0" rev="4200000"/>
+                      </a:lightRig>
+                    </a:scene3d>
+                    <a:sp3d prstMaterial="plastic">
+                      <a:bevelT w="381000" h="114300" prst="relaxedInset"/>
+                      <a:contourClr>
+                        <a:srgbClr val="969696"/>
+                      </a:contourClr>
+                    </a:sp3d>
+                  </pic:spPr>
+                </pic:pic>
+              </a:graphicData>
+            </a:graphic>
+          </wp:anchor>
+        </w:drawing>
+      </w:r>
+      <w:r>
+        <w:rPr>
+          <w:rFonts w:ascii="Times New Roman" w:eastAsiaTheme="minorEastAsia" w:hAnsi="Times New Roman" w:cs="Times New Roman"/>
+          <w:sz w:val="32"/>
+          <w:szCs w:val="32"/>
+          <w:rtl/>
+          <w:lang w:bidi="he-IL"/>
+        </w:rPr>
+        <w:drawing>
+          <wp:anchor distT="0" distB="0" distL="114300" distR="114300" simplePos="0" relativeHeight="251670528" behindDoc="1" locked="0" layoutInCell="1" allowOverlap="1" wp14:anchorId="6806A441" wp14:editId="1C0E4DAE">
+            <wp:simplePos x="0" y="0"/>
+            <wp:positionH relativeFrom="margin">
+              <wp:align>right</wp:align>
+            </wp:positionH>
+            <wp:positionV relativeFrom="paragraph">
+              <wp:posOffset>1274445</wp:posOffset>
+            </wp:positionV>
+            <wp:extent cx="3612193" cy="152413"/>
+            <wp:effectExtent l="133350" t="76200" r="7620" b="133350"/>
+            <wp:wrapTight wrapText="bothSides">
+              <wp:wrapPolygon edited="0">
+                <wp:start x="-114" y="-10800"/>
+                <wp:lineTo x="-797" y="-5400"/>
+                <wp:lineTo x="-797" y="21600"/>
+                <wp:lineTo x="-342" y="37800"/>
+                <wp:lineTo x="21532" y="37800"/>
+                <wp:lineTo x="21304" y="-2700"/>
+                <wp:lineTo x="21304" y="-10800"/>
+                <wp:lineTo x="-114" y="-10800"/>
+              </wp:wrapPolygon>
+            </wp:wrapTight>
+            <wp:docPr id="1446591042" name="Picture 1"/>
+            <wp:cNvGraphicFramePr>
+              <a:graphicFrameLocks xmlns:a="http://schemas.openxmlformats.org/drawingml/2006/main" noChangeAspect="1"/>
+            </wp:cNvGraphicFramePr>
+            <a:graphic xmlns:a="http://schemas.openxmlformats.org/drawingml/2006/main">
+              <a:graphicData uri="http://schemas.openxmlformats.org/drawingml/2006/picture">
+                <pic:pic xmlns:pic="http://schemas.openxmlformats.org/drawingml/2006/picture">
+                  <pic:nvPicPr>
+                    <pic:cNvPr id="1446591042" name=""/>
+                    <pic:cNvPicPr/>
+                  </pic:nvPicPr>
+                  <pic:blipFill>
+                    <a:blip r:embed="rId29">
+                      <a:extLst>
+                        <a:ext uri="{28A0092B-C50C-407E-A947-70E740481C1C}">
+                          <a14:useLocalDpi xmlns:a14="http://schemas.microsoft.com/office/drawing/2010/main" val="0"/>
+                        </a:ext>
+                      </a:extLst>
+                    </a:blip>
+                    <a:stretch>
+                      <a:fillRect/>
+                    </a:stretch>
+                  </pic:blipFill>
+                  <pic:spPr>
+                    <a:xfrm>
+                      <a:off x="0" y="0"/>
+                      <a:ext cx="3612193" cy="152413"/>
+                    </a:xfrm>
+                    <a:prstGeom prst="roundRect">
+                      <a:avLst>
+                        <a:gd name="adj" fmla="val 16667"/>
+                      </a:avLst>
+                    </a:prstGeom>
+                    <a:ln>
+                      <a:noFill/>
+                    </a:ln>
+                    <a:effectLst>
+                      <a:outerShdw blurRad="76200" dist="38100" dir="7800000" algn="tl" rotWithShape="0">
+                        <a:srgbClr val="000000">
+                          <a:alpha val="40000"/>
+                        </a:srgbClr>
+                      </a:outerShdw>
+                    </a:effectLst>
+                    <a:scene3d>
+                      <a:camera prst="orthographicFront"/>
+                      <a:lightRig rig="contrasting" dir="t">
+                        <a:rot lat="0" lon="0" rev="4200000"/>
+                      </a:lightRig>
+                    </a:scene3d>
+                    <a:sp3d prstMaterial="plastic">
+                      <a:bevelT w="381000" h="114300" prst="relaxedInset"/>
+                      <a:contourClr>
+                        <a:srgbClr val="969696"/>
+                      </a:contourClr>
+                    </a:sp3d>
+                  </pic:spPr>
+                </pic:pic>
+              </a:graphicData>
+            </a:graphic>
+          </wp:anchor>
+        </w:drawing>
+      </w:r>
+      <w:r>
+        <w:rPr>
+          <w:rFonts w:ascii="Times New Roman" w:eastAsiaTheme="minorEastAsia" w:hAnsi="Times New Roman" w:cs="Times New Roman"/>
+          <w:sz w:val="32"/>
+          <w:szCs w:val="32"/>
+          <w:rtl/>
+          <w:lang w:bidi="he-IL"/>
+        </w:rPr>
+        <w:drawing>
+          <wp:anchor distT="0" distB="0" distL="114300" distR="114300" simplePos="0" relativeHeight="251669504" behindDoc="1" locked="0" layoutInCell="1" allowOverlap="1" wp14:anchorId="70C1A778" wp14:editId="67462813">
+            <wp:simplePos x="0" y="0"/>
+            <wp:positionH relativeFrom="column">
+              <wp:posOffset>491490</wp:posOffset>
+            </wp:positionH>
+            <wp:positionV relativeFrom="paragraph">
+              <wp:posOffset>314325</wp:posOffset>
+            </wp:positionV>
+            <wp:extent cx="5425440" cy="403860"/>
+            <wp:effectExtent l="133350" t="76200" r="80010" b="129540"/>
+            <wp:wrapTight wrapText="bothSides">
+              <wp:wrapPolygon edited="0">
+                <wp:start x="-76" y="-4075"/>
+                <wp:lineTo x="-531" y="-2038"/>
+                <wp:lineTo x="-531" y="21396"/>
+                <wp:lineTo x="-228" y="27509"/>
+                <wp:lineTo x="21539" y="27509"/>
+                <wp:lineTo x="21843" y="15283"/>
+                <wp:lineTo x="21843" y="14264"/>
+                <wp:lineTo x="21463" y="-1019"/>
+                <wp:lineTo x="21463" y="-4075"/>
+                <wp:lineTo x="-76" y="-4075"/>
+              </wp:wrapPolygon>
+            </wp:wrapTight>
+            <wp:docPr id="2114292683" name="Picture 1"/>
+            <wp:cNvGraphicFramePr>
+              <a:graphicFrameLocks xmlns:a="http://schemas.openxmlformats.org/drawingml/2006/main" noChangeAspect="1"/>
+            </wp:cNvGraphicFramePr>
+            <a:graphic xmlns:a="http://schemas.openxmlformats.org/drawingml/2006/main">
+              <a:graphicData uri="http://schemas.openxmlformats.org/drawingml/2006/picture">
+                <pic:pic xmlns:pic="http://schemas.openxmlformats.org/drawingml/2006/picture">
+                  <pic:nvPicPr>
+                    <pic:cNvPr id="2114292683" name=""/>
+                    <pic:cNvPicPr/>
+                  </pic:nvPicPr>
+                  <pic:blipFill>
+                    <a:blip r:embed="rId30">
+                      <a:extLst>
+                        <a:ext uri="{28A0092B-C50C-407E-A947-70E740481C1C}">
+                          <a14:useLocalDpi xmlns:a14="http://schemas.microsoft.com/office/drawing/2010/main" val="0"/>
+                        </a:ext>
+                      </a:extLst>
+                    </a:blip>
+                    <a:stretch>
+                      <a:fillRect/>
+                    </a:stretch>
+                  </pic:blipFill>
+                  <pic:spPr>
+                    <a:xfrm>
+                      <a:off x="0" y="0"/>
+                      <a:ext cx="5425440" cy="403860"/>
+                    </a:xfrm>
+                    <a:prstGeom prst="roundRect">
+                      <a:avLst>
+                        <a:gd name="adj" fmla="val 16667"/>
+                      </a:avLst>
+                    </a:prstGeom>
+                    <a:ln>
+                      <a:noFill/>
+                    </a:ln>
+                    <a:effectLst>
+                      <a:outerShdw blurRad="76200" dist="38100" dir="7800000" algn="tl" rotWithShape="0">
+                        <a:srgbClr val="000000">
+                          <a:alpha val="40000"/>
+                        </a:srgbClr>
+                      </a:outerShdw>
+                    </a:effectLst>
+                    <a:scene3d>
+                      <a:camera prst="orthographicFront"/>
+                      <a:lightRig rig="contrasting" dir="t">
+                        <a:rot lat="0" lon="0" rev="4200000"/>
+                      </a:lightRig>
+                    </a:scene3d>
+                    <a:sp3d prstMaterial="plastic">
+                      <a:bevelT w="381000" h="114300" prst="relaxedInset"/>
+                      <a:contourClr>
+                        <a:srgbClr val="969696"/>
+                      </a:contourClr>
+                    </a:sp3d>
+                  </pic:spPr>
+                </pic:pic>
+              </a:graphicData>
+            </a:graphic>
+          </wp:anchor>
+        </w:drawing>
+      </w:r>
+    </w:p>
+    <w:p>
+      <w:pPr>
+        <w:bidi/>
+        <w:rPr>
+          <w:rFonts w:ascii="Times New Roman" w:eastAsiaTheme="minorEastAsia" w:hAnsi="Times New Roman" w:cs="Times New Roman"/>
+          <w:sz w:val="32"/>
+          <w:szCs w:val="32"/>
+          <w:rtl/>
+          <w:lang w:bidi="he-IL"/>
+        </w:rPr>
+      </w:pPr>
+    </w:p>
+    <w:p>
+      <w:pPr>
+        <w:bidi/>
+        <w:rPr>
+          <w:rFonts w:ascii="Times New Roman" w:eastAsiaTheme="minorEastAsia" w:hAnsi="Times New Roman" w:cs="Times New Roman"/>
+          <w:sz w:val="32"/>
+          <w:szCs w:val="32"/>
+          <w:rtl/>
+          <w:lang w:bidi="he-IL"/>
+        </w:rPr>
+      </w:pPr>
+    </w:p>
+    <w:p>
+      <w:pPr>
+        <w:bidi/>
+        <w:rPr>
+          <w:rFonts w:ascii="Times New Roman" w:eastAsiaTheme="minorEastAsia" w:hAnsi="Times New Roman" w:cs="Times New Roman"/>
+          <w:sz w:val="32"/>
+          <w:szCs w:val="32"/>
+          <w:rtl/>
+          <w:lang w:bidi="he-IL"/>
+        </w:rPr>
+      </w:pPr>
+    </w:p>
+    <w:p>
+      <w:pPr>
+        <w:bidi/>
+        <w:rPr>
+          <w:rFonts w:ascii="Times New Roman" w:eastAsiaTheme="minorEastAsia" w:hAnsi="Times New Roman" w:cs="Times New Roman"/>
+          <w:sz w:val="32"/>
+          <w:szCs w:val="32"/>
+          <w:rtl/>
+          <w:lang w:bidi="he-IL"/>
+        </w:rPr>
+      </w:pPr>
+    </w:p>
+    <w:p>
+      <w:pPr>
+        <w:bidi/>
+        <w:rPr>
+          <w:rFonts w:ascii="Times New Roman" w:eastAsiaTheme="minorEastAsia" w:hAnsi="Times New Roman" w:cs="Times New Roman"/>
+          <w:sz w:val="32"/>
+          <w:szCs w:val="32"/>
+          <w:rtl/>
+          <w:lang w:bidi="he-IL"/>
+        </w:rPr>
+      </w:pPr>
+    </w:p>
+    <w:p>
+      <w:pPr>
+        <w:bidi/>
+        <w:rPr>
+          <w:rFonts w:ascii="Times New Roman" w:eastAsiaTheme="minorEastAsia" w:hAnsi="Times New Roman" w:cs="Times New Roman"/>
+          <w:sz w:val="32"/>
+          <w:szCs w:val="32"/>
+          <w:rtl/>
+          <w:lang w:bidi="he-IL"/>
+        </w:rPr>
+      </w:pPr>
+    </w:p>
+    <w:p>
+      <w:pPr>
+        <w:bidi/>
+        <w:rPr>
+          <w:rFonts w:ascii="Times New Roman" w:eastAsiaTheme="minorEastAsia" w:hAnsi="Times New Roman" w:cs="Times New Roman"/>
+          <w:sz w:val="32"/>
+          <w:szCs w:val="32"/>
+          <w:rtl/>
+          <w:lang w:bidi="he-IL"/>
+        </w:rPr>
+      </w:pPr>
+    </w:p>
+    <w:p>
+      <w:pPr>
+        <w:bidi/>
+        <w:rPr>
+          <w:rFonts w:ascii="Times New Roman" w:eastAsiaTheme="minorEastAsia" w:hAnsi="Times New Roman" w:cs="Times New Roman"/>
+          <w:b/>
+          <w:bCs/>
+          <w:i/>
+          <w:iCs/>
+          <w:sz w:val="32"/>
+          <w:szCs w:val="32"/>
+          <w:u w:val="single"/>
+          <w:rtl/>
+          <w:lang w:bidi="he-IL"/>
+        </w:rPr>
+      </w:pPr>
+      <w:r>
+        <w:rPr>
+          <w:rFonts w:ascii="Times New Roman" w:eastAsiaTheme="minorEastAsia" w:hAnsi="Times New Roman" w:cs="Times New Roman" w:hint="cs"/>
+          <w:b/>
+          <w:bCs/>
+          <w:i/>
+          <w:iCs/>
+          <w:sz w:val="32"/>
+          <w:szCs w:val="32"/>
+          <w:highlight w:val="yellow"/>
+          <w:u w:val="single"/>
+          <w:rtl/>
+          <w:lang w:bidi="he-IL"/>
+        </w:rPr>
+        <w:t>חלק ד:</w:t>
+      </w:r>
+    </w:p>
+    <w:p>
+      <w:pPr>
+        <w:bidi/>
+        <w:rPr>
+          <w:rFonts w:ascii="Times New Roman" w:eastAsiaTheme="minorEastAsia" w:hAnsi="Times New Roman" w:cs="Times New Roman"/>
+          <w:b/>
+          <w:bCs/>
+          <w:i/>
+          <w:iCs/>
+          <w:sz w:val="32"/>
+          <w:szCs w:val="32"/>
+          <w:u w:val="single"/>
+          <w:rtl/>
+          <w:lang w:bidi="he-IL"/>
+        </w:rPr>
+      </w:pPr>
+      <w:r>
+        <w:rPr>
+          <w:rFonts w:ascii="Times New Roman" w:eastAsiaTheme="minorEastAsia" w:hAnsi="Times New Roman" w:cs="Times New Roman"/>
+          <w:b/>
+          <w:bCs/>
+          <w:i/>
+          <w:iCs/>
+          <w:sz w:val="32"/>
+          <w:szCs w:val="32"/>
+          <w:u w:val="single"/>
+          <w:rtl/>
+          <w:lang w:bidi="he-IL"/>
+        </w:rPr>
+        <w:t xml:space="preserve"> </w:t>
+      </w:r>
+      <w:r>
+        <w:rPr>
+          <w:noProof/>
+        </w:rPr>
+        <w:drawing>
+          <wp:anchor distT="0" distB="0" distL="114300" distR="114300" simplePos="0" relativeHeight="251673600" behindDoc="1" locked="0" layoutInCell="1" allowOverlap="1" wp14:anchorId="58A1D98C" wp14:editId="723602D8">
+            <wp:simplePos x="0" y="0"/>
+            <wp:positionH relativeFrom="column">
+              <wp:posOffset>1642110</wp:posOffset>
+            </wp:positionH>
+            <wp:positionV relativeFrom="paragraph">
+              <wp:posOffset>755015</wp:posOffset>
+            </wp:positionV>
+            <wp:extent cx="4218940" cy="151765"/>
+            <wp:effectExtent l="133350" t="57150" r="48260" b="133985"/>
+            <wp:wrapTight wrapText="bothSides">
+              <wp:wrapPolygon edited="0">
+                <wp:start x="-488" y="-8134"/>
+                <wp:lineTo x="-683" y="21690"/>
+                <wp:lineTo x="-293" y="37958"/>
+                <wp:lineTo x="21554" y="37958"/>
+                <wp:lineTo x="21750" y="0"/>
+                <wp:lineTo x="21750" y="-8134"/>
+                <wp:lineTo x="-488" y="-8134"/>
+              </wp:wrapPolygon>
+            </wp:wrapTight>
+            <wp:docPr id="1603448544" name="Picture 1"/>
+            <wp:cNvGraphicFramePr>
+              <a:graphicFrameLocks xmlns:a="http://schemas.openxmlformats.org/drawingml/2006/main" noChangeAspect="1"/>
+            </wp:cNvGraphicFramePr>
+            <a:graphic xmlns:a="http://schemas.openxmlformats.org/drawingml/2006/main">
+              <a:graphicData uri="http://schemas.openxmlformats.org/drawingml/2006/picture">
+                <pic:pic xmlns:pic="http://schemas.openxmlformats.org/drawingml/2006/picture">
+                  <pic:nvPicPr>
+                    <pic:cNvPr id="1603448544" name=""/>
+                    <pic:cNvPicPr/>
+                  </pic:nvPicPr>
+                  <pic:blipFill>
+                    <a:blip r:embed="rId31">
+                      <a:extLst>
+                        <a:ext uri="{28A0092B-C50C-407E-A947-70E740481C1C}">
+                          <a14:useLocalDpi xmlns:a14="http://schemas.microsoft.com/office/drawing/2010/main" val="0"/>
+                        </a:ext>
+                      </a:extLst>
+                    </a:blip>
+                    <a:stretch>
+                      <a:fillRect/>
+                    </a:stretch>
+                  </pic:blipFill>
+                  <pic:spPr>
+                    <a:xfrm>
+                      <a:off x="0" y="0"/>
+                      <a:ext cx="4218940" cy="151765"/>
+                    </a:xfrm>
+                    <a:prstGeom prst="roundRect">
+                      <a:avLst>
+                        <a:gd name="adj" fmla="val 16667"/>
+                      </a:avLst>
+                    </a:prstGeom>
+                    <a:ln>
+                      <a:noFill/>
+                    </a:ln>
+                    <a:effectLst>
+                      <a:outerShdw blurRad="76200" dist="38100" dir="7800000" algn="tl" rotWithShape="0">
+                        <a:srgbClr val="000000">
+                          <a:alpha val="40000"/>
+                        </a:srgbClr>
+                      </a:outerShdw>
+                    </a:effectLst>
+                    <a:scene3d>
+                      <a:camera prst="orthographicFront"/>
+                      <a:lightRig rig="contrasting" dir="t">
+                        <a:rot lat="0" lon="0" rev="4200000"/>
+                      </a:lightRig>
+                    </a:scene3d>
+                    <a:sp3d prstMaterial="plastic">
+                      <a:bevelT w="381000" h="114300" prst="relaxedInset"/>
+                      <a:contourClr>
+                        <a:srgbClr val="969696"/>
+                      </a:contourClr>
+                    </a:sp3d>
+                  </pic:spPr>
+                </pic:pic>
+              </a:graphicData>
+            </a:graphic>
+          </wp:anchor>
+        </w:drawing>
+      </w:r>
+      <w:r>
+        <w:rPr>
+          <w:rFonts w:ascii="Times New Roman" w:eastAsiaTheme="minorEastAsia" w:hAnsi="Times New Roman" w:cs="Times New Roman"/>
+          <w:b/>
+          <w:bCs/>
+          <w:i/>
+          <w:iCs/>
+          <w:sz w:val="32"/>
+          <w:szCs w:val="32"/>
+          <w:u w:val="single"/>
+          <w:rtl/>
+          <w:lang w:bidi="he-IL"/>
+        </w:rPr>
+        <w:t xml:space="preserve"> </w:t>
+      </w:r>
+      <w:r>
+        <w:rPr>
+          <w:rFonts w:ascii="Times New Roman" w:eastAsiaTheme="minorEastAsia" w:hAnsi="Times New Roman" w:cs="Times New Roman"/>
+          <w:b/>
+          <w:bCs/>
+          <w:i/>
+          <w:iCs/>
+          <w:sz w:val="32"/>
+          <w:szCs w:val="32"/>
+          <w:u w:val="single"/>
+          <w:rtl/>
+          <w:lang w:bidi="he-IL"/>
+        </w:rPr>
+        <w:drawing>
+          <wp:anchor distT="0" distB="0" distL="114300" distR="114300" simplePos="0" relativeHeight="251672576" behindDoc="1" locked="0" layoutInCell="1" allowOverlap="1" wp14:anchorId="039B7E44" wp14:editId="768BF855">
+            <wp:simplePos x="0" y="0"/>
+            <wp:positionH relativeFrom="column">
+              <wp:posOffset>384810</wp:posOffset>
+            </wp:positionH>
+            <wp:positionV relativeFrom="paragraph">
+              <wp:posOffset>73025</wp:posOffset>
+            </wp:positionV>
+            <wp:extent cx="5479255" cy="320068"/>
+            <wp:effectExtent l="133350" t="76200" r="83820" b="137160"/>
+            <wp:wrapTight wrapText="bothSides">
+              <wp:wrapPolygon edited="0">
+                <wp:start x="-75" y="-5143"/>
+                <wp:lineTo x="-526" y="-2571"/>
+                <wp:lineTo x="-526" y="18000"/>
+                <wp:lineTo x="-225" y="29571"/>
+                <wp:lineTo x="21555" y="29571"/>
+                <wp:lineTo x="21855" y="18000"/>
+                <wp:lineTo x="21405" y="-1286"/>
+                <wp:lineTo x="21405" y="-5143"/>
+                <wp:lineTo x="-75" y="-5143"/>
+              </wp:wrapPolygon>
+            </wp:wrapTight>
+            <wp:docPr id="1753530573" name="Picture 1"/>
+            <wp:cNvGraphicFramePr>
+              <a:graphicFrameLocks xmlns:a="http://schemas.openxmlformats.org/drawingml/2006/main" noChangeAspect="1"/>
+            </wp:cNvGraphicFramePr>
+            <a:graphic xmlns:a="http://schemas.openxmlformats.org/drawingml/2006/main">
+              <a:graphicData uri="http://schemas.openxmlformats.org/drawingml/2006/picture">
+                <pic:pic xmlns:pic="http://schemas.openxmlformats.org/drawingml/2006/picture">
+                  <pic:nvPicPr>
+                    <pic:cNvPr id="1753530573" name=""/>
+                    <pic:cNvPicPr/>
+                  </pic:nvPicPr>
+                  <pic:blipFill>
+                    <a:blip r:embed="rId32">
+                      <a:extLst>
+                        <a:ext uri="{28A0092B-C50C-407E-A947-70E740481C1C}">
+                          <a14:useLocalDpi xmlns:a14="http://schemas.microsoft.com/office/drawing/2010/main" val="0"/>
+                        </a:ext>
+                      </a:extLst>
+                    </a:blip>
+                    <a:stretch>
+                      <a:fillRect/>
+                    </a:stretch>
+                  </pic:blipFill>
+                  <pic:spPr>
+                    <a:xfrm>
+                      <a:off x="0" y="0"/>
+                      <a:ext cx="5479255" cy="320068"/>
+                    </a:xfrm>
+                    <a:prstGeom prst="roundRect">
+                      <a:avLst>
+                        <a:gd name="adj" fmla="val 16667"/>
+                      </a:avLst>
+                    </a:prstGeom>
+                    <a:ln>
+                      <a:noFill/>
+                    </a:ln>
+                    <a:effectLst>
+                      <a:outerShdw blurRad="76200" dist="38100" dir="7800000" algn="tl" rotWithShape="0">
+                        <a:srgbClr val="000000">
+                          <a:alpha val="40000"/>
+                        </a:srgbClr>
+                      </a:outerShdw>
+                    </a:effectLst>
+                    <a:scene3d>
+                      <a:camera prst="orthographicFront"/>
+                      <a:lightRig rig="contrasting" dir="t">
+                        <a:rot lat="0" lon="0" rev="4200000"/>
+                      </a:lightRig>
+                    </a:scene3d>
+                    <a:sp3d prstMaterial="plastic">
+                      <a:bevelT w="381000" h="114300" prst="relaxedInset"/>
+                      <a:contourClr>
+                        <a:srgbClr val="969696"/>
+                      </a:contourClr>
+                    </a:sp3d>
+                  </pic:spPr>
+                </pic:pic>
+              </a:graphicData>
+            </a:graphic>
+          </wp:anchor>
+        </w:drawing>
+      </w:r>
+    </w:p>
+    <w:p>
+      <w:pPr>
+        <w:bidi/>
+        <w:rPr>
+          <w:rFonts w:ascii="Times New Roman" w:eastAsiaTheme="minorEastAsia" w:hAnsi="Times New Roman" w:cs="Times New Roman"/>
+          <w:b/>
+          <w:bCs/>
+          <w:i/>
+          <w:iCs/>
+          <w:sz w:val="32"/>
+          <w:szCs w:val="32"/>
+          <w:u w:val="single"/>
+          <w:rtl/>
+          <w:lang w:bidi="he-IL"/>
+        </w:rPr>
+      </w:pPr>
+      <w:r>
+        <w:rPr>
+          <w:rFonts w:ascii="Times New Roman" w:eastAsiaTheme="minorEastAsia" w:hAnsi="Times New Roman" w:cs="Times New Roman"/>
+          <w:b/>
+          <w:bCs/>
+          <w:i/>
+          <w:iCs/>
+          <w:sz w:val="32"/>
+          <w:szCs w:val="32"/>
+          <w:u w:val="single"/>
+          <w:rtl/>
+          <w:lang w:bidi="he-IL"/>
+        </w:rPr>
+        <w:drawing>
+          <wp:anchor distT="0" distB="0" distL="114300" distR="114300" simplePos="0" relativeHeight="251674624" behindDoc="1" locked="0" layoutInCell="1" allowOverlap="1" wp14:anchorId="1930A963" wp14:editId="79DF72E7">
+            <wp:simplePos x="0" y="0"/>
+            <wp:positionH relativeFrom="column">
+              <wp:posOffset>689610</wp:posOffset>
+            </wp:positionH>
+            <wp:positionV relativeFrom="paragraph">
+              <wp:posOffset>54610</wp:posOffset>
+            </wp:positionV>
+            <wp:extent cx="5212532" cy="144793"/>
+            <wp:effectExtent l="133350" t="57150" r="45720" b="140970"/>
+            <wp:wrapTight wrapText="bothSides">
+              <wp:wrapPolygon edited="0">
+                <wp:start x="-395" y="-8526"/>
+                <wp:lineTo x="-553" y="22737"/>
+                <wp:lineTo x="-237" y="39789"/>
+                <wp:lineTo x="21553" y="39789"/>
+                <wp:lineTo x="21711" y="0"/>
+                <wp:lineTo x="21711" y="-8526"/>
+                <wp:lineTo x="-395" y="-8526"/>
+              </wp:wrapPolygon>
+            </wp:wrapTight>
+            <wp:docPr id="378068302" name="Picture 1"/>
+            <wp:cNvGraphicFramePr>
+              <a:graphicFrameLocks xmlns:a="http://schemas.openxmlformats.org/drawingml/2006/main" noChangeAspect="1"/>
+            </wp:cNvGraphicFramePr>
+            <a:graphic xmlns:a="http://schemas.openxmlformats.org/drawingml/2006/main">
+              <a:graphicData uri="http://schemas.openxmlformats.org/drawingml/2006/picture">
+                <pic:pic xmlns:pic="http://schemas.openxmlformats.org/drawingml/2006/picture">
+                  <pic:nvPicPr>
+                    <pic:cNvPr id="378068302" name=""/>
+                    <pic:cNvPicPr/>
+                  </pic:nvPicPr>
+                  <pic:blipFill>
+                    <a:blip r:embed="rId33">
+                      <a:extLst>
+                        <a:ext uri="{28A0092B-C50C-407E-A947-70E740481C1C}">
+                          <a14:useLocalDpi xmlns:a14="http://schemas.microsoft.com/office/drawing/2010/main" val="0"/>
+                        </a:ext>
+                      </a:extLst>
+                    </a:blip>
+                    <a:stretch>
+                      <a:fillRect/>
+                    </a:stretch>
+                  </pic:blipFill>
+                  <pic:spPr>
+                    <a:xfrm>
+                      <a:off x="0" y="0"/>
+                      <a:ext cx="5212532" cy="144793"/>
+                    </a:xfrm>
+                    <a:prstGeom prst="roundRect">
+                      <a:avLst>
+                        <a:gd name="adj" fmla="val 16667"/>
+                      </a:avLst>
+                    </a:prstGeom>
+                    <a:ln>
+                      <a:noFill/>
+                    </a:ln>
+                    <a:effectLst>
+                      <a:outerShdw blurRad="76200" dist="38100" dir="7800000" algn="tl" rotWithShape="0">
+                        <a:srgbClr val="000000">
+                          <a:alpha val="40000"/>
+                        </a:srgbClr>
+                      </a:outerShdw>
+                    </a:effectLst>
+                    <a:scene3d>
+                      <a:camera prst="orthographicFront"/>
+                      <a:lightRig rig="contrasting" dir="t">
+                        <a:rot lat="0" lon="0" rev="4200000"/>
+                      </a:lightRig>
+                    </a:scene3d>
+                    <a:sp3d prstMaterial="plastic">
+                      <a:bevelT w="381000" h="114300" prst="relaxedInset"/>
+                      <a:contourClr>
+                        <a:srgbClr val="969696"/>
+                      </a:contourClr>
+                    </a:sp3d>
+                  </pic:spPr>
+                </pic:pic>
+              </a:graphicData>
+            </a:graphic>
+          </wp:anchor>
+        </w:drawing>
+      </w:r>
+    </w:p>
+    <w:p>
+      <w:pPr>
+        <w:bidi/>
+        <w:rPr>
+          <w:rFonts w:ascii="Times New Roman" w:eastAsiaTheme="minorEastAsia" w:hAnsi="Times New Roman" w:cs="Times New Roman"/>
+          <w:b/>
+          <w:bCs/>
+          <w:i/>
+          <w:iCs/>
+          <w:sz w:val="32"/>
+          <w:szCs w:val="32"/>
+          <w:u w:val="single"/>
+          <w:lang w:bidi="he-IL"/>
+        </w:rPr>
+      </w:pPr>
+    </w:p>
+    <w:p>
+      <w:pPr>
+        <w:bidi/>
+        <w:rPr>
+          <w:rFonts w:ascii="Times New Roman" w:eastAsiaTheme="minorEastAsia" w:hAnsi="Times New Roman" w:cs="Times New Roman"/>
+          <w:b/>
+          <w:bCs/>
+          <w:i/>
+          <w:iCs/>
+          <w:sz w:val="32"/>
+          <w:szCs w:val="32"/>
+          <w:highlight w:val="yellow"/>
+          <w:u w:val="single"/>
+          <w:lang w:bidi="he-IL"/>
+        </w:rPr>
+      </w:pPr>
+      <w:r>
+        <w:rPr>
+          <w:rFonts w:ascii="Times New Roman" w:eastAsiaTheme="minorEastAsia" w:hAnsi="Times New Roman" w:cs="Times New Roman"/>
+          <w:b/>
+          <w:bCs/>
+          <w:i/>
+          <w:iCs/>
+          <w:sz w:val="32"/>
+          <w:szCs w:val="32"/>
+          <w:u w:val="single"/>
+          <w:rtl/>
+          <w:lang w:bidi="he-IL"/>
+        </w:rPr>
+        <w:drawing>
+          <wp:anchor distT="0" distB="0" distL="114300" distR="114300" simplePos="0" relativeHeight="251676672" behindDoc="1" locked="0" layoutInCell="1" allowOverlap="1" wp14:anchorId="71B41787" wp14:editId="3E68A31E">
+            <wp:simplePos x="0" y="0"/>
+            <wp:positionH relativeFrom="column">
+              <wp:posOffset>1943100</wp:posOffset>
+            </wp:positionH>
+            <wp:positionV relativeFrom="paragraph">
+              <wp:posOffset>737870</wp:posOffset>
+            </wp:positionV>
+            <wp:extent cx="4000847" cy="144793"/>
+            <wp:effectExtent l="133350" t="57150" r="38100" b="140970"/>
+            <wp:wrapTight wrapText="bothSides">
+              <wp:wrapPolygon edited="0">
+                <wp:start x="-514" y="-8526"/>
+                <wp:lineTo x="-720" y="22737"/>
+                <wp:lineTo x="-309" y="39789"/>
+                <wp:lineTo x="21497" y="39789"/>
+                <wp:lineTo x="21703" y="0"/>
+                <wp:lineTo x="21703" y="-8526"/>
+                <wp:lineTo x="-514" y="-8526"/>
+              </wp:wrapPolygon>
+            </wp:wrapTight>
+            <wp:docPr id="309623800" name="Picture 1"/>
+            <wp:cNvGraphicFramePr>
+              <a:graphicFrameLocks xmlns:a="http://schemas.openxmlformats.org/drawingml/2006/main" noChangeAspect="1"/>
+            </wp:cNvGraphicFramePr>
+            <a:graphic xmlns:a="http://schemas.openxmlformats.org/drawingml/2006/main">
+              <a:graphicData uri="http://schemas.openxmlformats.org/drawingml/2006/picture">
+                <pic:pic xmlns:pic="http://schemas.openxmlformats.org/drawingml/2006/picture">
+                  <pic:nvPicPr>
+                    <pic:cNvPr id="309623800" name=""/>
+                    <pic:cNvPicPr/>
+                  </pic:nvPicPr>
+                  <pic:blipFill>
+                    <a:blip r:embed="rId34">
+                      <a:extLst>
+                        <a:ext uri="{28A0092B-C50C-407E-A947-70E740481C1C}">
+                          <a14:useLocalDpi xmlns:a14="http://schemas.microsoft.com/office/drawing/2010/main" val="0"/>
+                        </a:ext>
+                      </a:extLst>
+                    </a:blip>
+                    <a:stretch>
+                      <a:fillRect/>
+                    </a:stretch>
+                  </pic:blipFill>
+                  <pic:spPr>
+                    <a:xfrm>
+                      <a:off x="0" y="0"/>
+                      <a:ext cx="4000847" cy="144793"/>
+                    </a:xfrm>
+                    <a:prstGeom prst="roundRect">
+                      <a:avLst>
+                        <a:gd name="adj" fmla="val 16667"/>
+                      </a:avLst>
+                    </a:prstGeom>
+                    <a:ln>
+                      <a:noFill/>
+                    </a:ln>
+                    <a:effectLst>
+                      <a:outerShdw blurRad="76200" dist="38100" dir="7800000" algn="tl" rotWithShape="0">
+                        <a:srgbClr val="000000">
+                          <a:alpha val="40000"/>
+                        </a:srgbClr>
+                      </a:outerShdw>
+                    </a:effectLst>
+                    <a:scene3d>
+                      <a:camera prst="orthographicFront"/>
+                      <a:lightRig rig="contrasting" dir="t">
+                        <a:rot lat="0" lon="0" rev="4200000"/>
+                      </a:lightRig>
+                    </a:scene3d>
+                    <a:sp3d prstMaterial="plastic">
+                      <a:bevelT w="381000" h="114300" prst="relaxedInset"/>
+                      <a:contourClr>
+                        <a:srgbClr val="969696"/>
+                      </a:contourClr>
+                    </a:sp3d>
+                  </pic:spPr>
+                </pic:pic>
+              </a:graphicData>
+            </a:graphic>
+          </wp:anchor>
+        </w:drawing>
+      </w:r>
+      <w:r>
+        <w:rPr>
+          <w:rFonts w:ascii="Times New Roman" w:eastAsiaTheme="minorEastAsia" w:hAnsi="Times New Roman" w:cs="Times New Roman"/>
+          <w:b/>
+          <w:bCs/>
+          <w:i/>
+          <w:iCs/>
+          <w:sz w:val="32"/>
+          <w:szCs w:val="32"/>
+          <w:u w:val="single"/>
+          <w:rtl/>
+          <w:lang w:bidi="he-IL"/>
+        </w:rPr>
+        <w:t xml:space="preserve"> </w:t>
+      </w:r>
+      <w:r>
+        <w:rPr>
+          <w:rFonts w:ascii="Times New Roman" w:eastAsiaTheme="minorEastAsia" w:hAnsi="Times New Roman" w:cs="Times New Roman"/>
+          <w:b/>
+          <w:bCs/>
+          <w:i/>
+          <w:iCs/>
+          <w:sz w:val="32"/>
+          <w:szCs w:val="32"/>
+          <w:u w:val="single"/>
+          <w:rtl/>
+          <w:lang w:bidi="he-IL"/>
+        </w:rPr>
+        <w:drawing>
+          <wp:anchor distT="0" distB="0" distL="114300" distR="114300" simplePos="0" relativeHeight="251675648" behindDoc="1" locked="0" layoutInCell="1" allowOverlap="1" wp14:anchorId="251E6D41" wp14:editId="7B51BF1D">
+            <wp:simplePos x="0" y="0"/>
+            <wp:positionH relativeFrom="column">
+              <wp:posOffset>361950</wp:posOffset>
+            </wp:positionH>
+            <wp:positionV relativeFrom="paragraph">
+              <wp:posOffset>74930</wp:posOffset>
+            </wp:positionV>
+            <wp:extent cx="5502117" cy="289585"/>
+            <wp:effectExtent l="133350" t="76200" r="80010" b="129540"/>
+            <wp:wrapTight wrapText="bothSides">
+              <wp:wrapPolygon edited="0">
+                <wp:start x="-75" y="-5684"/>
+                <wp:lineTo x="-524" y="-2842"/>
+                <wp:lineTo x="-524" y="19895"/>
+                <wp:lineTo x="-299" y="29842"/>
+                <wp:lineTo x="21615" y="29842"/>
+                <wp:lineTo x="21839" y="19895"/>
+                <wp:lineTo x="21391" y="-1421"/>
+                <wp:lineTo x="21391" y="-5684"/>
+                <wp:lineTo x="-75" y="-5684"/>
+              </wp:wrapPolygon>
+            </wp:wrapTight>
+            <wp:docPr id="1014502273" name="Picture 1"/>
+            <wp:cNvGraphicFramePr>
+              <a:graphicFrameLocks xmlns:a="http://schemas.openxmlformats.org/drawingml/2006/main" noChangeAspect="1"/>
+            </wp:cNvGraphicFramePr>
+            <a:graphic xmlns:a="http://schemas.openxmlformats.org/drawingml/2006/main">
+              <a:graphicData uri="http://schemas.openxmlformats.org/drawingml/2006/picture">
+                <pic:pic xmlns:pic="http://schemas.openxmlformats.org/drawingml/2006/picture">
+                  <pic:nvPicPr>
+                    <pic:cNvPr id="1014502273" name=""/>
+                    <pic:cNvPicPr/>
+                  </pic:nvPicPr>
+                  <pic:blipFill>
+                    <a:blip r:embed="rId35">
+                      <a:extLst>
+                        <a:ext uri="{28A0092B-C50C-407E-A947-70E740481C1C}">
+                          <a14:useLocalDpi xmlns:a14="http://schemas.microsoft.com/office/drawing/2010/main" val="0"/>
+                        </a:ext>
+                      </a:extLst>
+                    </a:blip>
+                    <a:stretch>
+                      <a:fillRect/>
+                    </a:stretch>
+                  </pic:blipFill>
+                  <pic:spPr>
+                    <a:xfrm>
+                      <a:off x="0" y="0"/>
+                      <a:ext cx="5502117" cy="289585"/>
+                    </a:xfrm>
+                    <a:prstGeom prst="roundRect">
+                      <a:avLst>
+                        <a:gd name="adj" fmla="val 16667"/>
+                      </a:avLst>
+                    </a:prstGeom>
+                    <a:ln>
+                      <a:noFill/>
+                    </a:ln>
+                    <a:effectLst>
+                      <a:outerShdw blurRad="76200" dist="38100" dir="7800000" algn="tl" rotWithShape="0">
+                        <a:srgbClr val="000000">
+                          <a:alpha val="40000"/>
+                        </a:srgbClr>
+                      </a:outerShdw>
+                    </a:effectLst>
+                    <a:scene3d>
+                      <a:camera prst="orthographicFront"/>
+                      <a:lightRig rig="contrasting" dir="t">
+                        <a:rot lat="0" lon="0" rev="4200000"/>
+                      </a:lightRig>
+                    </a:scene3d>
+                    <a:sp3d prstMaterial="plastic">
+                      <a:bevelT w="381000" h="114300" prst="relaxedInset"/>
+                      <a:contourClr>
+                        <a:srgbClr val="969696"/>
+                      </a:contourClr>
+                    </a:sp3d>
+                  </pic:spPr>
+                </pic:pic>
+              </a:graphicData>
+            </a:graphic>
+          </wp:anchor>
+        </w:drawing>
+      </w:r>
+    </w:p>
+    <w:p>
+      <w:pPr>
+        <w:bidi/>
+        <w:rPr>
+          <w:rFonts w:ascii="Times New Roman" w:eastAsiaTheme="minorEastAsia" w:hAnsi="Times New Roman" w:cs="Times New Roman"/>
+          <w:b/>
+          <w:bCs/>
+          <w:i/>
+          <w:iCs/>
+          <w:sz w:val="32"/>
+          <w:szCs w:val="32"/>
+          <w:highlight w:val="yellow"/>
+          <w:u w:val="single"/>
+          <w:lang w:bidi="he-IL"/>
+        </w:rPr>
+      </w:pPr>
+      <w:r>
+        <w:rPr>
+          <w:rFonts w:ascii="Times New Roman" w:eastAsiaTheme="minorEastAsia" w:hAnsi="Times New Roman" w:cs="Times New Roman"/>
+          <w:b/>
+          <w:bCs/>
+          <w:i/>
+          <w:iCs/>
+          <w:sz w:val="32"/>
+          <w:szCs w:val="32"/>
+          <w:u w:val="single"/>
+          <w:rtl/>
+          <w:lang w:bidi="he-IL"/>
+        </w:rPr>
+        <w:drawing>
+          <wp:anchor distT="0" distB="0" distL="114300" distR="114300" simplePos="0" relativeHeight="251677696" behindDoc="1" locked="0" layoutInCell="1" allowOverlap="1" wp14:anchorId="2CAFBF9E" wp14:editId="07015A35">
+            <wp:simplePos x="0" y="0"/>
+            <wp:positionH relativeFrom="column">
+              <wp:posOffset>266700</wp:posOffset>
+            </wp:positionH>
+            <wp:positionV relativeFrom="paragraph">
+              <wp:posOffset>1270</wp:posOffset>
+            </wp:positionV>
+            <wp:extent cx="5677392" cy="647756"/>
+            <wp:effectExtent l="133350" t="57150" r="76200" b="133350"/>
+            <wp:wrapTight wrapText="bothSides">
+              <wp:wrapPolygon edited="0">
+                <wp:start x="-145" y="-1906"/>
+                <wp:lineTo x="-507" y="-635"/>
+                <wp:lineTo x="-507" y="19694"/>
+                <wp:lineTo x="0" y="25412"/>
+                <wp:lineTo x="21310" y="25412"/>
+                <wp:lineTo x="21383" y="24141"/>
+                <wp:lineTo x="21817" y="20329"/>
+                <wp:lineTo x="21817" y="9529"/>
+                <wp:lineTo x="21455" y="0"/>
+                <wp:lineTo x="21455" y="-1906"/>
+                <wp:lineTo x="-145" y="-1906"/>
+              </wp:wrapPolygon>
+            </wp:wrapTight>
+            <wp:docPr id="2103238220" name="Picture 1"/>
+            <wp:cNvGraphicFramePr>
+              <a:graphicFrameLocks xmlns:a="http://schemas.openxmlformats.org/drawingml/2006/main" noChangeAspect="1"/>
+            </wp:cNvGraphicFramePr>
+            <a:graphic xmlns:a="http://schemas.openxmlformats.org/drawingml/2006/main">
+              <a:graphicData uri="http://schemas.openxmlformats.org/drawingml/2006/picture">
+                <pic:pic xmlns:pic="http://schemas.openxmlformats.org/drawingml/2006/picture">
+                  <pic:nvPicPr>
+                    <pic:cNvPr id="2103238220" name=""/>
+                    <pic:cNvPicPr/>
+                  </pic:nvPicPr>
+                  <pic:blipFill>
+                    <a:blip r:embed="rId36">
+                      <a:extLst>
+                        <a:ext uri="{28A0092B-C50C-407E-A947-70E740481C1C}">
+                          <a14:useLocalDpi xmlns:a14="http://schemas.microsoft.com/office/drawing/2010/main" val="0"/>
+                        </a:ext>
+                      </a:extLst>
+                    </a:blip>
+                    <a:stretch>
+                      <a:fillRect/>
+                    </a:stretch>
+                  </pic:blipFill>
+                  <pic:spPr>
+                    <a:xfrm>
+                      <a:off x="0" y="0"/>
+                      <a:ext cx="5677392" cy="647756"/>
+                    </a:xfrm>
+                    <a:prstGeom prst="roundRect">
+                      <a:avLst>
+                        <a:gd name="adj" fmla="val 16667"/>
+                      </a:avLst>
+                    </a:prstGeom>
+                    <a:ln>
+                      <a:noFill/>
+                    </a:ln>
+                    <a:effectLst>
+                      <a:outerShdw blurRad="76200" dist="38100" dir="7800000" algn="tl" rotWithShape="0">
+                        <a:srgbClr val="000000">
+                          <a:alpha val="40000"/>
+                        </a:srgbClr>
+                      </a:outerShdw>
+                    </a:effectLst>
+                    <a:scene3d>
+                      <a:camera prst="orthographicFront"/>
+                      <a:lightRig rig="contrasting" dir="t">
+                        <a:rot lat="0" lon="0" rev="4200000"/>
+                      </a:lightRig>
+                    </a:scene3d>
+                    <a:sp3d prstMaterial="plastic">
+                      <a:bevelT w="381000" h="114300" prst="relaxedInset"/>
+                      <a:contourClr>
+                        <a:srgbClr val="969696"/>
+                      </a:contourClr>
+                    </a:sp3d>
+                  </pic:spPr>
+                </pic:pic>
+              </a:graphicData>
+            </a:graphic>
+          </wp:anchor>
+        </w:drawing>
+      </w:r>
+    </w:p>
+    <w:p>
+      <w:pPr>
+        <w:bidi/>
+        <w:rPr>
+          <w:rFonts w:ascii="Times New Roman" w:eastAsiaTheme="minorEastAsia" w:hAnsi="Times New Roman" w:cs="Times New Roman"/>
+          <w:b/>
+          <w:bCs/>
+          <w:i/>
+          <w:iCs/>
+          <w:sz w:val="32"/>
+          <w:szCs w:val="32"/>
+          <w:highlight w:val="yellow"/>
+          <w:u w:val="single"/>
+          <w:lang w:bidi="he-IL"/>
+        </w:rPr>
+      </w:pPr>
+    </w:p>
+    <w:p>
+      <w:pPr>
+        <w:bidi/>
+        <w:rPr>
+          <w:rFonts w:ascii="Times New Roman" w:eastAsiaTheme="minorEastAsia" w:hAnsi="Times New Roman" w:cs="Times New Roman"/>
+          <w:b/>
+          <w:bCs/>
+          <w:i/>
+          <w:iCs/>
+          <w:sz w:val="32"/>
+          <w:szCs w:val="32"/>
+          <w:u w:val="single"/>
+          <w:rtl/>
+          <w:lang w:bidi="he-IL"/>
+        </w:rPr>
+      </w:pPr>
+      <w:r>
+        <w:rPr>
+          <w:rFonts w:ascii="Times New Roman" w:eastAsiaTheme="minorEastAsia" w:hAnsi="Times New Roman" w:cs="Times New Roman" w:hint="cs"/>
+          <w:b/>
+          <w:bCs/>
+          <w:i/>
+          <w:iCs/>
+          <w:sz w:val="32"/>
+          <w:szCs w:val="32"/>
+          <w:highlight w:val="yellow"/>
+          <w:u w:val="single"/>
+          <w:rtl/>
+          <w:lang w:bidi="he-IL"/>
+        </w:rPr>
+        <w:t xml:space="preserve">חלק </w:t>
+      </w:r>
+      <w:r>
+        <w:rPr>
+          <w:rFonts w:ascii="Times New Roman" w:eastAsiaTheme="minorEastAsia" w:hAnsi="Times New Roman" w:cs="Times New Roman" w:hint="cs"/>
+          <w:b/>
+          <w:bCs/>
+          <w:i/>
+          <w:iCs/>
+          <w:sz w:val="32"/>
+          <w:szCs w:val="32"/>
+          <w:highlight w:val="yellow"/>
+          <w:u w:val="single"/>
+          <w:rtl/>
+          <w:lang w:bidi="he-IL"/>
+        </w:rPr>
+        <w:t>ה</w:t>
+      </w:r>
+      <w:r>
+        <w:rPr>
+          <w:rFonts w:ascii="Times New Roman" w:eastAsiaTheme="minorEastAsia" w:hAnsi="Times New Roman" w:cs="Times New Roman" w:hint="cs"/>
+          <w:b/>
+          <w:bCs/>
+          <w:i/>
+          <w:iCs/>
+          <w:sz w:val="32"/>
+          <w:szCs w:val="32"/>
+          <w:highlight w:val="yellow"/>
+          <w:u w:val="single"/>
+          <w:rtl/>
+          <w:lang w:bidi="he-IL"/>
+        </w:rPr>
+        <w:t>:</w:t>
+      </w:r>
+    </w:p>
+    <w:p>
+      <w:pPr>
+        <w:bidi/>
+        <w:rPr>
+          <w:rFonts w:ascii="Times New Roman" w:eastAsiaTheme="minorEastAsia" w:hAnsi="Times New Roman" w:cs="Times New Roman"/>
+          <w:b/>
+          <w:bCs/>
+          <w:i/>
+          <w:iCs/>
+          <w:sz w:val="32"/>
+          <w:szCs w:val="32"/>
+          <w:u w:val="single"/>
+          <w:rtl/>
+          <w:lang w:bidi="he-IL"/>
+        </w:rPr>
+      </w:pPr>
+    </w:p>
+    <w:p>
+      <w:pPr>
+        <w:bidi/>
+        <w:rPr>
+          <w:rFonts w:ascii="Times New Roman" w:eastAsiaTheme="minorEastAsia" w:hAnsi="Times New Roman" w:cs="Times New Roman"/>
+          <w:b/>
+          <w:bCs/>
+          <w:i/>
+          <w:iCs/>
+          <w:sz w:val="32"/>
+          <w:szCs w:val="32"/>
+          <w:u w:val="single"/>
+          <w:rtl/>
+          <w:lang w:bidi="he-IL"/>
+        </w:rPr>
+      </w:pPr>
+      <w:r>
+        <w:rPr>
+          <w:rFonts w:ascii="Times New Roman" w:eastAsiaTheme="minorEastAsia" w:hAnsi="Times New Roman" w:cs="Times New Roman" w:hint="cs"/>
+          <w:b/>
+          <w:bCs/>
+          <w:i/>
+          <w:iCs/>
+          <w:sz w:val="32"/>
+          <w:szCs w:val="32"/>
+          <w:highlight w:val="yellow"/>
+          <w:u w:val="single"/>
+          <w:rtl/>
+          <w:lang w:bidi="he-IL"/>
+        </w:rPr>
+        <w:t xml:space="preserve">חלק </w:t>
+      </w:r>
+      <w:r>
+        <w:rPr>
+          <w:rFonts w:ascii="Times New Roman" w:eastAsiaTheme="minorEastAsia" w:hAnsi="Times New Roman" w:cs="Times New Roman" w:hint="cs"/>
+          <w:b/>
+          <w:bCs/>
+          <w:i/>
+          <w:iCs/>
+          <w:sz w:val="32"/>
+          <w:szCs w:val="32"/>
+          <w:highlight w:val="yellow"/>
+          <w:u w:val="single"/>
+          <w:rtl/>
+          <w:lang w:bidi="he-IL"/>
+        </w:rPr>
+        <w:t>ו</w:t>
+      </w:r>
+      <w:r>
+        <w:rPr>
+          <w:rFonts w:ascii="Times New Roman" w:eastAsiaTheme="minorEastAsia" w:hAnsi="Times New Roman" w:cs="Times New Roman" w:hint="cs"/>
+          <w:b/>
+          <w:bCs/>
+          <w:i/>
+          <w:iCs/>
+          <w:sz w:val="32"/>
+          <w:szCs w:val="32"/>
+          <w:highlight w:val="yellow"/>
+          <w:u w:val="single"/>
+          <w:rtl/>
+          <w:lang w:bidi="he-IL"/>
+        </w:rPr>
+        <w:t>:</w:t>
+      </w:r>
+    </w:p>
+    <w:p>
+      <w:pPr>
+        <w:bidi/>
+        <w:rPr>
+          <w:rFonts w:ascii="Times New Roman" w:eastAsiaTheme="minorEastAsia" w:hAnsi="Times New Roman" w:cs="Times New Roman"/>
+          <w:b/>
+          <w:bCs/>
+          <w:i/>
+          <w:iCs/>
+          <w:sz w:val="32"/>
+          <w:szCs w:val="32"/>
+          <w:u w:val="single"/>
+          <w:rtl/>
+          <w:lang w:bidi="he-IL"/>
+        </w:rPr>
+      </w:pPr>
+      <w:r>
+        <w:rPr>
+          <w:rFonts w:ascii="Times New Roman" w:eastAsiaTheme="minorEastAsia" w:hAnsi="Times New Roman" w:cs="Times New Roman"/>
+          <w:b/>
+          <w:bCs/>
+          <w:i/>
+          <w:iCs/>
+          <w:sz w:val="32"/>
+          <w:szCs w:val="32"/>
+          <w:u w:val="single"/>
+          <w:rtl/>
+          <w:lang w:bidi="he-IL"/>
+        </w:rPr>
+        <w:lastRenderedPageBreak/>
+        <w:drawing>
+          <wp:anchor distT="0" distB="0" distL="114300" distR="114300" simplePos="0" relativeHeight="251679744" behindDoc="1" locked="0" layoutInCell="1" allowOverlap="1" wp14:anchorId="5DA91ABC" wp14:editId="4C341912">
+            <wp:simplePos x="0" y="0"/>
+            <wp:positionH relativeFrom="column">
+              <wp:posOffset>2114550</wp:posOffset>
+            </wp:positionH>
+            <wp:positionV relativeFrom="paragraph">
+              <wp:posOffset>558165</wp:posOffset>
+            </wp:positionV>
+            <wp:extent cx="3764606" cy="236240"/>
+            <wp:effectExtent l="133350" t="76200" r="64770" b="125730"/>
+            <wp:wrapTight wrapText="bothSides">
+              <wp:wrapPolygon edited="0">
+                <wp:start x="-219" y="-6968"/>
+                <wp:lineTo x="-765" y="-3484"/>
+                <wp:lineTo x="-656" y="26129"/>
+                <wp:lineTo x="-437" y="31355"/>
+                <wp:lineTo x="21644" y="31355"/>
+                <wp:lineTo x="21862" y="24387"/>
+                <wp:lineTo x="21534" y="-1742"/>
+                <wp:lineTo x="21534" y="-6968"/>
+                <wp:lineTo x="-219" y="-6968"/>
+              </wp:wrapPolygon>
+            </wp:wrapTight>
+            <wp:docPr id="1687205817" name="Picture 1"/>
+            <wp:cNvGraphicFramePr>
+              <a:graphicFrameLocks xmlns:a="http://schemas.openxmlformats.org/drawingml/2006/main" noChangeAspect="1"/>
+            </wp:cNvGraphicFramePr>
+            <a:graphic xmlns:a="http://schemas.openxmlformats.org/drawingml/2006/main">
+              <a:graphicData uri="http://schemas.openxmlformats.org/drawingml/2006/picture">
+                <pic:pic xmlns:pic="http://schemas.openxmlformats.org/drawingml/2006/picture">
+                  <pic:nvPicPr>
+                    <pic:cNvPr id="1687205817" name=""/>
+                    <pic:cNvPicPr/>
+                  </pic:nvPicPr>
+                  <pic:blipFill>
+                    <a:blip r:embed="rId37">
+                      <a:extLst>
+                        <a:ext uri="{28A0092B-C50C-407E-A947-70E740481C1C}">
+                          <a14:useLocalDpi xmlns:a14="http://schemas.microsoft.com/office/drawing/2010/main" val="0"/>
+                        </a:ext>
+                      </a:extLst>
+                    </a:blip>
+                    <a:stretch>
+                      <a:fillRect/>
+                    </a:stretch>
+                  </pic:blipFill>
+                  <pic:spPr>
+                    <a:xfrm>
+                      <a:off x="0" y="0"/>
+                      <a:ext cx="3764606" cy="236240"/>
+                    </a:xfrm>
+                    <a:prstGeom prst="roundRect">
+                      <a:avLst>
+                        <a:gd name="adj" fmla="val 16667"/>
+                      </a:avLst>
+                    </a:prstGeom>
+                    <a:ln>
+                      <a:noFill/>
+                    </a:ln>
+                    <a:effectLst>
+                      <a:outerShdw blurRad="76200" dist="38100" dir="7800000" algn="tl" rotWithShape="0">
+                        <a:srgbClr val="000000">
+                          <a:alpha val="40000"/>
+                        </a:srgbClr>
+                      </a:outerShdw>
+                    </a:effectLst>
+                    <a:scene3d>
+                      <a:camera prst="orthographicFront"/>
+                      <a:lightRig rig="contrasting" dir="t">
+                        <a:rot lat="0" lon="0" rev="4200000"/>
+                      </a:lightRig>
+                    </a:scene3d>
+                    <a:sp3d prstMaterial="plastic">
+                      <a:bevelT w="381000" h="114300" prst="relaxedInset"/>
+                      <a:contourClr>
+                        <a:srgbClr val="969696"/>
+                      </a:contourClr>
+                    </a:sp3d>
+                  </pic:spPr>
+                </pic:pic>
+              </a:graphicData>
+            </a:graphic>
+          </wp:anchor>
+        </w:drawing>
+      </w:r>
+      <w:r>
+        <w:rPr>
+          <w:rFonts w:ascii="Times New Roman" w:eastAsiaTheme="minorEastAsia" w:hAnsi="Times New Roman" w:cs="Times New Roman"/>
+          <w:b/>
+          <w:bCs/>
+          <w:i/>
+          <w:iCs/>
+          <w:sz w:val="32"/>
+          <w:szCs w:val="32"/>
+          <w:u w:val="single"/>
+          <w:rtl/>
+          <w:lang w:bidi="he-IL"/>
+        </w:rPr>
+        <w:t xml:space="preserve"> </w:t>
+      </w:r>
+      <w:r>
+        <w:rPr>
+          <w:rFonts w:ascii="Times New Roman" w:eastAsiaTheme="minorEastAsia" w:hAnsi="Times New Roman" w:cs="Times New Roman"/>
+          <w:b/>
+          <w:bCs/>
+          <w:i/>
+          <w:iCs/>
+          <w:sz w:val="32"/>
+          <w:szCs w:val="32"/>
+          <w:u w:val="single"/>
+          <w:rtl/>
+          <w:lang w:bidi="he-IL"/>
+        </w:rPr>
+        <w:drawing>
+          <wp:anchor distT="0" distB="0" distL="114300" distR="114300" simplePos="0" relativeHeight="251678720" behindDoc="1" locked="0" layoutInCell="1" allowOverlap="1" wp14:anchorId="2444F9EC" wp14:editId="614DFB56">
+            <wp:simplePos x="0" y="0"/>
+            <wp:positionH relativeFrom="column">
+              <wp:posOffset>304800</wp:posOffset>
+            </wp:positionH>
+            <wp:positionV relativeFrom="paragraph">
+              <wp:posOffset>1905</wp:posOffset>
+            </wp:positionV>
+            <wp:extent cx="5631668" cy="312447"/>
+            <wp:effectExtent l="133350" t="76200" r="83820" b="125730"/>
+            <wp:wrapTight wrapText="bothSides">
+              <wp:wrapPolygon edited="0">
+                <wp:start x="-73" y="-5268"/>
+                <wp:lineTo x="-512" y="-2634"/>
+                <wp:lineTo x="-512" y="18439"/>
+                <wp:lineTo x="-292" y="28976"/>
+                <wp:lineTo x="21629" y="28976"/>
+                <wp:lineTo x="21848" y="18439"/>
+                <wp:lineTo x="21410" y="-1317"/>
+                <wp:lineTo x="21410" y="-5268"/>
+                <wp:lineTo x="-73" y="-5268"/>
+              </wp:wrapPolygon>
+            </wp:wrapTight>
+            <wp:docPr id="1026028210" name="Picture 1"/>
+            <wp:cNvGraphicFramePr>
+              <a:graphicFrameLocks xmlns:a="http://schemas.openxmlformats.org/drawingml/2006/main" noChangeAspect="1"/>
+            </wp:cNvGraphicFramePr>
+            <a:graphic xmlns:a="http://schemas.openxmlformats.org/drawingml/2006/main">
+              <a:graphicData uri="http://schemas.openxmlformats.org/drawingml/2006/picture">
+                <pic:pic xmlns:pic="http://schemas.openxmlformats.org/drawingml/2006/picture">
+                  <pic:nvPicPr>
+                    <pic:cNvPr id="1026028210" name=""/>
+                    <pic:cNvPicPr/>
+                  </pic:nvPicPr>
+                  <pic:blipFill>
+                    <a:blip r:embed="rId38">
+                      <a:extLst>
+                        <a:ext uri="{28A0092B-C50C-407E-A947-70E740481C1C}">
+                          <a14:useLocalDpi xmlns:a14="http://schemas.microsoft.com/office/drawing/2010/main" val="0"/>
+                        </a:ext>
+                      </a:extLst>
+                    </a:blip>
+                    <a:stretch>
+                      <a:fillRect/>
+                    </a:stretch>
+                  </pic:blipFill>
+                  <pic:spPr>
+                    <a:xfrm>
+                      <a:off x="0" y="0"/>
+                      <a:ext cx="5631668" cy="312447"/>
+                    </a:xfrm>
+                    <a:prstGeom prst="roundRect">
+                      <a:avLst>
+                        <a:gd name="adj" fmla="val 16667"/>
+                      </a:avLst>
+                    </a:prstGeom>
+                    <a:ln>
+                      <a:noFill/>
+                    </a:ln>
+                    <a:effectLst>
+                      <a:outerShdw blurRad="76200" dist="38100" dir="7800000" algn="tl" rotWithShape="0">
+                        <a:srgbClr val="000000">
+                          <a:alpha val="40000"/>
+                        </a:srgbClr>
+                      </a:outerShdw>
+                    </a:effectLst>
+                    <a:scene3d>
+                      <a:camera prst="orthographicFront"/>
+                      <a:lightRig rig="contrasting" dir="t">
+                        <a:rot lat="0" lon="0" rev="4200000"/>
+                      </a:lightRig>
+                    </a:scene3d>
+                    <a:sp3d prstMaterial="plastic">
+                      <a:bevelT w="381000" h="114300" prst="relaxedInset"/>
+                      <a:contourClr>
+                        <a:srgbClr val="969696"/>
+                      </a:contourClr>
+                    </a:sp3d>
+                  </pic:spPr>
+                </pic:pic>
+              </a:graphicData>
+            </a:graphic>
+          </wp:anchor>
+        </w:drawing>
+      </w:r>
+    </w:p>
+    <w:p>
+      <w:pPr>
+        <w:bidi/>
+        <w:rPr>
+          <w:rFonts w:ascii="Times New Roman" w:eastAsiaTheme="minorEastAsia" w:hAnsi="Times New Roman" w:cs="Times New Roman"/>
+          <w:b/>
+          <w:bCs/>
+          <w:i/>
+          <w:iCs/>
+          <w:sz w:val="32"/>
+          <w:szCs w:val="32"/>
+          <w:u w:val="single"/>
+          <w:lang w:bidi="he-IL"/>
+        </w:rPr>
+      </w:pPr>
+    </w:p>
+    <w:p>
+      <w:pPr>
+        <w:bidi/>
+        <w:rPr>
+          <w:rFonts w:ascii="Times New Roman" w:eastAsiaTheme="minorEastAsia" w:hAnsi="Times New Roman" w:cs="Times New Roman"/>
+          <w:sz w:val="32"/>
+          <w:szCs w:val="32"/>
+          <w:rtl/>
+          <w:lang w:bidi="he-IL"/>
+        </w:rPr>
+      </w:pPr>
+      <w:r>
+        <w:rPr>
+          <w:rFonts w:ascii="Times New Roman" w:eastAsiaTheme="minorEastAsia" w:hAnsi="Times New Roman" w:cs="Times New Roman"/>
+          <w:sz w:val="32"/>
+          <w:szCs w:val="32"/>
+          <w:rtl/>
+          <w:lang w:bidi="he-IL"/>
+        </w:rPr>
+        <w:drawing>
+          <wp:anchor distT="0" distB="0" distL="114300" distR="114300" simplePos="0" relativeHeight="251680768" behindDoc="1" locked="0" layoutInCell="1" allowOverlap="1" wp14:anchorId="302D3574" wp14:editId="6517871D">
+            <wp:simplePos x="0" y="0"/>
+            <wp:positionH relativeFrom="column">
+              <wp:posOffset>247650</wp:posOffset>
+            </wp:positionH>
+            <wp:positionV relativeFrom="paragraph">
+              <wp:posOffset>77470</wp:posOffset>
+            </wp:positionV>
+            <wp:extent cx="5624047" cy="662997"/>
+            <wp:effectExtent l="133350" t="76200" r="72390" b="137160"/>
+            <wp:wrapTight wrapText="bothSides">
+              <wp:wrapPolygon edited="0">
+                <wp:start x="146" y="-2483"/>
+                <wp:lineTo x="-512" y="-1241"/>
+                <wp:lineTo x="-512" y="21103"/>
+                <wp:lineTo x="0" y="25448"/>
+                <wp:lineTo x="21366" y="25448"/>
+                <wp:lineTo x="21805" y="19241"/>
+                <wp:lineTo x="21805" y="8690"/>
+                <wp:lineTo x="21220" y="-621"/>
+                <wp:lineTo x="21146" y="-2483"/>
+                <wp:lineTo x="146" y="-2483"/>
+              </wp:wrapPolygon>
+            </wp:wrapTight>
+            <wp:docPr id="1285377556" name="Picture 1"/>
+            <wp:cNvGraphicFramePr>
+              <a:graphicFrameLocks xmlns:a="http://schemas.openxmlformats.org/drawingml/2006/main" noChangeAspect="1"/>
+            </wp:cNvGraphicFramePr>
+            <a:graphic xmlns:a="http://schemas.openxmlformats.org/drawingml/2006/main">
+              <a:graphicData uri="http://schemas.openxmlformats.org/drawingml/2006/picture">
+                <pic:pic xmlns:pic="http://schemas.openxmlformats.org/drawingml/2006/picture">
+                  <pic:nvPicPr>
+                    <pic:cNvPr id="1285377556" name=""/>
+                    <pic:cNvPicPr/>
+                  </pic:nvPicPr>
+                  <pic:blipFill>
+                    <a:blip r:embed="rId39">
+                      <a:extLst>
+                        <a:ext uri="{28A0092B-C50C-407E-A947-70E740481C1C}">
+                          <a14:useLocalDpi xmlns:a14="http://schemas.microsoft.com/office/drawing/2010/main" val="0"/>
+                        </a:ext>
+                      </a:extLst>
+                    </a:blip>
+                    <a:stretch>
+                      <a:fillRect/>
+                    </a:stretch>
+                  </pic:blipFill>
+                  <pic:spPr>
+                    <a:xfrm>
+                      <a:off x="0" y="0"/>
+                      <a:ext cx="5624047" cy="662997"/>
+                    </a:xfrm>
+                    <a:prstGeom prst="roundRect">
+                      <a:avLst>
+                        <a:gd name="adj" fmla="val 16667"/>
+                      </a:avLst>
+                    </a:prstGeom>
+                    <a:ln>
+                      <a:noFill/>
+                    </a:ln>
+                    <a:effectLst>
+                      <a:outerShdw blurRad="76200" dist="38100" dir="7800000" algn="tl" rotWithShape="0">
+                        <a:srgbClr val="000000">
+                          <a:alpha val="40000"/>
+                        </a:srgbClr>
+                      </a:outerShdw>
+                    </a:effectLst>
+                    <a:scene3d>
+                      <a:camera prst="orthographicFront"/>
+                      <a:lightRig rig="contrasting" dir="t">
+                        <a:rot lat="0" lon="0" rev="4200000"/>
+                      </a:lightRig>
+                    </a:scene3d>
+                    <a:sp3d prstMaterial="plastic">
+                      <a:bevelT w="381000" h="114300" prst="relaxedInset"/>
+                      <a:contourClr>
+                        <a:srgbClr val="969696"/>
+                      </a:contourClr>
+                    </a:sp3d>
+                  </pic:spPr>
+                </pic:pic>
+              </a:graphicData>
+            </a:graphic>
+          </wp:anchor>
+        </w:drawing>
+      </w:r>
     </w:p>
     <w:sectPr>
       <w:pgSz w:w="12240" w:h="15840"/>
@@ -11242,6 +14293,119 @@
     </w:lvl>
   </w:abstractNum>
   <w:abstractNum w:abstractNumId="18" w15:restartNumberingAfterBreak="0">
+    <w:nsid w:val="402E77DE"/>
+    <w:multiLevelType w:val="hybridMultilevel"/>
+    <w:tmpl w:val="44165E9E"/>
+    <w:lvl w:ilvl="0" w:tplc="10000001">
+      <w:start w:val="1"/>
+      <w:numFmt w:val="bullet"/>
+      <w:lvlText w:val=""/>
+      <w:lvlJc w:val="left"/>
+      <w:pPr>
+        <w:ind w:left="720" w:hanging="360"/>
+      </w:pPr>
+      <w:rPr>
+        <w:rFonts w:ascii="Symbol" w:hAnsi="Symbol" w:hint="default"/>
+      </w:rPr>
+    </w:lvl>
+    <w:lvl w:ilvl="1" w:tplc="10000003" w:tentative="1">
+      <w:start w:val="1"/>
+      <w:numFmt w:val="bullet"/>
+      <w:lvlText w:val="o"/>
+      <w:lvlJc w:val="left"/>
+      <w:pPr>
+        <w:ind w:left="1440" w:hanging="360"/>
+      </w:pPr>
+      <w:rPr>
+        <w:rFonts w:ascii="Courier New" w:hAnsi="Courier New" w:cs="Courier New" w:hint="default"/>
+      </w:rPr>
+    </w:lvl>
+    <w:lvl w:ilvl="2" w:tplc="10000005" w:tentative="1">
+      <w:start w:val="1"/>
+      <w:numFmt w:val="bullet"/>
+      <w:lvlText w:val=""/>
+      <w:lvlJc w:val="left"/>
+      <w:pPr>
+        <w:ind w:left="2160" w:hanging="360"/>
+      </w:pPr>
+      <w:rPr>
+        <w:rFonts w:ascii="Wingdings" w:hAnsi="Wingdings" w:hint="default"/>
+      </w:rPr>
+    </w:lvl>
+    <w:lvl w:ilvl="3" w:tplc="10000001" w:tentative="1">
+      <w:start w:val="1"/>
+      <w:numFmt w:val="bullet"/>
+      <w:lvlText w:val=""/>
+      <w:lvlJc w:val="left"/>
+      <w:pPr>
+        <w:ind w:left="2880" w:hanging="360"/>
+      </w:pPr>
+      <w:rPr>
+        <w:rFonts w:ascii="Symbol" w:hAnsi="Symbol" w:hint="default"/>
+      </w:rPr>
+    </w:lvl>
+    <w:lvl w:ilvl="4" w:tplc="10000003" w:tentative="1">
+      <w:start w:val="1"/>
+      <w:numFmt w:val="bullet"/>
+      <w:lvlText w:val="o"/>
+      <w:lvlJc w:val="left"/>
+      <w:pPr>
+        <w:ind w:left="3600" w:hanging="360"/>
+      </w:pPr>
+      <w:rPr>
+        <w:rFonts w:ascii="Courier New" w:hAnsi="Courier New" w:cs="Courier New" w:hint="default"/>
+      </w:rPr>
+    </w:lvl>
+    <w:lvl w:ilvl="5" w:tplc="10000005" w:tentative="1">
+      <w:start w:val="1"/>
+      <w:numFmt w:val="bullet"/>
+      <w:lvlText w:val=""/>
+      <w:lvlJc w:val="left"/>
+      <w:pPr>
+        <w:ind w:left="4320" w:hanging="360"/>
+      </w:pPr>
+      <w:rPr>
+        <w:rFonts w:ascii="Wingdings" w:hAnsi="Wingdings" w:hint="default"/>
+      </w:rPr>
+    </w:lvl>
+    <w:lvl w:ilvl="6" w:tplc="10000001" w:tentative="1">
+      <w:start w:val="1"/>
+      <w:numFmt w:val="bullet"/>
+      <w:lvlText w:val=""/>
+      <w:lvlJc w:val="left"/>
+      <w:pPr>
+        <w:ind w:left="5040" w:hanging="360"/>
+      </w:pPr>
+      <w:rPr>
+        <w:rFonts w:ascii="Symbol" w:hAnsi="Symbol" w:hint="default"/>
+      </w:rPr>
+    </w:lvl>
+    <w:lvl w:ilvl="7" w:tplc="10000003" w:tentative="1">
+      <w:start w:val="1"/>
+      <w:numFmt w:val="bullet"/>
+      <w:lvlText w:val="o"/>
+      <w:lvlJc w:val="left"/>
+      <w:pPr>
+        <w:ind w:left="5760" w:hanging="360"/>
+      </w:pPr>
+      <w:rPr>
+        <w:rFonts w:ascii="Courier New" w:hAnsi="Courier New" w:cs="Courier New" w:hint="default"/>
+      </w:rPr>
+    </w:lvl>
+    <w:lvl w:ilvl="8" w:tplc="10000005" w:tentative="1">
+      <w:start w:val="1"/>
+      <w:numFmt w:val="bullet"/>
+      <w:lvlText w:val=""/>
+      <w:lvlJc w:val="left"/>
+      <w:pPr>
+        <w:ind w:left="6480" w:hanging="360"/>
+      </w:pPr>
+      <w:rPr>
+        <w:rFonts w:ascii="Wingdings" w:hAnsi="Wingdings" w:hint="default"/>
+      </w:rPr>
+    </w:lvl>
+  </w:abstractNum>
+  <w:abstractNum w:abstractNumId="19" w15:restartNumberingAfterBreak="0">
     <w:nsid w:val="41B500E8"/>
     <w:multiLevelType w:val="hybridMultilevel"/>
     <w:tmpl w:val="DF9E4276"/>
@@ -11327,7 +14491,7 @@
       </w:pPr>
     </w:lvl>
   </w:abstractNum>
-  <w:abstractNum w:abstractNumId="19" w15:restartNumberingAfterBreak="0">
+  <w:abstractNum w:abstractNumId="20" w15:restartNumberingAfterBreak="0">
     <w:nsid w:val="420B661B"/>
     <w:multiLevelType w:val="multilevel"/>
     <w:tmpl w:val="BE88EEB6"/>
@@ -11440,7 +14604,7 @@
       </w:pPr>
     </w:lvl>
   </w:abstractNum>
-  <w:abstractNum w:abstractNumId="20" w15:restartNumberingAfterBreak="0">
+  <w:abstractNum w:abstractNumId="21" w15:restartNumberingAfterBreak="0">
     <w:nsid w:val="462D79E4"/>
     <w:multiLevelType w:val="multilevel"/>
     <w:tmpl w:val="FE523526"/>
@@ -11589,7 +14753,7 @@
       </w:rPr>
     </w:lvl>
   </w:abstractNum>
-  <w:abstractNum w:abstractNumId="21" w15:restartNumberingAfterBreak="0">
+  <w:abstractNum w:abstractNumId="22" w15:restartNumberingAfterBreak="0">
     <w:nsid w:val="4C5640B9"/>
     <w:multiLevelType w:val="multilevel"/>
     <w:tmpl w:val="6162486C"/>
@@ -11738,7 +14902,7 @@
       </w:rPr>
     </w:lvl>
   </w:abstractNum>
-  <w:abstractNum w:abstractNumId="22" w15:restartNumberingAfterBreak="0">
+  <w:abstractNum w:abstractNumId="23" w15:restartNumberingAfterBreak="0">
     <w:nsid w:val="4E1C5741"/>
     <w:multiLevelType w:val="multilevel"/>
     <w:tmpl w:val="5B96DB96"/>
@@ -11887,7 +15051,7 @@
       </w:rPr>
     </w:lvl>
   </w:abstractNum>
-  <w:abstractNum w:abstractNumId="23" w15:restartNumberingAfterBreak="0">
+  <w:abstractNum w:abstractNumId="24" w15:restartNumberingAfterBreak="0">
     <w:nsid w:val="52DB5771"/>
     <w:multiLevelType w:val="hybridMultilevel"/>
     <w:tmpl w:val="4ABC96D6"/>
@@ -12000,7 +15164,7 @@
       </w:rPr>
     </w:lvl>
   </w:abstractNum>
-  <w:abstractNum w:abstractNumId="24" w15:restartNumberingAfterBreak="0">
+  <w:abstractNum w:abstractNumId="25" w15:restartNumberingAfterBreak="0">
     <w:nsid w:val="58131EF4"/>
     <w:multiLevelType w:val="hybridMultilevel"/>
     <w:tmpl w:val="7CB83D1E"/>
@@ -12113,7 +15277,7 @@
       </w:rPr>
     </w:lvl>
   </w:abstractNum>
-  <w:abstractNum w:abstractNumId="25" w15:restartNumberingAfterBreak="0">
+  <w:abstractNum w:abstractNumId="26" w15:restartNumberingAfterBreak="0">
     <w:nsid w:val="5DE601B5"/>
     <w:multiLevelType w:val="multilevel"/>
     <w:tmpl w:val="4112D154"/>
@@ -12262,7 +15426,7 @@
       </w:rPr>
     </w:lvl>
   </w:abstractNum>
-  <w:abstractNum w:abstractNumId="26" w15:restartNumberingAfterBreak="0">
+  <w:abstractNum w:abstractNumId="27" w15:restartNumberingAfterBreak="0">
     <w:nsid w:val="65012084"/>
     <w:multiLevelType w:val="multilevel"/>
     <w:tmpl w:val="4CF48E7A"/>
@@ -12411,7 +15575,7 @@
       </w:rPr>
     </w:lvl>
   </w:abstractNum>
-  <w:abstractNum w:abstractNumId="27" w15:restartNumberingAfterBreak="0">
+  <w:abstractNum w:abstractNumId="28" w15:restartNumberingAfterBreak="0">
     <w:nsid w:val="65E95D13"/>
     <w:multiLevelType w:val="hybridMultilevel"/>
     <w:tmpl w:val="16808778"/>
@@ -12497,7 +15661,7 @@
       </w:pPr>
     </w:lvl>
   </w:abstractNum>
-  <w:abstractNum w:abstractNumId="28" w15:restartNumberingAfterBreak="0">
+  <w:abstractNum w:abstractNumId="29" w15:restartNumberingAfterBreak="0">
     <w:nsid w:val="671D080F"/>
     <w:multiLevelType w:val="hybridMultilevel"/>
     <w:tmpl w:val="8BFE2C0C"/>
@@ -12583,7 +15747,7 @@
       </w:pPr>
     </w:lvl>
   </w:abstractNum>
-  <w:abstractNum w:abstractNumId="29" w15:restartNumberingAfterBreak="0">
+  <w:abstractNum w:abstractNumId="30" w15:restartNumberingAfterBreak="0">
     <w:nsid w:val="677365A6"/>
     <w:multiLevelType w:val="multilevel"/>
     <w:tmpl w:val="5B96DB96"/>
@@ -12732,7 +15896,7 @@
       </w:rPr>
     </w:lvl>
   </w:abstractNum>
-  <w:abstractNum w:abstractNumId="30" w15:restartNumberingAfterBreak="0">
+  <w:abstractNum w:abstractNumId="31" w15:restartNumberingAfterBreak="0">
     <w:nsid w:val="6BD464B3"/>
     <w:multiLevelType w:val="multilevel"/>
     <w:tmpl w:val="EFA632C2"/>
@@ -12845,7 +16009,7 @@
       </w:pPr>
     </w:lvl>
   </w:abstractNum>
-  <w:abstractNum w:abstractNumId="31" w15:restartNumberingAfterBreak="0">
+  <w:abstractNum w:abstractNumId="32" w15:restartNumberingAfterBreak="0">
     <w:nsid w:val="6E057B59"/>
     <w:multiLevelType w:val="hybridMultilevel"/>
     <w:tmpl w:val="21229002"/>
@@ -12931,7 +16095,7 @@
       </w:pPr>
     </w:lvl>
   </w:abstractNum>
-  <w:abstractNum w:abstractNumId="32" w15:restartNumberingAfterBreak="0">
+  <w:abstractNum w:abstractNumId="33" w15:restartNumberingAfterBreak="0">
     <w:nsid w:val="710A690E"/>
     <w:multiLevelType w:val="multilevel"/>
     <w:tmpl w:val="19E82C30"/>
@@ -13080,7 +16244,7 @@
       </w:rPr>
     </w:lvl>
   </w:abstractNum>
-  <w:abstractNum w:abstractNumId="33" w15:restartNumberingAfterBreak="0">
+  <w:abstractNum w:abstractNumId="34" w15:restartNumberingAfterBreak="0">
     <w:nsid w:val="723E036F"/>
     <w:multiLevelType w:val="multilevel"/>
     <w:tmpl w:val="E8583D6E"/>
@@ -13229,7 +16393,7 @@
       </w:rPr>
     </w:lvl>
   </w:abstractNum>
-  <w:abstractNum w:abstractNumId="34" w15:restartNumberingAfterBreak="0">
+  <w:abstractNum w:abstractNumId="35" w15:restartNumberingAfterBreak="0">
     <w:nsid w:val="725D3A90"/>
     <w:multiLevelType w:val="multilevel"/>
     <w:tmpl w:val="EBAA9DA6"/>
@@ -13378,7 +16542,7 @@
       </w:rPr>
     </w:lvl>
   </w:abstractNum>
-  <w:abstractNum w:abstractNumId="35" w15:restartNumberingAfterBreak="0">
+  <w:abstractNum w:abstractNumId="36" w15:restartNumberingAfterBreak="0">
     <w:nsid w:val="72C65FEA"/>
     <w:multiLevelType w:val="multilevel"/>
     <w:tmpl w:val="5B96DB96"/>
@@ -13523,7 +16687,7 @@
       </w:rPr>
     </w:lvl>
   </w:abstractNum>
-  <w:abstractNum w:abstractNumId="36" w15:restartNumberingAfterBreak="0">
+  <w:abstractNum w:abstractNumId="37" w15:restartNumberingAfterBreak="0">
     <w:nsid w:val="73880B9B"/>
     <w:multiLevelType w:val="multilevel"/>
     <w:tmpl w:val="B48255BE"/>
@@ -13636,7 +16800,7 @@
       </w:pPr>
     </w:lvl>
   </w:abstractNum>
-  <w:abstractNum w:abstractNumId="37" w15:restartNumberingAfterBreak="0">
+  <w:abstractNum w:abstractNumId="38" w15:restartNumberingAfterBreak="0">
     <w:nsid w:val="7E652FA3"/>
     <w:multiLevelType w:val="multilevel"/>
     <w:tmpl w:val="5B96DB96"/>
@@ -13782,58 +16946,58 @@
     </w:lvl>
   </w:abstractNum>
   <w:num w:numId="1" w16cid:durableId="1623683082">
-    <w:abstractNumId w:val="31"/>
+    <w:abstractNumId w:val="32"/>
   </w:num>
   <w:num w:numId="2" w16cid:durableId="1303652242">
-    <w:abstractNumId w:val="22"/>
+    <w:abstractNumId w:val="23"/>
   </w:num>
   <w:num w:numId="3" w16cid:durableId="1780175035">
     <w:abstractNumId w:val="15"/>
   </w:num>
   <w:num w:numId="4" w16cid:durableId="1278491685">
-    <w:abstractNumId w:val="30"/>
+    <w:abstractNumId w:val="31"/>
   </w:num>
   <w:num w:numId="5" w16cid:durableId="1029799904">
-    <w:abstractNumId w:val="37"/>
+    <w:abstractNumId w:val="38"/>
   </w:num>
   <w:num w:numId="6" w16cid:durableId="897326276">
-    <w:abstractNumId w:val="37"/>
+    <w:abstractNumId w:val="38"/>
     <w:lvlOverride w:ilvl="1">
       <w:startOverride w:val="1"/>
     </w:lvlOverride>
   </w:num>
   <w:num w:numId="7" w16cid:durableId="1323435544">
-    <w:abstractNumId w:val="29"/>
+    <w:abstractNumId w:val="30"/>
   </w:num>
   <w:num w:numId="8" w16cid:durableId="1670214461">
-    <w:abstractNumId w:val="35"/>
+    <w:abstractNumId w:val="36"/>
   </w:num>
   <w:num w:numId="9" w16cid:durableId="531768048">
-    <w:abstractNumId w:val="19"/>
+    <w:abstractNumId w:val="20"/>
   </w:num>
   <w:num w:numId="10" w16cid:durableId="827206051">
     <w:abstractNumId w:val="0"/>
   </w:num>
   <w:num w:numId="11" w16cid:durableId="469522763">
-    <w:abstractNumId w:val="24"/>
+    <w:abstractNumId w:val="25"/>
   </w:num>
   <w:num w:numId="12" w16cid:durableId="1745714486">
     <w:abstractNumId w:val="16"/>
   </w:num>
   <w:num w:numId="13" w16cid:durableId="774522890">
-    <w:abstractNumId w:val="28"/>
+    <w:abstractNumId w:val="29"/>
   </w:num>
   <w:num w:numId="14" w16cid:durableId="1019084834">
     <w:abstractNumId w:val="17"/>
   </w:num>
   <w:num w:numId="15" w16cid:durableId="1566643414">
-    <w:abstractNumId w:val="32"/>
+    <w:abstractNumId w:val="33"/>
   </w:num>
   <w:num w:numId="16" w16cid:durableId="1008361294">
     <w:abstractNumId w:val="11"/>
   </w:num>
   <w:num w:numId="17" w16cid:durableId="2061707283">
-    <w:abstractNumId w:val="27"/>
+    <w:abstractNumId w:val="28"/>
   </w:num>
   <w:num w:numId="18" w16cid:durableId="951134277">
     <w:abstractNumId w:val="5"/>
@@ -13845,22 +17009,22 @@
     <w:abstractNumId w:val="10"/>
   </w:num>
   <w:num w:numId="21" w16cid:durableId="2021658819">
-    <w:abstractNumId w:val="33"/>
+    <w:abstractNumId w:val="34"/>
   </w:num>
   <w:num w:numId="22" w16cid:durableId="962345033">
-    <w:abstractNumId w:val="20"/>
+    <w:abstractNumId w:val="21"/>
   </w:num>
   <w:num w:numId="23" w16cid:durableId="188491854">
     <w:abstractNumId w:val="6"/>
   </w:num>
   <w:num w:numId="24" w16cid:durableId="969628777">
-    <w:abstractNumId w:val="26"/>
+    <w:abstractNumId w:val="27"/>
   </w:num>
   <w:num w:numId="25" w16cid:durableId="1133256570">
     <w:abstractNumId w:val="13"/>
   </w:num>
   <w:num w:numId="26" w16cid:durableId="1775130004">
-    <w:abstractNumId w:val="23"/>
+    <w:abstractNumId w:val="24"/>
   </w:num>
   <w:num w:numId="27" w16cid:durableId="597106885">
     <w:abstractNumId w:val="7"/>
@@ -13872,7 +17036,7 @@
     <w:abstractNumId w:val="1"/>
   </w:num>
   <w:num w:numId="30" w16cid:durableId="1423334336">
-    <w:abstractNumId w:val="21"/>
+    <w:abstractNumId w:val="22"/>
   </w:num>
   <w:num w:numId="31" w16cid:durableId="1380548089">
     <w:abstractNumId w:val="14"/>
@@ -13887,19 +17051,22 @@
     <w:abstractNumId w:val="4"/>
   </w:num>
   <w:num w:numId="35" w16cid:durableId="413936251">
-    <w:abstractNumId w:val="25"/>
+    <w:abstractNumId w:val="26"/>
   </w:num>
   <w:num w:numId="36" w16cid:durableId="1120345592">
-    <w:abstractNumId w:val="34"/>
+    <w:abstractNumId w:val="35"/>
   </w:num>
   <w:num w:numId="37" w16cid:durableId="1770199746">
-    <w:abstractNumId w:val="18"/>
+    <w:abstractNumId w:val="19"/>
   </w:num>
   <w:num w:numId="38" w16cid:durableId="1940596327">
-    <w:abstractNumId w:val="36"/>
+    <w:abstractNumId w:val="37"/>
   </w:num>
   <w:num w:numId="39" w16cid:durableId="977108340">
     <w:abstractNumId w:val="8"/>
+  </w:num>
+  <w:num w:numId="40" w16cid:durableId="685441458">
+    <w:abstractNumId w:val="18"/>
   </w:num>
   <w:numIdMacAtCleanup w:val="25"/>
 </w:numbering>
@@ -14305,7 +17472,7 @@
   <w:style w:type="paragraph" w:default="1" w:styleId="Normal">
     <w:name w:val="Normal"/>
     <w:qFormat/>
-    <w:rsid w:val="006A5CB1"/>
+    <w:rsid w:val="002C045C"/>
   </w:style>
   <w:style w:type="paragraph" w:styleId="Heading1">
     <w:name w:val="heading 1"/>

</xml_diff>